<commit_message>
done first version with blanc
</commit_message>
<xml_diff>
--- a/origin.docx
+++ b/origin.docx
@@ -95,9 +95,6 @@
           <w:p>
             <w:pPr>
               <w:pStyle w:val="aff"/>
-              <w:rPr>
-                <w:lang w:val="en-US"/>
-              </w:rPr>
             </w:pPr>
             <w:proofErr w:type="gramStart"/>
             <w:r>
@@ -143,18 +140,63 @@
               </w:rPr>
               <w:t>}</w:t>
             </w:r>
+            <w:r>
+              <w:t xml:space="preserve"> </w:t>
+            </w:r>
+          </w:p>
+          <w:p>
+            <w:pPr>
+              <w:pStyle w:val="aff"/>
+            </w:pPr>
+            <w:r>
+              <w:t>«</w:t>
+            </w:r>
+            <w:proofErr w:type="gramStart"/>
+            <w:r>
+              <w:rPr>
+                <w:lang w:val="en-US"/>
+              </w:rPr>
+              <w:t>{{</w:t>
+            </w:r>
+            <w:r>
+              <w:rPr>
+                <w:lang w:val="en-US"/>
+              </w:rPr>
+              <w:t xml:space="preserve"> </w:t>
+            </w:r>
+            <w:proofErr w:type="spellStart"/>
+            <w:r>
+              <w:rPr>
+                <w:bCs w:val="0"/>
+              </w:rPr>
+              <w:t>device</w:t>
+            </w:r>
+            <w:proofErr w:type="gramEnd"/>
+            <w:r>
+              <w:rPr>
+                <w:bCs w:val="0"/>
+              </w:rPr>
+              <w:t>_name</w:t>
+            </w:r>
+            <w:proofErr w:type="spellEnd"/>
+            <w:r>
+              <w:rPr>
+                <w:lang w:val="en-US"/>
+              </w:rPr>
+              <w:t xml:space="preserve"> }}</w:t>
+            </w:r>
+            <w:r>
+              <w:t>»</w:t>
+            </w:r>
+          </w:p>
+          <w:p>
+            <w:pPr>
+              <w:pStyle w:val="aff"/>
+            </w:pPr>
           </w:p>
         </w:tc>
       </w:tr>
     </w:tbl>
-    <w:p>
-      <w:pPr>
-        <w:pStyle w:val="aff"/>
-        <w:rPr>
-          <w:lang w:val="en-US"/>
-        </w:rPr>
-      </w:pPr>
-    </w:p>
     <w:p>
       <w:pPr>
         <w:pStyle w:val="aff"/>
@@ -1033,6 +1075,7 @@
       <w:r>
         <w:t xml:space="preserve"> </w:t>
       </w:r>
+      <w:proofErr w:type="gramStart"/>
       <w:r>
         <w:t>{</w:t>
       </w:r>
@@ -1048,6 +1091,7 @@
         </w:rPr>
         <w:t>device</w:t>
       </w:r>
+      <w:proofErr w:type="gramEnd"/>
       <w:r>
         <w:t>_</w:t>
       </w:r>
@@ -7615,14 +7659,14 @@
     <w:basedOn w:val="af"/>
     <w:link w:val="33"/>
     <w:qFormat/>
-    <w:rsid w:val="002A2A9F"/>
+    <w:rsid w:val="00C052DD"/>
     <w:pPr>
       <w:keepNext/>
       <w:numPr>
         <w:ilvl w:val="2"/>
         <w:numId w:val="6"/>
       </w:numPr>
-      <w:spacing w:before="240" w:after="240"/>
+      <w:spacing w:before="60" w:after="60"/>
       <w:contextualSpacing/>
       <w:outlineLvl w:val="2"/>
     </w:pPr>
@@ -7638,7 +7682,7 @@
     <w:name w:val="ДОК Заголовок 3 Знак"/>
     <w:basedOn w:val="af0"/>
     <w:link w:val="30"/>
-    <w:rsid w:val="002A2A9F"/>
+    <w:rsid w:val="00C052DD"/>
     <w:rPr>
       <w:rFonts w:ascii="Arial Narrow" w:eastAsia="Times New Roman" w:hAnsi="Arial Narrow" w:cs="Times New Roman"/>
       <w:b/>

</xml_diff>

<commit_message>
update new blue label
</commit_message>
<xml_diff>
--- a/origin.docx
+++ b/origin.docx
@@ -4,7 +4,7 @@
   <w:body>
     <w:p>
       <w:pPr>
-        <w:pStyle w:val="aff3"/>
+        <w:pStyle w:val="af7"/>
       </w:pPr>
     </w:p>
     <w:p>
@@ -52,175 +52,101 @@
         <w:pStyle w:val="af7"/>
       </w:pPr>
     </w:p>
-    <w:tbl>
-      <w:tblPr>
-        <w:tblStyle w:val="aff6"/>
-        <w:tblW w:w="0" w:type="auto"/>
-        <w:tblBorders>
-          <w:top w:val="none" w:sz="0" w:space="0" w:color="auto"/>
-          <w:left w:val="none" w:sz="0" w:space="0" w:color="auto"/>
-          <w:bottom w:val="none" w:sz="0" w:space="0" w:color="auto"/>
-          <w:right w:val="none" w:sz="0" w:space="0" w:color="auto"/>
-          <w:insideH w:val="none" w:sz="0" w:space="0" w:color="auto"/>
-          <w:insideV w:val="none" w:sz="0" w:space="0" w:color="auto"/>
-        </w:tblBorders>
-        <w:tblLook w:val="04A0" w:firstRow="1" w:lastRow="0" w:firstColumn="1" w:lastColumn="0" w:noHBand="0" w:noVBand="1"/>
-      </w:tblPr>
-      <w:tblGrid>
-        <w:gridCol w:w="7853"/>
-      </w:tblGrid>
-      <w:tr>
-        <w:trPr>
-          <w:trHeight w:val="950"/>
-        </w:trPr>
-        <w:tc>
-          <w:tcPr>
-            <w:tcW w:w="7853" w:type="dxa"/>
-          </w:tcPr>
-          <w:p>
-            <w:pPr>
-              <w:pStyle w:val="aff"/>
-            </w:pPr>
-            <w:proofErr w:type="gramStart"/>
-            <w:r>
-              <w:rPr>
-                <w:lang w:val="en-US"/>
-              </w:rPr>
-              <w:t>{</w:t>
-            </w:r>
-            <w:r>
-              <w:rPr>
-                <w:lang w:val="en-US"/>
-              </w:rPr>
-              <w:t>{</w:t>
-            </w:r>
-            <w:r>
-              <w:rPr>
-                <w:lang w:val="en-US"/>
-              </w:rPr>
-              <w:t xml:space="preserve"> </w:t>
-            </w:r>
-            <w:r>
-              <w:rPr>
-                <w:lang w:val="en-US"/>
-              </w:rPr>
-              <w:t>title</w:t>
-            </w:r>
-            <w:proofErr w:type="gramEnd"/>
-            <w:r>
-              <w:rPr>
-                <w:lang w:val="en-US"/>
-              </w:rPr>
-              <w:t xml:space="preserve"> </w:t>
-            </w:r>
-            <w:r>
-              <w:rPr>
-                <w:lang w:val="en-US"/>
-              </w:rPr>
-              <w:t>}</w:t>
-            </w:r>
-            <w:r>
-              <w:rPr>
-                <w:lang w:val="en-US"/>
-              </w:rPr>
-              <w:t>}</w:t>
-            </w:r>
-            <w:r>
-              <w:t xml:space="preserve"> </w:t>
-            </w:r>
-          </w:p>
-          <w:p>
-            <w:pPr>
-              <w:pStyle w:val="aff"/>
-            </w:pPr>
-            <w:r>
-              <w:t>«</w:t>
-            </w:r>
-            <w:proofErr w:type="gramStart"/>
-            <w:r>
-              <w:rPr>
-                <w:lang w:val="en-US"/>
-              </w:rPr>
-              <w:t>{{</w:t>
-            </w:r>
-            <w:r>
-              <w:rPr>
-                <w:lang w:val="en-US"/>
-              </w:rPr>
-              <w:t xml:space="preserve"> </w:t>
-            </w:r>
-            <w:proofErr w:type="spellStart"/>
-            <w:r>
-              <w:rPr>
-                <w:bCs w:val="0"/>
-              </w:rPr>
-              <w:t>device</w:t>
-            </w:r>
-            <w:proofErr w:type="gramEnd"/>
-            <w:r>
-              <w:rPr>
-                <w:bCs w:val="0"/>
-              </w:rPr>
-              <w:t>_name</w:t>
-            </w:r>
-            <w:proofErr w:type="spellEnd"/>
-            <w:r>
-              <w:rPr>
-                <w:lang w:val="en-US"/>
-              </w:rPr>
-              <w:t xml:space="preserve"> }}</w:t>
-            </w:r>
-            <w:r>
-              <w:t>»</w:t>
-            </w:r>
-          </w:p>
-          <w:p>
-            <w:pPr>
-              <w:pStyle w:val="aff"/>
-            </w:pPr>
-          </w:p>
-        </w:tc>
-      </w:tr>
-    </w:tbl>
     <w:p>
       <w:pPr>
         <w:pStyle w:val="aff"/>
         <w:rPr>
-          <w:lang w:val="en-US"/>
+          <w:color w:val="auto"/>
         </w:rPr>
       </w:pPr>
-    </w:p>
-    <w:p>
-      <w:pPr>
-        <w:pStyle w:val="aff"/>
+      <w:proofErr w:type="gramStart"/>
+      <w:r>
         <w:rPr>
-          <w:lang w:val="en-US"/>
+          <w:color w:val="auto"/>
         </w:rPr>
-      </w:pPr>
-    </w:p>
-    <w:p>
-      <w:pPr>
-        <w:pStyle w:val="aff"/>
-        <w:rPr>
-          <w:lang w:val="en-US"/>
-        </w:rPr>
-      </w:pPr>
-      <w:r>
-        <w:t>БЛАНК</w:t>
+        <w:t xml:space="preserve">{{ </w:t>
       </w:r>
       <w:r>
         <w:rPr>
+          <w:color w:val="auto"/>
           <w:lang w:val="en-US"/>
+        </w:rPr>
+        <w:t>title</w:t>
+      </w:r>
+      <w:proofErr w:type="gramEnd"/>
+      <w:r>
+        <w:rPr>
+          <w:color w:val="auto"/>
+        </w:rPr>
+        <w:t xml:space="preserve"> }}</w:t>
+      </w:r>
+      <w:r>
+        <w:rPr>
+          <w:color w:val="auto"/>
         </w:rPr>
         <w:t xml:space="preserve"> </w:t>
       </w:r>
+    </w:p>
+    <w:p>
+      <w:pPr>
+        <w:pStyle w:val="aff"/>
+        <w:rPr>
+          <w:color w:val="365F91" w:themeColor="accent1" w:themeShade="BF"/>
+        </w:rPr>
+      </w:pPr>
+      <w:proofErr w:type="gramStart"/>
       <w:r>
-        <w:t>УСТАВОК</w:t>
+        <w:rPr>
+          <w:color w:val="365F91" w:themeColor="accent1" w:themeShade="BF"/>
+        </w:rPr>
+        <w:t xml:space="preserve">{{ </w:t>
+      </w:r>
+      <w:proofErr w:type="spellStart"/>
+      <w:r>
+        <w:rPr>
+          <w:bCs w:val="0"/>
+          <w:color w:val="365F91" w:themeColor="accent1" w:themeShade="BF"/>
+        </w:rPr>
+        <w:t>device</w:t>
+      </w:r>
+      <w:proofErr w:type="gramEnd"/>
+      <w:r>
+        <w:rPr>
+          <w:bCs w:val="0"/>
+          <w:color w:val="365F91" w:themeColor="accent1" w:themeShade="BF"/>
+        </w:rPr>
+        <w:t>_name</w:t>
+      </w:r>
+      <w:proofErr w:type="spellEnd"/>
+      <w:r>
+        <w:rPr>
+          <w:color w:val="365F91" w:themeColor="accent1" w:themeShade="BF"/>
+        </w:rPr>
+        <w:t xml:space="preserve"> }}</w:t>
+      </w:r>
+    </w:p>
+    <w:p>
+      <w:pPr>
+        <w:pStyle w:val="aff"/>
+      </w:pPr>
+    </w:p>
+    <w:p>
+      <w:pPr>
+        <w:pStyle w:val="aff"/>
+        <w:rPr>
+          <w:color w:val="auto"/>
+        </w:rPr>
+      </w:pPr>
+      <w:r>
+        <w:rPr>
+          <w:color w:val="auto"/>
+        </w:rPr>
+        <w:t>Бланк уставок</w:t>
       </w:r>
     </w:p>
     <w:tbl>
       <w:tblPr>
-        <w:tblpPr w:leftFromText="180" w:rightFromText="180" w:vertAnchor="text" w:horzAnchor="margin" w:tblpXSpec="right" w:tblpY="1206"/>
+        <w:tblpPr w:leftFromText="180" w:rightFromText="180" w:vertAnchor="text" w:horzAnchor="margin" w:tblpXSpec="right" w:tblpY="1636"/>
         <w:tblOverlap w:val="never"/>
         <w:tblW w:w="9923" w:type="dxa"/>
         <w:tblLook w:val="01E0" w:firstRow="1" w:lastRow="1" w:firstColumn="1" w:lastColumn="1" w:noHBand="0" w:noVBand="0"/>
@@ -240,7 +166,7 @@
           </w:tcPr>
           <w:p>
             <w:pPr>
-              <w:pStyle w:val="affc"/>
+              <w:pStyle w:val="affd"/>
             </w:pPr>
             <w:r>
               <w:t>Код заказа устройства</w:t>
@@ -257,7 +183,7 @@
           </w:tcPr>
           <w:p>
             <w:pPr>
-              <w:pStyle w:val="afff3"/>
+              <w:pStyle w:val="afff4"/>
               <w:tabs>
                 <w:tab w:val="clear" w:pos="4677"/>
                 <w:tab w:val="clear" w:pos="9355"/>
@@ -341,7 +267,7 @@
           </w:tcPr>
           <w:p>
             <w:pPr>
-              <w:pStyle w:val="affc"/>
+              <w:pStyle w:val="affd"/>
             </w:pPr>
             <w:r>
               <w:t>Код заказа ИЧМ</w:t>
@@ -368,7 +294,7 @@
           </w:tcPr>
           <w:p>
             <w:pPr>
-              <w:pStyle w:val="afff3"/>
+              <w:pStyle w:val="afff4"/>
               <w:tabs>
                 <w:tab w:val="clear" w:pos="4677"/>
                 <w:tab w:val="clear" w:pos="9355"/>
@@ -437,43 +363,34 @@
       <w:pPr>
         <w:pStyle w:val="aff"/>
         <w:rPr>
-          <w:color w:val="F7941D"/>
-          <w:lang w:val="en-US"/>
+          <w:color w:val="365F91" w:themeColor="accent1" w:themeShade="BF"/>
         </w:rPr>
       </w:pPr>
       <w:proofErr w:type="gramStart"/>
       <w:r>
         <w:rPr>
-          <w:color w:val="F7941D"/>
-          <w:sz w:val="40"/>
-          <w:szCs w:val="40"/>
+          <w:color w:val="365F91" w:themeColor="accent1" w:themeShade="BF"/>
           <w:lang w:val="en-US"/>
         </w:rPr>
         <w:t>{</w:t>
       </w:r>
       <w:r>
         <w:rPr>
-          <w:color w:val="F7941D"/>
-          <w:sz w:val="40"/>
-          <w:szCs w:val="40"/>
+          <w:color w:val="365F91" w:themeColor="accent1" w:themeShade="BF"/>
           <w:lang w:val="en-US"/>
         </w:rPr>
         <w:t>{</w:t>
       </w:r>
       <w:r>
         <w:rPr>
-          <w:color w:val="F7941D"/>
-          <w:sz w:val="40"/>
-          <w:szCs w:val="40"/>
+          <w:color w:val="365F91" w:themeColor="accent1" w:themeShade="BF"/>
           <w:lang w:val="en-US"/>
         </w:rPr>
         <w:t xml:space="preserve"> </w:t>
       </w:r>
       <w:r>
         <w:rPr>
-          <w:color w:val="F7941D"/>
-          <w:sz w:val="40"/>
-          <w:szCs w:val="40"/>
+          <w:color w:val="365F91" w:themeColor="accent1" w:themeShade="BF"/>
           <w:lang w:val="en-US"/>
         </w:rPr>
         <w:t>code</w:t>
@@ -481,31 +398,33 @@
       <w:proofErr w:type="gramEnd"/>
       <w:r>
         <w:rPr>
-          <w:color w:val="F7941D"/>
-          <w:sz w:val="40"/>
-          <w:szCs w:val="40"/>
+          <w:color w:val="365F91" w:themeColor="accent1" w:themeShade="BF"/>
           <w:lang w:val="en-US"/>
         </w:rPr>
         <w:t xml:space="preserve"> </w:t>
       </w:r>
       <w:r>
         <w:rPr>
-          <w:color w:val="F7941D"/>
-          <w:sz w:val="40"/>
-          <w:szCs w:val="40"/>
+          <w:color w:val="365F91" w:themeColor="accent1" w:themeShade="BF"/>
           <w:lang w:val="en-US"/>
         </w:rPr>
         <w:t>}</w:t>
       </w:r>
       <w:r>
         <w:rPr>
-          <w:color w:val="F7941D"/>
-          <w:sz w:val="40"/>
-          <w:szCs w:val="40"/>
+          <w:color w:val="365F91" w:themeColor="accent1" w:themeShade="BF"/>
           <w:lang w:val="en-US"/>
         </w:rPr>
         <w:t>}</w:t>
       </w:r>
+    </w:p>
+    <w:p>
+      <w:pPr>
+        <w:pStyle w:val="aff"/>
+        <w:rPr>
+          <w:color w:val="365F91" w:themeColor="accent1" w:themeShade="BF"/>
+        </w:rPr>
+      </w:pPr>
     </w:p>
     <w:tbl>
       <w:tblPr>
@@ -529,7 +448,7 @@
           </w:tcPr>
           <w:p>
             <w:pPr>
-              <w:pStyle w:val="affc"/>
+              <w:pStyle w:val="affd"/>
               <w:jc w:val="center"/>
             </w:pPr>
             <w:r>
@@ -544,7 +463,7 @@
           </w:tcPr>
           <w:p>
             <w:pPr>
-              <w:pStyle w:val="afff3"/>
+              <w:pStyle w:val="afff4"/>
               <w:tabs>
                 <w:tab w:val="clear" w:pos="4677"/>
                 <w:tab w:val="clear" w:pos="9355"/>
@@ -564,7 +483,7 @@
           </w:p>
           <w:p>
             <w:pPr>
-              <w:pStyle w:val="afff3"/>
+              <w:pStyle w:val="afff4"/>
               <w:tabs>
                 <w:tab w:val="clear" w:pos="4677"/>
                 <w:tab w:val="clear" w:pos="9355"/>
@@ -584,7 +503,7 @@
           </w:p>
           <w:p>
             <w:pPr>
-              <w:pStyle w:val="afff3"/>
+              <w:pStyle w:val="afff4"/>
               <w:tabs>
                 <w:tab w:val="clear" w:pos="4677"/>
                 <w:tab w:val="clear" w:pos="9355"/>
@@ -604,7 +523,7 @@
           </w:p>
           <w:p>
             <w:pPr>
-              <w:pStyle w:val="afff3"/>
+              <w:pStyle w:val="afff4"/>
               <w:tabs>
                 <w:tab w:val="clear" w:pos="4677"/>
                 <w:tab w:val="clear" w:pos="9355"/>
@@ -627,13 +546,13 @@
           </w:tcPr>
           <w:p>
             <w:pPr>
-              <w:pStyle w:val="affc"/>
+              <w:pStyle w:val="affd"/>
               <w:jc w:val="center"/>
             </w:pPr>
           </w:p>
           <w:p>
             <w:pPr>
-              <w:pStyle w:val="affc"/>
+              <w:pStyle w:val="affd"/>
               <w:jc w:val="center"/>
             </w:pPr>
             <w:r>
@@ -756,13 +675,50 @@
         <w:rPr>
           <w:lang w:val="en-US"/>
         </w:rPr>
+      </w:pPr>
+    </w:p>
+    <w:p>
+      <w:pPr>
+        <w:rPr>
+          <w:lang w:val="en-US"/>
+        </w:rPr>
+      </w:pPr>
+    </w:p>
+    <w:p>
+      <w:pPr>
+        <w:rPr>
+          <w:lang w:val="en-US"/>
+        </w:rPr>
+      </w:pPr>
+    </w:p>
+    <w:p/>
+    <w:p>
+      <w:pPr>
+        <w:rPr>
+          <w:lang w:val="en-US"/>
+        </w:rPr>
+      </w:pPr>
+    </w:p>
+    <w:p>
+      <w:pPr>
+        <w:ind w:right="-1"/>
+        <w:jc w:val="right"/>
+        <w:rPr>
+          <w:lang w:val="en-US"/>
+        </w:rPr>
+      </w:pPr>
+    </w:p>
+    <w:p>
+      <w:pPr>
         <w:sectPr>
-          <w:headerReference w:type="default" r:id="rId8"/>
-          <w:footerReference w:type="default" r:id="rId9"/>
-          <w:headerReference w:type="first" r:id="rId10"/>
-          <w:footerReference w:type="first" r:id="rId11"/>
+          <w:headerReference w:type="even" r:id="rId8"/>
+          <w:headerReference w:type="default" r:id="rId9"/>
+          <w:footerReference w:type="even" r:id="rId10"/>
+          <w:footerReference w:type="default" r:id="rId11"/>
+          <w:headerReference w:type="first" r:id="rId12"/>
+          <w:footerReference w:type="first" r:id="rId13"/>
           <w:pgSz w:w="11907" w:h="16839" w:code="9"/>
-          <w:pgMar w:top="972" w:right="567" w:bottom="567" w:left="567" w:header="284" w:footer="283" w:gutter="851"/>
+          <w:pgMar w:top="1134" w:right="567" w:bottom="567" w:left="567" w:header="283" w:footer="283" w:gutter="851"/>
           <w:cols w:space="708"/>
           <w:titlePg/>
           <w:docGrid w:linePitch="360"/>
@@ -771,7 +727,7 @@
     </w:p>
     <w:p>
       <w:pPr>
-        <w:pStyle w:val="afff0"/>
+        <w:pStyle w:val="afff1"/>
         <w:ind w:right="282"/>
         <w:rPr>
           <w:lang w:val="en-US"/>
@@ -780,7 +736,7 @@
     </w:p>
     <w:tbl>
       <w:tblPr>
-        <w:tblStyle w:val="aff6"/>
+        <w:tblStyle w:val="aff7"/>
         <w:tblpPr w:leftFromText="180" w:rightFromText="180" w:vertAnchor="text" w:horzAnchor="page" w:tblpX="8070" w:tblpY="42"/>
         <w:tblW w:w="0" w:type="auto"/>
         <w:tblBorders>
@@ -808,7 +764,7 @@
           </w:tcPr>
           <w:p>
             <w:pPr>
-              <w:pStyle w:val="afff0"/>
+              <w:pStyle w:val="afff1"/>
               <w:ind w:left="117" w:right="282" w:firstLine="0"/>
               <w:jc w:val="right"/>
             </w:pPr>
@@ -830,13 +786,14 @@
           </w:tcPr>
           <w:p>
             <w:pPr>
-              <w:pStyle w:val="afff0"/>
+              <w:pStyle w:val="afff1"/>
               <w:ind w:right="282" w:firstLine="0"/>
               <w:jc w:val="left"/>
             </w:pPr>
             <w:proofErr w:type="gramStart"/>
             <w:r>
               <w:rPr>
+                <w:color w:val="A6A6A6" w:themeColor="background1" w:themeShade="A6"/>
                 <w:lang w:val="en-US"/>
               </w:rPr>
               <w:t>{{ version</w:t>
@@ -844,6 +801,7 @@
             <w:proofErr w:type="gramEnd"/>
             <w:r>
               <w:rPr>
+                <w:color w:val="A6A6A6" w:themeColor="background1" w:themeShade="A6"/>
                 <w:lang w:val="en-US"/>
               </w:rPr>
               <w:t xml:space="preserve"> }}</w:t>
@@ -862,7 +820,7 @@
           </w:tcPr>
           <w:p>
             <w:pPr>
-              <w:pStyle w:val="afff0"/>
+              <w:pStyle w:val="afff1"/>
               <w:ind w:left="117" w:right="282" w:firstLine="0"/>
               <w:jc w:val="right"/>
             </w:pPr>
@@ -884,7 +842,7 @@
           </w:tcPr>
           <w:p>
             <w:pPr>
-              <w:pStyle w:val="afff0"/>
+              <w:pStyle w:val="afff1"/>
               <w:ind w:right="282" w:firstLine="0"/>
               <w:jc w:val="left"/>
               <w:rPr>
@@ -894,28 +852,18 @@
             <w:proofErr w:type="gramStart"/>
             <w:r>
               <w:rPr>
+                <w:color w:val="A6A6A6" w:themeColor="background1" w:themeShade="A6"/>
                 <w:lang w:val="en-US"/>
               </w:rPr>
-              <w:t>{{ d</w:t>
-            </w:r>
-            <w:r>
-              <w:rPr>
-                <w:lang w:val="en-US"/>
-              </w:rPr>
-              <w:t>ate</w:t>
+              <w:t>{{ date</w:t>
             </w:r>
             <w:proofErr w:type="gramEnd"/>
             <w:r>
               <w:rPr>
+                <w:color w:val="A6A6A6" w:themeColor="background1" w:themeShade="A6"/>
                 <w:lang w:val="en-US"/>
               </w:rPr>
-              <w:t xml:space="preserve"> </w:t>
-            </w:r>
-            <w:r>
-              <w:rPr>
-                <w:lang w:val="en-US"/>
-              </w:rPr>
-              <w:t>}}</w:t>
+              <w:t xml:space="preserve"> }}</w:t>
             </w:r>
           </w:p>
         </w:tc>
@@ -923,7 +871,7 @@
     </w:tbl>
     <w:p>
       <w:pPr>
-        <w:pStyle w:val="afff0"/>
+        <w:pStyle w:val="afff1"/>
       </w:pPr>
       <w:r>
         <w:t xml:space="preserve">© </w:t>
@@ -969,12 +917,12 @@
     </w:p>
     <w:p>
       <w:pPr>
-        <w:pStyle w:val="afff0"/>
+        <w:pStyle w:val="afff1"/>
       </w:pPr>
     </w:p>
     <w:p>
       <w:pPr>
-        <w:pStyle w:val="afff0"/>
+        <w:pStyle w:val="afff1"/>
       </w:pPr>
       <w:r>
         <w:t>Москва</w:t>
@@ -982,23 +930,17 @@
     </w:p>
     <w:p>
       <w:pPr>
-        <w:pStyle w:val="afff0"/>
+        <w:pStyle w:val="afff1"/>
       </w:pPr>
     </w:p>
     <w:p>
       <w:pPr>
-        <w:pStyle w:val="afff0"/>
+        <w:pStyle w:val="afff1"/>
       </w:pPr>
     </w:p>
     <w:p>
       <w:pPr>
-        <w:pStyle w:val="afff0"/>
-        <w:ind w:right="282"/>
-      </w:pPr>
-    </w:p>
-    <w:p>
-      <w:pPr>
-        <w:pStyle w:val="afff0"/>
+        <w:pStyle w:val="afff1"/>
         <w:ind w:right="282"/>
         <w:rPr>
           <w:lang w:val="en-US"/>
@@ -1007,7 +949,7 @@
     </w:p>
     <w:p>
       <w:pPr>
-        <w:pStyle w:val="afff0"/>
+        <w:pStyle w:val="afff1"/>
         <w:ind w:right="282"/>
         <w:rPr>
           <w:lang w:val="en-US"/>
@@ -1016,7 +958,7 @@
     </w:p>
     <w:p>
       <w:pPr>
-        <w:pStyle w:val="afff0"/>
+        <w:pStyle w:val="afff1"/>
         <w:ind w:right="282"/>
         <w:rPr>
           <w:lang w:val="en-US"/>
@@ -1025,7 +967,7 @@
     </w:p>
     <w:p>
       <w:pPr>
-        <w:pStyle w:val="afff0"/>
+        <w:pStyle w:val="afff1"/>
         <w:ind w:right="282"/>
         <w:rPr>
           <w:lang w:val="en-US"/>
@@ -1034,19 +976,28 @@
     </w:p>
     <w:p>
       <w:pPr>
-        <w:pStyle w:val="afff0"/>
+        <w:pStyle w:val="afff1"/>
         <w:ind w:right="282"/>
+        <w:rPr>
+          <w:lang w:val="en-US"/>
+        </w:rPr>
       </w:pPr>
     </w:p>
     <w:p>
       <w:pPr>
-        <w:pStyle w:val="afff0"/>
+        <w:pStyle w:val="afff1"/>
         <w:ind w:right="282"/>
       </w:pPr>
     </w:p>
     <w:p>
       <w:pPr>
-        <w:pStyle w:val="afff0"/>
+        <w:pStyle w:val="afff1"/>
+        <w:ind w:right="282"/>
+      </w:pPr>
+    </w:p>
+    <w:p>
+      <w:pPr>
+        <w:pStyle w:val="afff1"/>
         <w:ind w:left="567" w:right="282" w:firstLine="0"/>
       </w:pPr>
       <w:r>
@@ -1096,13 +1047,13 @@
     </w:p>
     <w:p>
       <w:pPr>
-        <w:pStyle w:val="afff0"/>
+        <w:pStyle w:val="afff1"/>
         <w:ind w:right="282"/>
       </w:pPr>
     </w:p>
     <w:p>
       <w:pPr>
-        <w:pStyle w:val="afff0"/>
+        <w:pStyle w:val="afff1"/>
         <w:ind w:left="567" w:right="282" w:firstLine="0"/>
       </w:pPr>
       <w:r>
@@ -1119,13 +1070,13 @@
     </w:p>
     <w:p>
       <w:pPr>
-        <w:pStyle w:val="afff0"/>
+        <w:pStyle w:val="afff1"/>
         <w:ind w:right="282"/>
       </w:pPr>
     </w:p>
     <w:p>
       <w:pPr>
-        <w:pStyle w:val="afff0"/>
+        <w:pStyle w:val="afff1"/>
         <w:ind w:left="567" w:right="282" w:firstLine="0"/>
       </w:pPr>
       <w:r>
@@ -1134,13 +1085,13 @@
     </w:p>
     <w:p>
       <w:pPr>
-        <w:pStyle w:val="afff0"/>
+        <w:pStyle w:val="afff1"/>
         <w:ind w:right="282"/>
       </w:pPr>
     </w:p>
     <w:p>
       <w:pPr>
-        <w:pStyle w:val="afff0"/>
+        <w:pStyle w:val="afff1"/>
         <w:ind w:left="567" w:right="282" w:firstLine="0"/>
       </w:pPr>
       <w:r>
@@ -1149,19 +1100,19 @@
     </w:p>
     <w:p>
       <w:pPr>
-        <w:pStyle w:val="afff0"/>
+        <w:pStyle w:val="afff1"/>
         <w:ind w:right="282"/>
       </w:pPr>
     </w:p>
     <w:p>
       <w:pPr>
-        <w:pStyle w:val="afff0"/>
+        <w:pStyle w:val="afff1"/>
         <w:ind w:right="282"/>
       </w:pPr>
     </w:p>
     <w:p>
       <w:pPr>
-        <w:pStyle w:val="afff0"/>
+        <w:pStyle w:val="afff1"/>
         <w:tabs>
           <w:tab w:val="left" w:pos="3444"/>
         </w:tabs>
@@ -1173,115 +1124,115 @@
     </w:p>
     <w:p>
       <w:pPr>
-        <w:pStyle w:val="afff0"/>
+        <w:pStyle w:val="afff1"/>
         <w:ind w:right="282"/>
       </w:pPr>
     </w:p>
     <w:p>
       <w:pPr>
-        <w:pStyle w:val="afff0"/>
+        <w:pStyle w:val="afff1"/>
         <w:ind w:right="282"/>
       </w:pPr>
     </w:p>
     <w:p>
       <w:pPr>
-        <w:pStyle w:val="afff0"/>
+        <w:pStyle w:val="afff1"/>
         <w:ind w:right="282"/>
       </w:pPr>
     </w:p>
     <w:p>
       <w:pPr>
-        <w:pStyle w:val="afff0"/>
+        <w:pStyle w:val="afff1"/>
         <w:ind w:right="282"/>
       </w:pPr>
     </w:p>
     <w:p>
       <w:pPr>
-        <w:pStyle w:val="afff0"/>
+        <w:pStyle w:val="afff1"/>
         <w:ind w:right="282"/>
       </w:pPr>
     </w:p>
     <w:p>
       <w:pPr>
-        <w:pStyle w:val="afff0"/>
+        <w:pStyle w:val="afff1"/>
         <w:ind w:right="282"/>
       </w:pPr>
     </w:p>
     <w:p>
       <w:pPr>
-        <w:pStyle w:val="afff0"/>
+        <w:pStyle w:val="afff1"/>
         <w:ind w:right="282"/>
       </w:pPr>
     </w:p>
     <w:p>
       <w:pPr>
-        <w:pStyle w:val="afff0"/>
+        <w:pStyle w:val="afff1"/>
         <w:ind w:right="282"/>
       </w:pPr>
     </w:p>
     <w:p>
       <w:pPr>
-        <w:pStyle w:val="afff0"/>
+        <w:pStyle w:val="afff1"/>
         <w:ind w:right="282"/>
       </w:pPr>
     </w:p>
     <w:p>
       <w:pPr>
-        <w:pStyle w:val="afff0"/>
+        <w:pStyle w:val="afff1"/>
         <w:ind w:right="282"/>
       </w:pPr>
     </w:p>
     <w:p>
       <w:pPr>
-        <w:pStyle w:val="afff0"/>
+        <w:pStyle w:val="afff1"/>
         <w:ind w:right="282"/>
       </w:pPr>
     </w:p>
     <w:p>
       <w:pPr>
-        <w:pStyle w:val="afff0"/>
+        <w:pStyle w:val="afff1"/>
         <w:ind w:right="282"/>
       </w:pPr>
     </w:p>
     <w:p>
       <w:pPr>
-        <w:pStyle w:val="afff0"/>
+        <w:pStyle w:val="afff1"/>
         <w:ind w:right="282"/>
       </w:pPr>
     </w:p>
     <w:p>
       <w:pPr>
-        <w:pStyle w:val="afff0"/>
+        <w:pStyle w:val="afff1"/>
         <w:ind w:right="282"/>
       </w:pPr>
     </w:p>
     <w:p>
       <w:pPr>
-        <w:pStyle w:val="afff0"/>
+        <w:pStyle w:val="afff1"/>
         <w:ind w:right="282"/>
       </w:pPr>
     </w:p>
     <w:p>
       <w:pPr>
-        <w:pStyle w:val="afff0"/>
+        <w:pStyle w:val="afff1"/>
         <w:ind w:right="282"/>
       </w:pPr>
     </w:p>
     <w:p>
       <w:pPr>
-        <w:pStyle w:val="afff0"/>
-        <w:ind w:right="282"/>
+        <w:pStyle w:val="afff1"/>
+        <w:ind w:right="-1"/>
       </w:pPr>
     </w:p>
     <w:p>
       <w:pPr>
-        <w:pStyle w:val="afff0"/>
+        <w:pStyle w:val="afff1"/>
         <w:ind w:right="282"/>
       </w:pPr>
     </w:p>
     <w:p>
       <w:pPr>
-        <w:pStyle w:val="afff0"/>
+        <w:pStyle w:val="afff1"/>
         <w:ind w:right="282"/>
         <w:rPr>
           <w:i/>
@@ -1337,7 +1288,7 @@
     </w:p>
     <w:p>
       <w:pPr>
-        <w:pStyle w:val="afff0"/>
+        <w:pStyle w:val="afff1"/>
         <w:rPr>
           <w:i/>
           <w:iCs/>
@@ -1346,10 +1297,10 @@
           <w:szCs w:val="20"/>
         </w:rPr>
         <w:sectPr>
-          <w:headerReference w:type="first" r:id="rId12"/>
-          <w:footerReference w:type="first" r:id="rId13"/>
+          <w:headerReference w:type="first" r:id="rId14"/>
+          <w:footerReference w:type="first" r:id="rId15"/>
           <w:pgSz w:w="11907" w:h="16839" w:code="9"/>
-          <w:pgMar w:top="567" w:right="567" w:bottom="567" w:left="567" w:header="0" w:footer="227" w:gutter="851"/>
+          <w:pgMar w:top="567" w:right="567" w:bottom="567" w:left="567" w:header="227" w:footer="227" w:gutter="851"/>
           <w:cols w:space="708"/>
           <w:titlePg/>
           <w:docGrid w:linePitch="360"/>
@@ -1535,7 +1486,6 @@
           <w:bCs w:val="0"/>
           <w:caps w:val="0"/>
           <w:snapToGrid/>
-          <w:color w:val="auto"/>
           <w:kern w:val="2"/>
           <w:szCs w:val="24"/>
           <w14:ligatures w14:val="standardContextual"/>
@@ -1544,7 +1494,6 @@
       <w:r>
         <w:rPr>
           <w:snapToGrid/>
-          <w:color w:val="0000FF" w:themeColor="hyperlink"/>
           <w:szCs w:val="24"/>
           <w:u w:val="single"/>
         </w:rPr>
@@ -1553,7 +1502,6 @@
       <w:r>
         <w:rPr>
           <w:snapToGrid/>
-          <w:color w:val="0000FF" w:themeColor="hyperlink"/>
           <w:szCs w:val="24"/>
           <w:u w:val="single"/>
         </w:rPr>
@@ -1562,7 +1510,6 @@
       <w:r>
         <w:rPr>
           <w:snapToGrid/>
-          <w:color w:val="0000FF" w:themeColor="hyperlink"/>
           <w:szCs w:val="24"/>
           <w:u w:val="single"/>
         </w:rPr>
@@ -1571,7 +1518,8 @@
       <w:hyperlink w:anchor="_Toc229833150" w:history="1">
         <w:r>
           <w:rPr>
-            <w:rStyle w:val="afff2"/>
+            <w:rStyle w:val="afff3"/>
+            <w:color w:val="365F91" w:themeColor="accent1" w:themeShade="BF"/>
           </w:rPr>
           <w:t>СОДЕРЖАНИЕ</w:t>
         </w:r>
@@ -1629,7 +1577,7 @@
         <w:rPr>
           <w:noProof/>
           <w:snapToGrid/>
-          <w:color w:val="0000FF" w:themeColor="hyperlink"/>
+          <w:color w:val="365F91" w:themeColor="accent1" w:themeShade="BF"/>
           <w:szCs w:val="24"/>
           <w:u w:val="single"/>
         </w:rPr>
@@ -1645,8 +1593,10 @@
       </w:pPr>
     </w:p>
     <w:sectPr>
+      <w:headerReference w:type="default" r:id="rId16"/>
+      <w:footerReference w:type="default" r:id="rId17"/>
       <w:pgSz w:w="11907" w:h="16839" w:code="9"/>
-      <w:pgMar w:top="397" w:right="454" w:bottom="397" w:left="851" w:header="0" w:footer="170" w:gutter="0"/>
+      <w:pgMar w:top="567" w:right="567" w:bottom="567" w:left="1418" w:header="227" w:footer="227" w:gutter="0"/>
       <w:cols w:space="708"/>
       <w:docGrid w:linePitch="360"/>
     </w:sectPr>
@@ -1677,7 +1627,17 @@
 <w:ftr xmlns:wpc="http://schemas.microsoft.com/office/word/2010/wordprocessingCanvas" xmlns:cx="http://schemas.microsoft.com/office/drawing/2014/chartex" xmlns:cx1="http://schemas.microsoft.com/office/drawing/2015/9/8/chartex" xmlns:cx2="http://schemas.microsoft.com/office/drawing/2015/10/21/chartex" xmlns:cx3="http://schemas.microsoft.com/office/drawing/2016/5/9/chartex" xmlns:cx4="http://schemas.microsoft.com/office/drawing/2016/5/10/chartex" xmlns:cx5="http://schemas.microsoft.com/office/drawing/2016/5/11/chartex" xmlns:cx6="http://schemas.microsoft.com/office/drawing/2016/5/12/chartex" xmlns:cx7="http://schemas.microsoft.com/office/drawing/2016/5/13/chartex" xmlns:cx8="http://schemas.microsoft.com/office/drawing/2016/5/14/chartex" xmlns:mc="http://schemas.openxmlformats.org/markup-compatibility/2006" xmlns:aink="http://schemas.microsoft.com/office/drawing/2016/ink" xmlns:am3d="http://schemas.microsoft.com/office/drawing/2017/model3d" xmlns:o="urn:schemas-microsoft-com:office:office" xmlns:oel="http://schemas.microsoft.com/office/2019/extlst" xmlns:r="http://schemas.openxmlformats.org/officeDocument/2006/relationships" xmlns:m="http://schemas.openxmlformats.org/officeDocument/2006/math" xmlns:v="urn:schemas-microsoft-com:vml" xmlns:wp14="http://schemas.microsoft.com/office/word/2010/wordprocessingDrawing" xmlns:wp="http://schemas.openxmlformats.org/drawingml/2006/wordprocessingDrawing" xmlns:w10="urn:schemas-microsoft-com:office:word" xmlns:w="http://schemas.openxmlformats.org/wordprocessingml/2006/main" xmlns:w14="http://schemas.microsoft.com/office/word/2010/wordml" xmlns:w15="http://schemas.microsoft.com/office/word/2012/wordml" xmlns:w16cex="http://schemas.microsoft.com/office/word/2018/wordml/cex" xmlns:w16cid="http://schemas.microsoft.com/office/word/2016/wordml/cid" xmlns:w16="http://schemas.microsoft.com/office/word/2018/wordml" xmlns:w16sdtdh="http://schemas.microsoft.com/office/word/2020/wordml/sdtdatahash" xmlns:w16se="http://schemas.microsoft.com/office/word/2015/wordml/symex" xmlns:wpg="http://schemas.microsoft.com/office/word/2010/wordprocessingGroup" xmlns:wpi="http://schemas.microsoft.com/office/word/2010/wordprocessingInk" xmlns:wne="http://schemas.microsoft.com/office/word/2006/wordml" xmlns:wps="http://schemas.microsoft.com/office/word/2010/wordprocessingShape" mc:Ignorable="w14 w15 w16se w16cid w16 w16cex w16sdtdh wp14">
   <w:p>
     <w:pPr>
-      <w:pStyle w:val="afff5"/>
+      <w:pStyle w:val="afff6"/>
+    </w:pPr>
+  </w:p>
+</w:ftr>
+</file>
+
+<file path=word/footer2.xml><?xml version="1.0" encoding="utf-8"?>
+<w:ftr xmlns:wpc="http://schemas.microsoft.com/office/word/2010/wordprocessingCanvas" xmlns:cx="http://schemas.microsoft.com/office/drawing/2014/chartex" xmlns:cx1="http://schemas.microsoft.com/office/drawing/2015/9/8/chartex" xmlns:cx2="http://schemas.microsoft.com/office/drawing/2015/10/21/chartex" xmlns:cx3="http://schemas.microsoft.com/office/drawing/2016/5/9/chartex" xmlns:cx4="http://schemas.microsoft.com/office/drawing/2016/5/10/chartex" xmlns:cx5="http://schemas.microsoft.com/office/drawing/2016/5/11/chartex" xmlns:cx6="http://schemas.microsoft.com/office/drawing/2016/5/12/chartex" xmlns:cx7="http://schemas.microsoft.com/office/drawing/2016/5/13/chartex" xmlns:cx8="http://schemas.microsoft.com/office/drawing/2016/5/14/chartex" xmlns:mc="http://schemas.openxmlformats.org/markup-compatibility/2006" xmlns:aink="http://schemas.microsoft.com/office/drawing/2016/ink" xmlns:am3d="http://schemas.microsoft.com/office/drawing/2017/model3d" xmlns:o="urn:schemas-microsoft-com:office:office" xmlns:oel="http://schemas.microsoft.com/office/2019/extlst" xmlns:r="http://schemas.openxmlformats.org/officeDocument/2006/relationships" xmlns:m="http://schemas.openxmlformats.org/officeDocument/2006/math" xmlns:v="urn:schemas-microsoft-com:vml" xmlns:wp14="http://schemas.microsoft.com/office/word/2010/wordprocessingDrawing" xmlns:wp="http://schemas.openxmlformats.org/drawingml/2006/wordprocessingDrawing" xmlns:w10="urn:schemas-microsoft-com:office:word" xmlns:w="http://schemas.openxmlformats.org/wordprocessingml/2006/main" xmlns:w14="http://schemas.microsoft.com/office/word/2010/wordml" xmlns:w15="http://schemas.microsoft.com/office/word/2012/wordml" xmlns:w16cex="http://schemas.microsoft.com/office/word/2018/wordml/cex" xmlns:w16cid="http://schemas.microsoft.com/office/word/2016/wordml/cid" xmlns:w16="http://schemas.microsoft.com/office/word/2018/wordml" xmlns:w16sdtdh="http://schemas.microsoft.com/office/word/2020/wordml/sdtdatahash" xmlns:w16se="http://schemas.microsoft.com/office/word/2015/wordml/symex" xmlns:wpg="http://schemas.microsoft.com/office/word/2010/wordprocessingGroup" xmlns:wpi="http://schemas.microsoft.com/office/word/2010/wordprocessingInk" xmlns:wne="http://schemas.microsoft.com/office/word/2006/wordml" xmlns:wps="http://schemas.microsoft.com/office/word/2010/wordprocessingShape" mc:Ignorable="w14 w15 w16se w16cid w16 w16cex w16sdtdh wp14">
+  <w:p>
+    <w:pPr>
+      <w:pStyle w:val="afff6"/>
       <w:pBdr>
         <w:top w:val="single" w:sz="4" w:space="1" w:color="auto"/>
       </w:pBdr>
@@ -1693,7 +1653,7 @@
     </w:pPr>
     <w:r>
       <w:rPr>
-        <w:rStyle w:val="afff1"/>
+        <w:rStyle w:val="afff2"/>
       </w:rPr>
       <w:t>Бланк уставок</w:t>
     </w:r>
@@ -1733,107 +1693,6 @@
         <w:szCs w:val="24"/>
       </w:rPr>
       <w:fldChar w:fldCharType="end"/>
-    </w:r>
-  </w:p>
-</w:ftr>
-</file>
-
-<file path=word/footer2.xml><?xml version="1.0" encoding="utf-8"?>
-<w:ftr xmlns:wpc="http://schemas.microsoft.com/office/word/2010/wordprocessingCanvas" xmlns:cx="http://schemas.microsoft.com/office/drawing/2014/chartex" xmlns:cx1="http://schemas.microsoft.com/office/drawing/2015/9/8/chartex" xmlns:cx2="http://schemas.microsoft.com/office/drawing/2015/10/21/chartex" xmlns:cx3="http://schemas.microsoft.com/office/drawing/2016/5/9/chartex" xmlns:cx4="http://schemas.microsoft.com/office/drawing/2016/5/10/chartex" xmlns:cx5="http://schemas.microsoft.com/office/drawing/2016/5/11/chartex" xmlns:cx6="http://schemas.microsoft.com/office/drawing/2016/5/12/chartex" xmlns:cx7="http://schemas.microsoft.com/office/drawing/2016/5/13/chartex" xmlns:cx8="http://schemas.microsoft.com/office/drawing/2016/5/14/chartex" xmlns:mc="http://schemas.openxmlformats.org/markup-compatibility/2006" xmlns:aink="http://schemas.microsoft.com/office/drawing/2016/ink" xmlns:am3d="http://schemas.microsoft.com/office/drawing/2017/model3d" xmlns:o="urn:schemas-microsoft-com:office:office" xmlns:oel="http://schemas.microsoft.com/office/2019/extlst" xmlns:r="http://schemas.openxmlformats.org/officeDocument/2006/relationships" xmlns:m="http://schemas.openxmlformats.org/officeDocument/2006/math" xmlns:v="urn:schemas-microsoft-com:vml" xmlns:wp14="http://schemas.microsoft.com/office/word/2010/wordprocessingDrawing" xmlns:wp="http://schemas.openxmlformats.org/drawingml/2006/wordprocessingDrawing" xmlns:w10="urn:schemas-microsoft-com:office:word" xmlns:w="http://schemas.openxmlformats.org/wordprocessingml/2006/main" xmlns:w14="http://schemas.microsoft.com/office/word/2010/wordml" xmlns:w15="http://schemas.microsoft.com/office/word/2012/wordml" xmlns:w16cex="http://schemas.microsoft.com/office/word/2018/wordml/cex" xmlns:w16cid="http://schemas.microsoft.com/office/word/2016/wordml/cid" xmlns:w16="http://schemas.microsoft.com/office/word/2018/wordml" xmlns:w16sdtdh="http://schemas.microsoft.com/office/word/2020/wordml/sdtdatahash" xmlns:w16se="http://schemas.microsoft.com/office/word/2015/wordml/symex" xmlns:wpg="http://schemas.microsoft.com/office/word/2010/wordprocessingGroup" xmlns:wpi="http://schemas.microsoft.com/office/word/2010/wordprocessingInk" xmlns:wne="http://schemas.microsoft.com/office/word/2006/wordml" xmlns:wps="http://schemas.microsoft.com/office/word/2010/wordprocessingShape" mc:Ignorable="w14 w15 w16se w16cid w16 w16cex w16sdtdh wp14">
-  <w:p>
-    <w:pPr>
-      <w:pStyle w:val="afff5"/>
-      <w:pBdr>
-        <w:top w:val="single" w:sz="4" w:space="1" w:color="auto"/>
-      </w:pBdr>
-      <w:tabs>
-        <w:tab w:val="clear" w:pos="4677"/>
-        <w:tab w:val="clear" w:pos="9355"/>
-        <w:tab w:val="right" w:pos="9923"/>
-        <w:tab w:val="right" w:pos="13892"/>
-      </w:tabs>
-      <w:jc w:val="both"/>
-      <w:rPr>
-        <w:b/>
-      </w:rPr>
-    </w:pPr>
-    <w:r>
-      <w:rPr>
-        <w:rStyle w:val="afff1"/>
-        <w:lang w:val="en-US"/>
-      </w:rPr>
-      <w:t>https</w:t>
-    </w:r>
-    <w:r>
-      <w:rPr>
-        <w:rStyle w:val="afff1"/>
-      </w:rPr>
-      <w:t>://</w:t>
-    </w:r>
-    <w:proofErr w:type="spellStart"/>
-    <w:r>
-      <w:rPr>
-        <w:rStyle w:val="afff1"/>
-        <w:lang w:val="en-US"/>
-      </w:rPr>
-      <w:t>uni</w:t>
-    </w:r>
-    <w:proofErr w:type="spellEnd"/>
-    <w:r>
-      <w:rPr>
-        <w:rStyle w:val="afff1"/>
-      </w:rPr>
-      <w:t>-</w:t>
-    </w:r>
-    <w:proofErr w:type="spellStart"/>
-    <w:r>
-      <w:rPr>
-        <w:rStyle w:val="afff1"/>
-        <w:lang w:val="en-US"/>
-      </w:rPr>
-      <w:t>eng</w:t>
-    </w:r>
-    <w:proofErr w:type="spellEnd"/>
-    <w:r>
-      <w:rPr>
-        <w:rStyle w:val="afff1"/>
-      </w:rPr>
-      <w:t>.</w:t>
-    </w:r>
-    <w:proofErr w:type="spellStart"/>
-    <w:r>
-      <w:rPr>
-        <w:rStyle w:val="afff1"/>
-        <w:lang w:val="en-US"/>
-      </w:rPr>
-      <w:t>ru</w:t>
-    </w:r>
-    <w:proofErr w:type="spellEnd"/>
-    <w:r>
-      <w:rPr>
-        <w:b/>
-      </w:rPr>
-      <w:tab/>
-    </w:r>
-    <w:r>
-      <w:rPr>
-        <w:szCs w:val="24"/>
-      </w:rPr>
-      <w:t>ООО «</w:t>
-    </w:r>
-    <w:proofErr w:type="spellStart"/>
-    <w:r>
-      <w:rPr>
-        <w:szCs w:val="24"/>
-      </w:rPr>
-      <w:t>Юнител</w:t>
-    </w:r>
-    <w:proofErr w:type="spellEnd"/>
-    <w:r>
-      <w:rPr>
-        <w:szCs w:val="24"/>
-      </w:rPr>
-      <w:t xml:space="preserve"> Инжиниринг»</w:t>
     </w:r>
   </w:p>
 </w:ftr>
@@ -1843,9 +1702,206 @@
 <w:ftr xmlns:wpc="http://schemas.microsoft.com/office/word/2010/wordprocessingCanvas" xmlns:cx="http://schemas.microsoft.com/office/drawing/2014/chartex" xmlns:cx1="http://schemas.microsoft.com/office/drawing/2015/9/8/chartex" xmlns:cx2="http://schemas.microsoft.com/office/drawing/2015/10/21/chartex" xmlns:cx3="http://schemas.microsoft.com/office/drawing/2016/5/9/chartex" xmlns:cx4="http://schemas.microsoft.com/office/drawing/2016/5/10/chartex" xmlns:cx5="http://schemas.microsoft.com/office/drawing/2016/5/11/chartex" xmlns:cx6="http://schemas.microsoft.com/office/drawing/2016/5/12/chartex" xmlns:cx7="http://schemas.microsoft.com/office/drawing/2016/5/13/chartex" xmlns:cx8="http://schemas.microsoft.com/office/drawing/2016/5/14/chartex" xmlns:mc="http://schemas.openxmlformats.org/markup-compatibility/2006" xmlns:aink="http://schemas.microsoft.com/office/drawing/2016/ink" xmlns:am3d="http://schemas.microsoft.com/office/drawing/2017/model3d" xmlns:o="urn:schemas-microsoft-com:office:office" xmlns:oel="http://schemas.microsoft.com/office/2019/extlst" xmlns:r="http://schemas.openxmlformats.org/officeDocument/2006/relationships" xmlns:m="http://schemas.openxmlformats.org/officeDocument/2006/math" xmlns:v="urn:schemas-microsoft-com:vml" xmlns:wp14="http://schemas.microsoft.com/office/word/2010/wordprocessingDrawing" xmlns:wp="http://schemas.openxmlformats.org/drawingml/2006/wordprocessingDrawing" xmlns:w10="urn:schemas-microsoft-com:office:word" xmlns:w="http://schemas.openxmlformats.org/wordprocessingml/2006/main" xmlns:w14="http://schemas.microsoft.com/office/word/2010/wordml" xmlns:w15="http://schemas.microsoft.com/office/word/2012/wordml" xmlns:w16cex="http://schemas.microsoft.com/office/word/2018/wordml/cex" xmlns:w16cid="http://schemas.microsoft.com/office/word/2016/wordml/cid" xmlns:w16="http://schemas.microsoft.com/office/word/2018/wordml" xmlns:w16sdtdh="http://schemas.microsoft.com/office/word/2020/wordml/sdtdatahash" xmlns:w16se="http://schemas.microsoft.com/office/word/2015/wordml/symex" xmlns:wpg="http://schemas.microsoft.com/office/word/2010/wordprocessingGroup" xmlns:wpi="http://schemas.microsoft.com/office/word/2010/wordprocessingInk" xmlns:wne="http://schemas.microsoft.com/office/word/2006/wordml" xmlns:wps="http://schemas.microsoft.com/office/word/2010/wordprocessingShape" mc:Ignorable="w14 w15 w16se w16cid w16 w16cex w16sdtdh wp14">
   <w:p>
     <w:pPr>
-      <w:pStyle w:val="afff5"/>
+      <w:pStyle w:val="afff6"/>
       <w:pBdr>
-        <w:top w:val="single" w:sz="4" w:space="1" w:color="auto"/>
+        <w:top w:val="single" w:sz="12" w:space="1" w:color="365F91" w:themeColor="accent1" w:themeShade="BF"/>
+      </w:pBdr>
+      <w:tabs>
+        <w:tab w:val="clear" w:pos="4677"/>
+        <w:tab w:val="clear" w:pos="9355"/>
+        <w:tab w:val="left" w:pos="3604"/>
+        <w:tab w:val="right" w:pos="9923"/>
+        <w:tab w:val="right" w:pos="13892"/>
+      </w:tabs>
+      <w:spacing w:before="60" w:line="240" w:lineRule="auto"/>
+      <w:jc w:val="both"/>
+      <w:rPr>
+        <w:b/>
+        <w:sz w:val="20"/>
+        <w:szCs w:val="16"/>
+      </w:rPr>
+    </w:pPr>
+    <w:r>
+      <w:rPr>
+        <w:rStyle w:val="afff2"/>
+        <w:sz w:val="20"/>
+        <w:szCs w:val="16"/>
+        <w:lang w:val="en-US"/>
+      </w:rPr>
+      <w:t>https</w:t>
+    </w:r>
+    <w:r>
+      <w:rPr>
+        <w:rStyle w:val="afff2"/>
+        <w:sz w:val="20"/>
+        <w:szCs w:val="16"/>
+      </w:rPr>
+      <w:t>://</w:t>
+    </w:r>
+    <w:proofErr w:type="spellStart"/>
+    <w:r>
+      <w:rPr>
+        <w:rStyle w:val="afff2"/>
+        <w:sz w:val="20"/>
+        <w:szCs w:val="16"/>
+        <w:lang w:val="en-US"/>
+      </w:rPr>
+      <w:t>uni</w:t>
+    </w:r>
+    <w:proofErr w:type="spellEnd"/>
+    <w:r>
+      <w:rPr>
+        <w:rStyle w:val="afff2"/>
+        <w:sz w:val="20"/>
+        <w:szCs w:val="16"/>
+      </w:rPr>
+      <w:t>-</w:t>
+    </w:r>
+    <w:proofErr w:type="spellStart"/>
+    <w:r>
+      <w:rPr>
+        <w:rStyle w:val="afff2"/>
+        <w:sz w:val="20"/>
+        <w:szCs w:val="16"/>
+        <w:lang w:val="en-US"/>
+      </w:rPr>
+      <w:t>eng</w:t>
+    </w:r>
+    <w:proofErr w:type="spellEnd"/>
+    <w:r>
+      <w:rPr>
+        <w:rStyle w:val="afff2"/>
+        <w:sz w:val="20"/>
+        <w:szCs w:val="16"/>
+      </w:rPr>
+      <w:t>.</w:t>
+    </w:r>
+    <w:proofErr w:type="spellStart"/>
+    <w:r>
+      <w:rPr>
+        <w:rStyle w:val="afff2"/>
+        <w:sz w:val="20"/>
+        <w:szCs w:val="16"/>
+        <w:lang w:val="en-US"/>
+      </w:rPr>
+      <w:t>ru</w:t>
+    </w:r>
+    <w:proofErr w:type="spellEnd"/>
+    <w:r>
+      <w:rPr>
+        <w:b/>
+      </w:rPr>
+      <w:tab/>
+    </w:r>
+    <w:r>
+      <w:rPr>
+        <w:b/>
+      </w:rPr>
+      <w:tab/>
+    </w:r>
+    <w:r>
+      <w:rPr>
+        <w:sz w:val="20"/>
+      </w:rPr>
+      <w:t>ООО «</w:t>
+    </w:r>
+    <w:proofErr w:type="spellStart"/>
+    <w:r>
+      <w:rPr>
+        <w:sz w:val="20"/>
+      </w:rPr>
+      <w:t>Юнител</w:t>
+    </w:r>
+    <w:proofErr w:type="spellEnd"/>
+    <w:r>
+      <w:rPr>
+        <w:sz w:val="20"/>
+      </w:rPr>
+      <w:t xml:space="preserve"> Инжиниринг»</w:t>
+    </w:r>
+  </w:p>
+</w:ftr>
+</file>
+
+<file path=word/footer4.xml><?xml version="1.0" encoding="utf-8"?>
+<w:ftr xmlns:wpc="http://schemas.microsoft.com/office/word/2010/wordprocessingCanvas" xmlns:cx="http://schemas.microsoft.com/office/drawing/2014/chartex" xmlns:cx1="http://schemas.microsoft.com/office/drawing/2015/9/8/chartex" xmlns:cx2="http://schemas.microsoft.com/office/drawing/2015/10/21/chartex" xmlns:cx3="http://schemas.microsoft.com/office/drawing/2016/5/9/chartex" xmlns:cx4="http://schemas.microsoft.com/office/drawing/2016/5/10/chartex" xmlns:cx5="http://schemas.microsoft.com/office/drawing/2016/5/11/chartex" xmlns:cx6="http://schemas.microsoft.com/office/drawing/2016/5/12/chartex" xmlns:cx7="http://schemas.microsoft.com/office/drawing/2016/5/13/chartex" xmlns:cx8="http://schemas.microsoft.com/office/drawing/2016/5/14/chartex" xmlns:mc="http://schemas.openxmlformats.org/markup-compatibility/2006" xmlns:aink="http://schemas.microsoft.com/office/drawing/2016/ink" xmlns:am3d="http://schemas.microsoft.com/office/drawing/2017/model3d" xmlns:o="urn:schemas-microsoft-com:office:office" xmlns:oel="http://schemas.microsoft.com/office/2019/extlst" xmlns:r="http://schemas.openxmlformats.org/officeDocument/2006/relationships" xmlns:m="http://schemas.openxmlformats.org/officeDocument/2006/math" xmlns:v="urn:schemas-microsoft-com:vml" xmlns:wp14="http://schemas.microsoft.com/office/word/2010/wordprocessingDrawing" xmlns:wp="http://schemas.openxmlformats.org/drawingml/2006/wordprocessingDrawing" xmlns:w10="urn:schemas-microsoft-com:office:word" xmlns:w="http://schemas.openxmlformats.org/wordprocessingml/2006/main" xmlns:w14="http://schemas.microsoft.com/office/word/2010/wordml" xmlns:w15="http://schemas.microsoft.com/office/word/2012/wordml" xmlns:w16cex="http://schemas.microsoft.com/office/word/2018/wordml/cex" xmlns:w16cid="http://schemas.microsoft.com/office/word/2016/wordml/cid" xmlns:w16="http://schemas.microsoft.com/office/word/2018/wordml" xmlns:w16sdtdh="http://schemas.microsoft.com/office/word/2020/wordml/sdtdatahash" xmlns:w16se="http://schemas.microsoft.com/office/word/2015/wordml/symex" xmlns:wpg="http://schemas.microsoft.com/office/word/2010/wordprocessingGroup" xmlns:wpi="http://schemas.microsoft.com/office/word/2010/wordprocessingInk" xmlns:wne="http://schemas.microsoft.com/office/word/2006/wordml" xmlns:wps="http://schemas.microsoft.com/office/word/2010/wordprocessingShape" mc:Ignorable="w14 w15 w16se w16cid w16 w16cex w16sdtdh wp14">
+  <w:p>
+    <w:pPr>
+      <w:pStyle w:val="afff6"/>
+      <w:pBdr>
+        <w:top w:val="single" w:sz="12" w:space="1" w:color="365F91" w:themeColor="accent1" w:themeShade="BF"/>
+      </w:pBdr>
+      <w:tabs>
+        <w:tab w:val="clear" w:pos="4677"/>
+        <w:tab w:val="clear" w:pos="9355"/>
+        <w:tab w:val="right" w:pos="15705"/>
+      </w:tabs>
+      <w:spacing w:line="240" w:lineRule="auto"/>
+      <w:jc w:val="both"/>
+      <w:rPr>
+        <w:b/>
+        <w:sz w:val="20"/>
+        <w:szCs w:val="16"/>
+      </w:rPr>
+    </w:pPr>
+    <w:r>
+      <w:rPr>
+        <w:rStyle w:val="afff2"/>
+        <w:sz w:val="20"/>
+        <w:szCs w:val="16"/>
+      </w:rPr>
+      <w:t>Бланк уставок</w:t>
+    </w:r>
+    <w:r>
+      <w:rPr>
+        <w:b/>
+        <w:sz w:val="20"/>
+        <w:szCs w:val="16"/>
+      </w:rPr>
+      <w:tab/>
+    </w:r>
+    <w:r>
+      <w:rPr>
+        <w:sz w:val="20"/>
+      </w:rPr>
+      <w:fldChar w:fldCharType="begin"/>
+    </w:r>
+    <w:r>
+      <w:rPr>
+        <w:sz w:val="20"/>
+      </w:rPr>
+      <w:instrText xml:space="preserve"> PAGE   \* MERGEFORMAT </w:instrText>
+    </w:r>
+    <w:r>
+      <w:rPr>
+        <w:sz w:val="20"/>
+      </w:rPr>
+      <w:fldChar w:fldCharType="separate"/>
+    </w:r>
+    <w:r>
+      <w:rPr>
+        <w:noProof/>
+        <w:sz w:val="20"/>
+      </w:rPr>
+      <w:t>2</w:t>
+    </w:r>
+    <w:r>
+      <w:rPr>
+        <w:sz w:val="20"/>
+      </w:rPr>
+      <w:fldChar w:fldCharType="end"/>
+    </w:r>
+  </w:p>
+</w:ftr>
+</file>
+
+<file path=word/footer5.xml><?xml version="1.0" encoding="utf-8"?>
+<w:ftr xmlns:wpc="http://schemas.microsoft.com/office/word/2010/wordprocessingCanvas" xmlns:cx="http://schemas.microsoft.com/office/drawing/2014/chartex" xmlns:cx1="http://schemas.microsoft.com/office/drawing/2015/9/8/chartex" xmlns:cx2="http://schemas.microsoft.com/office/drawing/2015/10/21/chartex" xmlns:cx3="http://schemas.microsoft.com/office/drawing/2016/5/9/chartex" xmlns:cx4="http://schemas.microsoft.com/office/drawing/2016/5/10/chartex" xmlns:cx5="http://schemas.microsoft.com/office/drawing/2016/5/11/chartex" xmlns:cx6="http://schemas.microsoft.com/office/drawing/2016/5/12/chartex" xmlns:cx7="http://schemas.microsoft.com/office/drawing/2016/5/13/chartex" xmlns:cx8="http://schemas.microsoft.com/office/drawing/2016/5/14/chartex" xmlns:mc="http://schemas.openxmlformats.org/markup-compatibility/2006" xmlns:aink="http://schemas.microsoft.com/office/drawing/2016/ink" xmlns:am3d="http://schemas.microsoft.com/office/drawing/2017/model3d" xmlns:o="urn:schemas-microsoft-com:office:office" xmlns:oel="http://schemas.microsoft.com/office/2019/extlst" xmlns:r="http://schemas.openxmlformats.org/officeDocument/2006/relationships" xmlns:m="http://schemas.openxmlformats.org/officeDocument/2006/math" xmlns:v="urn:schemas-microsoft-com:vml" xmlns:wp14="http://schemas.microsoft.com/office/word/2010/wordprocessingDrawing" xmlns:wp="http://schemas.openxmlformats.org/drawingml/2006/wordprocessingDrawing" xmlns:w10="urn:schemas-microsoft-com:office:word" xmlns:w="http://schemas.openxmlformats.org/wordprocessingml/2006/main" xmlns:w14="http://schemas.microsoft.com/office/word/2010/wordml" xmlns:w15="http://schemas.microsoft.com/office/word/2012/wordml" xmlns:w16cex="http://schemas.microsoft.com/office/word/2018/wordml/cex" xmlns:w16cid="http://schemas.microsoft.com/office/word/2016/wordml/cid" xmlns:w16="http://schemas.microsoft.com/office/word/2018/wordml" xmlns:w16sdtdh="http://schemas.microsoft.com/office/word/2020/wordml/sdtdatahash" xmlns:w16se="http://schemas.microsoft.com/office/word/2015/wordml/symex" xmlns:wpg="http://schemas.microsoft.com/office/word/2010/wordprocessingGroup" xmlns:wpi="http://schemas.microsoft.com/office/word/2010/wordprocessingInk" xmlns:wne="http://schemas.microsoft.com/office/word/2006/wordml" xmlns:wps="http://schemas.microsoft.com/office/word/2010/wordprocessingShape" mc:Ignorable="w14 w15 w16se w16cid w16 w16cex w16sdtdh wp14">
+  <w:p>
+    <w:pPr>
+      <w:pStyle w:val="afff6"/>
+      <w:pBdr>
+        <w:top w:val="single" w:sz="12" w:space="1" w:color="365F91" w:themeColor="accent1" w:themeShade="BF"/>
       </w:pBdr>
       <w:tabs>
         <w:tab w:val="clear" w:pos="4677"/>
@@ -1855,48 +1911,53 @@
       <w:jc w:val="both"/>
       <w:rPr>
         <w:b/>
+        <w:sz w:val="20"/>
+        <w:szCs w:val="16"/>
       </w:rPr>
     </w:pPr>
     <w:r>
       <w:rPr>
-        <w:rStyle w:val="afff1"/>
+        <w:rStyle w:val="afff2"/>
+        <w:sz w:val="20"/>
+        <w:szCs w:val="16"/>
       </w:rPr>
       <w:t>Бланк уставок</w:t>
     </w:r>
     <w:r>
       <w:rPr>
         <w:b/>
+        <w:sz w:val="20"/>
+        <w:szCs w:val="16"/>
       </w:rPr>
       <w:tab/>
     </w:r>
     <w:r>
       <w:rPr>
-        <w:szCs w:val="24"/>
+        <w:sz w:val="20"/>
       </w:rPr>
       <w:fldChar w:fldCharType="begin"/>
     </w:r>
     <w:r>
       <w:rPr>
-        <w:szCs w:val="24"/>
+        <w:sz w:val="20"/>
       </w:rPr>
       <w:instrText xml:space="preserve"> PAGE   \* MERGEFORMAT </w:instrText>
     </w:r>
     <w:r>
       <w:rPr>
-        <w:szCs w:val="24"/>
+        <w:sz w:val="20"/>
       </w:rPr>
       <w:fldChar w:fldCharType="separate"/>
     </w:r>
     <w:r>
       <w:rPr>
-        <w:noProof/>
-        <w:szCs w:val="24"/>
+        <w:sz w:val="20"/>
       </w:rPr>
       <w:t>2</w:t>
     </w:r>
     <w:r>
       <w:rPr>
-        <w:szCs w:val="24"/>
+        <w:sz w:val="20"/>
       </w:rPr>
       <w:fldChar w:fldCharType="end"/>
     </w:r>
@@ -1927,144 +1988,7 @@
 <w:hdr xmlns:wpc="http://schemas.microsoft.com/office/word/2010/wordprocessingCanvas" xmlns:cx="http://schemas.microsoft.com/office/drawing/2014/chartex" xmlns:cx1="http://schemas.microsoft.com/office/drawing/2015/9/8/chartex" xmlns:cx2="http://schemas.microsoft.com/office/drawing/2015/10/21/chartex" xmlns:cx3="http://schemas.microsoft.com/office/drawing/2016/5/9/chartex" xmlns:cx4="http://schemas.microsoft.com/office/drawing/2016/5/10/chartex" xmlns:cx5="http://schemas.microsoft.com/office/drawing/2016/5/11/chartex" xmlns:cx6="http://schemas.microsoft.com/office/drawing/2016/5/12/chartex" xmlns:cx7="http://schemas.microsoft.com/office/drawing/2016/5/13/chartex" xmlns:cx8="http://schemas.microsoft.com/office/drawing/2016/5/14/chartex" xmlns:mc="http://schemas.openxmlformats.org/markup-compatibility/2006" xmlns:aink="http://schemas.microsoft.com/office/drawing/2016/ink" xmlns:am3d="http://schemas.microsoft.com/office/drawing/2017/model3d" xmlns:o="urn:schemas-microsoft-com:office:office" xmlns:oel="http://schemas.microsoft.com/office/2019/extlst" xmlns:r="http://schemas.openxmlformats.org/officeDocument/2006/relationships" xmlns:m="http://schemas.openxmlformats.org/officeDocument/2006/math" xmlns:v="urn:schemas-microsoft-com:vml" xmlns:wp14="http://schemas.microsoft.com/office/word/2010/wordprocessingDrawing" xmlns:wp="http://schemas.openxmlformats.org/drawingml/2006/wordprocessingDrawing" xmlns:w10="urn:schemas-microsoft-com:office:word" xmlns:w="http://schemas.openxmlformats.org/wordprocessingml/2006/main" xmlns:w14="http://schemas.microsoft.com/office/word/2010/wordml" xmlns:w15="http://schemas.microsoft.com/office/word/2012/wordml" xmlns:w16cex="http://schemas.microsoft.com/office/word/2018/wordml/cex" xmlns:w16cid="http://schemas.microsoft.com/office/word/2016/wordml/cid" xmlns:w16="http://schemas.microsoft.com/office/word/2018/wordml" xmlns:w16sdtdh="http://schemas.microsoft.com/office/word/2020/wordml/sdtdatahash" xmlns:w16se="http://schemas.microsoft.com/office/word/2015/wordml/symex" xmlns:wpg="http://schemas.microsoft.com/office/word/2010/wordprocessingGroup" xmlns:wpi="http://schemas.microsoft.com/office/word/2010/wordprocessingInk" xmlns:wne="http://schemas.microsoft.com/office/word/2006/wordml" xmlns:wps="http://schemas.microsoft.com/office/word/2010/wordprocessingShape" mc:Ignorable="w14 w15 w16se w16cid w16 w16cex w16sdtdh wp14">
   <w:p>
     <w:pPr>
-      <w:pBdr>
-        <w:bottom w:val="single" w:sz="4" w:space="1" w:color="auto"/>
-      </w:pBdr>
-      <w:tabs>
-        <w:tab w:val="right" w:pos="10206"/>
-      </w:tabs>
-      <w:spacing w:before="240"/>
-      <w:jc w:val="both"/>
-      <w:rPr>
-        <w:rStyle w:val="afff1"/>
-        <w:lang w:val="en-US"/>
-      </w:rPr>
-    </w:pPr>
-    <w:proofErr w:type="gramStart"/>
-    <w:r>
-      <w:rPr>
-        <w:rStyle w:val="afff1"/>
-        <w:lang w:val="en-US"/>
-      </w:rPr>
-      <w:t>{</w:t>
-    </w:r>
-    <w:r>
-      <w:rPr>
-        <w:rStyle w:val="afff1"/>
-        <w:lang w:val="en-US"/>
-      </w:rPr>
-      <w:t>{</w:t>
-    </w:r>
-    <w:r>
-      <w:rPr>
-        <w:rStyle w:val="afff1"/>
-        <w:lang w:val="en-US"/>
-      </w:rPr>
-      <w:t xml:space="preserve"> code</w:t>
-    </w:r>
-    <w:proofErr w:type="gramEnd"/>
-    <w:r>
-      <w:rPr>
-        <w:rStyle w:val="afff1"/>
-        <w:lang w:val="en-US"/>
-      </w:rPr>
-      <w:t xml:space="preserve"> }}</w:t>
-    </w:r>
-    <w:r>
-      <w:rPr>
-        <w:rStyle w:val="afff1"/>
-        <w:lang w:val="en-US"/>
-      </w:rPr>
-      <w:t xml:space="preserve"> {</w:t>
-    </w:r>
-    <w:r>
-      <w:rPr>
-        <w:rStyle w:val="afff1"/>
-        <w:lang w:val="en-US"/>
-      </w:rPr>
-      <w:t xml:space="preserve">{ </w:t>
-    </w:r>
-    <w:proofErr w:type="spellStart"/>
-    <w:r>
-      <w:rPr>
-        <w:rStyle w:val="afff1"/>
-        <w:lang w:val="en-US"/>
-      </w:rPr>
-      <w:t>colontile</w:t>
-    </w:r>
-    <w:proofErr w:type="spellEnd"/>
-    <w:r>
-      <w:rPr>
-        <w:rStyle w:val="afff1"/>
-        <w:lang w:val="en-US"/>
-      </w:rPr>
-      <w:t xml:space="preserve"> </w:t>
-    </w:r>
-    <w:r>
-      <w:rPr>
-        <w:rStyle w:val="afff1"/>
-        <w:lang w:val="en-US"/>
-      </w:rPr>
-      <w:t>}}</w:t>
-    </w:r>
-    <w:r>
-      <w:rPr>
-        <w:rStyle w:val="afff1"/>
-        <w:lang w:val="en-US"/>
-      </w:rPr>
-      <w:tab/>
-    </w:r>
-    <w:r>
-      <w:rPr>
-        <w:rStyle w:val="afff1"/>
-        <w:lang w:val="en-US"/>
-      </w:rPr>
-      <w:t>{</w:t>
-    </w:r>
-    <w:r>
-      <w:rPr>
-        <w:rStyle w:val="afff1"/>
-        <w:lang w:val="en-US"/>
-      </w:rPr>
-      <w:t>{</w:t>
-    </w:r>
-    <w:r>
-      <w:rPr>
-        <w:rStyle w:val="afff1"/>
-        <w:lang w:val="en-US"/>
-      </w:rPr>
-      <w:t xml:space="preserve"> </w:t>
-    </w:r>
-    <w:proofErr w:type="spellStart"/>
-    <w:r>
-      <w:rPr>
-        <w:rStyle w:val="afff1"/>
-        <w:lang w:val="en-US"/>
-      </w:rPr>
-      <w:t>device_</w:t>
-    </w:r>
-    <w:r>
-      <w:rPr>
-        <w:rStyle w:val="afff1"/>
-        <w:lang w:val="en-US"/>
-      </w:rPr>
-      <w:t>name</w:t>
-    </w:r>
-    <w:proofErr w:type="spellEnd"/>
-    <w:r>
-      <w:rPr>
-        <w:rStyle w:val="afff1"/>
-        <w:lang w:val="en-US"/>
-      </w:rPr>
-      <w:t xml:space="preserve"> }}</w:t>
-    </w:r>
-  </w:p>
-  <w:p>
-    <w:pPr>
-      <w:pStyle w:val="af7"/>
-      <w:rPr>
-        <w:lang w:val="en-US"/>
-      </w:rPr>
+      <w:pStyle w:val="afff4"/>
     </w:pPr>
   </w:p>
 </w:hdr>
@@ -2074,125 +1998,165 @@
 <w:hdr xmlns:wpc="http://schemas.microsoft.com/office/word/2010/wordprocessingCanvas" xmlns:cx="http://schemas.microsoft.com/office/drawing/2014/chartex" xmlns:cx1="http://schemas.microsoft.com/office/drawing/2015/9/8/chartex" xmlns:cx2="http://schemas.microsoft.com/office/drawing/2015/10/21/chartex" xmlns:cx3="http://schemas.microsoft.com/office/drawing/2016/5/9/chartex" xmlns:cx4="http://schemas.microsoft.com/office/drawing/2016/5/10/chartex" xmlns:cx5="http://schemas.microsoft.com/office/drawing/2016/5/11/chartex" xmlns:cx6="http://schemas.microsoft.com/office/drawing/2016/5/12/chartex" xmlns:cx7="http://schemas.microsoft.com/office/drawing/2016/5/13/chartex" xmlns:cx8="http://schemas.microsoft.com/office/drawing/2016/5/14/chartex" xmlns:mc="http://schemas.openxmlformats.org/markup-compatibility/2006" xmlns:aink="http://schemas.microsoft.com/office/drawing/2016/ink" xmlns:am3d="http://schemas.microsoft.com/office/drawing/2017/model3d" xmlns:o="urn:schemas-microsoft-com:office:office" xmlns:oel="http://schemas.microsoft.com/office/2019/extlst" xmlns:r="http://schemas.openxmlformats.org/officeDocument/2006/relationships" xmlns:m="http://schemas.openxmlformats.org/officeDocument/2006/math" xmlns:v="urn:schemas-microsoft-com:vml" xmlns:wp14="http://schemas.microsoft.com/office/word/2010/wordprocessingDrawing" xmlns:wp="http://schemas.openxmlformats.org/drawingml/2006/wordprocessingDrawing" xmlns:w10="urn:schemas-microsoft-com:office:word" xmlns:w="http://schemas.openxmlformats.org/wordprocessingml/2006/main" xmlns:w14="http://schemas.microsoft.com/office/word/2010/wordml" xmlns:w15="http://schemas.microsoft.com/office/word/2012/wordml" xmlns:w16cex="http://schemas.microsoft.com/office/word/2018/wordml/cex" xmlns:w16cid="http://schemas.microsoft.com/office/word/2016/wordml/cid" xmlns:w16="http://schemas.microsoft.com/office/word/2018/wordml" xmlns:w16sdtdh="http://schemas.microsoft.com/office/word/2020/wordml/sdtdatahash" xmlns:w16se="http://schemas.microsoft.com/office/word/2015/wordml/symex" xmlns:wpg="http://schemas.microsoft.com/office/word/2010/wordprocessingGroup" xmlns:wpi="http://schemas.microsoft.com/office/word/2010/wordprocessingInk" xmlns:wne="http://schemas.microsoft.com/office/word/2006/wordml" xmlns:wps="http://schemas.microsoft.com/office/word/2010/wordprocessingShape" mc:Ignorable="w14 w15 w16se w16cid w16 w16cex w16sdtdh wp14">
   <w:p>
     <w:pPr>
-      <w:pStyle w:val="afff3"/>
-    </w:pPr>
+      <w:pStyle w:val="afff4"/>
+      <w:pBdr>
+        <w:bottom w:val="single" w:sz="12" w:space="1" w:color="365F91" w:themeColor="accent1" w:themeShade="BF"/>
+      </w:pBdr>
+      <w:ind w:right="-1"/>
+      <w:jc w:val="right"/>
+      <w:rPr>
+        <w:rStyle w:val="afff2"/>
+        <w:bCs w:val="0"/>
+        <w:sz w:val="20"/>
+        <w:szCs w:val="16"/>
+      </w:rPr>
+    </w:pPr>
+    <w:proofErr w:type="gramStart"/>
     <w:r>
       <w:rPr>
-        <w:noProof/>
-        <w:lang w:val="en-US" w:eastAsia="en-US"/>
-      </w:rPr>
-      <mc:AlternateContent>
-        <mc:Choice Requires="wps">
-          <w:drawing>
-            <wp:anchor distT="0" distB="0" distL="114300" distR="114300" simplePos="0" relativeHeight="251658240" behindDoc="1" locked="0" layoutInCell="1" allowOverlap="1" wp14:anchorId="33AFDE50" wp14:editId="313B6C67">
-              <wp:simplePos x="0" y="0"/>
-              <wp:positionH relativeFrom="column">
-                <wp:posOffset>-230505</wp:posOffset>
-              </wp:positionH>
-              <wp:positionV relativeFrom="paragraph">
-                <wp:posOffset>1087755</wp:posOffset>
-              </wp:positionV>
-              <wp:extent cx="6541770" cy="635"/>
-              <wp:effectExtent l="38100" t="38100" r="68580" b="94615"/>
-              <wp:wrapNone/>
-              <wp:docPr id="1" name="AutoShape 4"/>
-              <wp:cNvGraphicFramePr>
-                <a:graphicFrameLocks xmlns:a="http://schemas.openxmlformats.org/drawingml/2006/main"/>
-              </wp:cNvGraphicFramePr>
-              <a:graphic xmlns:a="http://schemas.openxmlformats.org/drawingml/2006/main">
-                <a:graphicData uri="http://schemas.microsoft.com/office/word/2010/wordprocessingShape">
-                  <wps:wsp>
-                    <wps:cNvCnPr>
-                      <a:cxnSpLocks noChangeShapeType="1"/>
-                    </wps:cNvCnPr>
-                    <wps:spPr bwMode="auto">
-                      <a:xfrm>
-                        <a:off x="0" y="0"/>
-                        <a:ext cx="6541770" cy="635"/>
-                      </a:xfrm>
-                      <a:prstGeom prst="straightConnector1">
-                        <a:avLst/>
-                      </a:prstGeom>
-                      <a:ln>
-                        <a:solidFill>
-                          <a:srgbClr val="F7941D"/>
-                        </a:solidFill>
-                        <a:headEnd/>
-                        <a:tailEnd/>
-                      </a:ln>
-                      <a:effectLst>
-                        <a:glow>
-                          <a:srgbClr val="00CB62">
-                            <a:alpha val="89000"/>
-                          </a:srgbClr>
-                        </a:glow>
-                        <a:outerShdw blurRad="40000" dist="20000" dir="5400000" rotWithShape="0">
-                          <a:srgbClr val="000000">
-                            <a:alpha val="38000"/>
-                          </a:srgbClr>
-                        </a:outerShdw>
-                      </a:effectLst>
-                    </wps:spPr>
-                    <wps:style>
-                      <a:lnRef idx="2">
-                        <a:schemeClr val="accent3"/>
-                      </a:lnRef>
-                      <a:fillRef idx="0">
-                        <a:schemeClr val="accent3"/>
-                      </a:fillRef>
-                      <a:effectRef idx="1">
-                        <a:schemeClr val="accent3"/>
-                      </a:effectRef>
-                      <a:fontRef idx="minor">
-                        <a:schemeClr val="tx1"/>
-                      </a:fontRef>
-                    </wps:style>
-                    <wps:bodyPr/>
-                  </wps:wsp>
-                </a:graphicData>
-              </a:graphic>
-              <wp14:sizeRelH relativeFrom="page">
-                <wp14:pctWidth>0</wp14:pctWidth>
-              </wp14:sizeRelH>
-              <wp14:sizeRelV relativeFrom="page">
-                <wp14:pctHeight>0</wp14:pctHeight>
-              </wp14:sizeRelV>
-            </wp:anchor>
-          </w:drawing>
-        </mc:Choice>
-        <mc:Fallback>
-          <w:pict>
-            <v:shapetype w14:anchorId="16B0ACB2" id="_x0000_t32" coordsize="21600,21600" o:spt="32" o:oned="t" path="m,l21600,21600e" filled="f">
-              <v:path arrowok="t" fillok="f" o:connecttype="none"/>
-              <o:lock v:ext="edit" shapetype="t"/>
-            </v:shapetype>
-            <v:shape id="AutoShape 4" o:spid="_x0000_s1026" type="#_x0000_t32" style="position:absolute;margin-left:-18.15pt;margin-top:85.65pt;width:515.1pt;height:.05pt;z-index:-251658240;visibility:visible;mso-wrap-style:square;mso-width-percent:0;mso-height-percent:0;mso-wrap-distance-left:9pt;mso-wrap-distance-top:0;mso-wrap-distance-right:9pt;mso-wrap-distance-bottom:0;mso-position-horizontal:absolute;mso-position-horizontal-relative:text;mso-position-vertical:absolute;mso-position-vertical-relative:text;mso-width-percent:0;mso-height-percent:0;mso-width-relative:page;mso-height-relative:page" o:gfxdata="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" strokecolor="#f7941d" strokeweight="2pt">
-              <v:shadow on="t" color="black" opacity="24903f" origin=",.5" offset="0,.55556mm"/>
-            </v:shape>
-          </w:pict>
-        </mc:Fallback>
-      </mc:AlternateContent>
+        <w:rStyle w:val="afff2"/>
+        <w:bCs w:val="0"/>
+        <w:sz w:val="20"/>
+        <w:szCs w:val="16"/>
+      </w:rPr>
+      <w:t xml:space="preserve">{{ </w:t>
+    </w:r>
+    <w:proofErr w:type="spellStart"/>
+    <w:r>
+      <w:rPr>
+        <w:rStyle w:val="afff2"/>
+        <w:bCs w:val="0"/>
+        <w:sz w:val="20"/>
+        <w:szCs w:val="16"/>
+      </w:rPr>
+      <w:t>code</w:t>
+    </w:r>
+    <w:proofErr w:type="spellEnd"/>
+    <w:proofErr w:type="gramEnd"/>
+    <w:r>
+      <w:rPr>
+        <w:rStyle w:val="afff2"/>
+        <w:bCs w:val="0"/>
+        <w:sz w:val="20"/>
+        <w:szCs w:val="16"/>
+      </w:rPr>
+      <w:t xml:space="preserve"> }}</w:t>
+    </w:r>
+    <w:r>
+      <w:rPr>
+        <w:rStyle w:val="afff2"/>
+        <w:bCs w:val="0"/>
+        <w:sz w:val="20"/>
+        <w:szCs w:val="16"/>
+      </w:rPr>
+      <w:ptab w:relativeTo="margin" w:alignment="center" w:leader="none"/>
+    </w:r>
+    <w:r>
+      <w:rPr>
+        <w:rStyle w:val="afff2"/>
+        <w:bCs w:val="0"/>
+        <w:color w:val="A6A6A6" w:themeColor="background1" w:themeShade="A6"/>
+        <w:sz w:val="20"/>
+        <w:szCs w:val="16"/>
+      </w:rPr>
+      <w:t xml:space="preserve">{{ </w:t>
+    </w:r>
+    <w:proofErr w:type="spellStart"/>
+    <w:r>
+      <w:rPr>
+        <w:rStyle w:val="afff2"/>
+        <w:bCs w:val="0"/>
+        <w:color w:val="A6A6A6" w:themeColor="background1" w:themeShade="A6"/>
+        <w:sz w:val="20"/>
+        <w:szCs w:val="16"/>
+      </w:rPr>
+      <w:t>colontile</w:t>
+    </w:r>
+    <w:proofErr w:type="spellEnd"/>
+    <w:r>
+      <w:rPr>
+        <w:rStyle w:val="afff2"/>
+        <w:bCs w:val="0"/>
+        <w:color w:val="A6A6A6" w:themeColor="background1" w:themeShade="A6"/>
+        <w:sz w:val="20"/>
+        <w:szCs w:val="16"/>
+      </w:rPr>
+      <w:t>}}</w:t>
+    </w:r>
+    <w:r>
+      <w:rPr>
+        <w:rStyle w:val="afff2"/>
+        <w:bCs w:val="0"/>
+        <w:sz w:val="20"/>
+        <w:szCs w:val="16"/>
+      </w:rPr>
+      <w:ptab w:relativeTo="margin" w:alignment="right" w:leader="none"/>
+    </w:r>
+    <w:r>
+      <w:rPr>
+        <w:rStyle w:val="afff2"/>
+        <w:bCs w:val="0"/>
+        <w:sz w:val="20"/>
+        <w:szCs w:val="16"/>
+      </w:rPr>
+      <w:t xml:space="preserve">{{ </w:t>
+    </w:r>
+    <w:proofErr w:type="spellStart"/>
+    <w:r>
+      <w:rPr>
+        <w:rStyle w:val="afff2"/>
+        <w:bCs w:val="0"/>
+        <w:sz w:val="20"/>
+        <w:szCs w:val="16"/>
+      </w:rPr>
+      <w:t>device_name</w:t>
+    </w:r>
+    <w:proofErr w:type="spellEnd"/>
+    <w:r>
+      <w:rPr>
+        <w:rStyle w:val="afff2"/>
+        <w:bCs w:val="0"/>
+        <w:sz w:val="20"/>
+        <w:szCs w:val="16"/>
+      </w:rPr>
+      <w:t xml:space="preserve"> }}</w:t>
     </w:r>
   </w:p>
+</w:hdr>
+</file>
+
+<file path=word/header3.xml><?xml version="1.0" encoding="utf-8"?>
+<w:hdr xmlns:wpc="http://schemas.microsoft.com/office/word/2010/wordprocessingCanvas" xmlns:cx="http://schemas.microsoft.com/office/drawing/2014/chartex" xmlns:cx1="http://schemas.microsoft.com/office/drawing/2015/9/8/chartex" xmlns:cx2="http://schemas.microsoft.com/office/drawing/2015/10/21/chartex" xmlns:cx3="http://schemas.microsoft.com/office/drawing/2016/5/9/chartex" xmlns:cx4="http://schemas.microsoft.com/office/drawing/2016/5/10/chartex" xmlns:cx5="http://schemas.microsoft.com/office/drawing/2016/5/11/chartex" xmlns:cx6="http://schemas.microsoft.com/office/drawing/2016/5/12/chartex" xmlns:cx7="http://schemas.microsoft.com/office/drawing/2016/5/13/chartex" xmlns:cx8="http://schemas.microsoft.com/office/drawing/2016/5/14/chartex" xmlns:mc="http://schemas.openxmlformats.org/markup-compatibility/2006" xmlns:aink="http://schemas.microsoft.com/office/drawing/2016/ink" xmlns:am3d="http://schemas.microsoft.com/office/drawing/2017/model3d" xmlns:o="urn:schemas-microsoft-com:office:office" xmlns:oel="http://schemas.microsoft.com/office/2019/extlst" xmlns:r="http://schemas.openxmlformats.org/officeDocument/2006/relationships" xmlns:m="http://schemas.openxmlformats.org/officeDocument/2006/math" xmlns:v="urn:schemas-microsoft-com:vml" xmlns:wp14="http://schemas.microsoft.com/office/word/2010/wordprocessingDrawing" xmlns:wp="http://schemas.openxmlformats.org/drawingml/2006/wordprocessingDrawing" xmlns:w10="urn:schemas-microsoft-com:office:word" xmlns:w="http://schemas.openxmlformats.org/wordprocessingml/2006/main" xmlns:w14="http://schemas.microsoft.com/office/word/2010/wordml" xmlns:w15="http://schemas.microsoft.com/office/word/2012/wordml" xmlns:w16cex="http://schemas.microsoft.com/office/word/2018/wordml/cex" xmlns:w16cid="http://schemas.microsoft.com/office/word/2016/wordml/cid" xmlns:w16="http://schemas.microsoft.com/office/word/2018/wordml" xmlns:w16sdtdh="http://schemas.microsoft.com/office/word/2020/wordml/sdtdatahash" xmlns:w16se="http://schemas.microsoft.com/office/word/2015/wordml/symex" xmlns:wpg="http://schemas.microsoft.com/office/word/2010/wordprocessingGroup" xmlns:wpi="http://schemas.microsoft.com/office/word/2010/wordprocessingInk" xmlns:wne="http://schemas.microsoft.com/office/word/2006/wordml" xmlns:wps="http://schemas.microsoft.com/office/word/2010/wordprocessingShape" mc:Ignorable="w14 w15 w16se w16cid w16 w16cex w16sdtdh wp14">
   <w:p>
     <w:pPr>
-      <w:pStyle w:val="afff3"/>
+      <w:pStyle w:val="afff4"/>
+      <w:rPr>
+        <w:lang w:val="en-US"/>
+      </w:rPr>
+    </w:pPr>
+  </w:p>
+  <w:p>
+    <w:pPr>
+      <w:pStyle w:val="afff4"/>
       <w:tabs>
         <w:tab w:val="clear" w:pos="4677"/>
         <w:tab w:val="clear" w:pos="9355"/>
         <w:tab w:val="center" w:pos="1937"/>
       </w:tabs>
       <w:jc w:val="right"/>
+      <w:rPr>
+        <w:lang w:val="en-US"/>
+      </w:rPr>
     </w:pPr>
     <w:r>
       <w:rPr>
         <w:noProof/>
       </w:rPr>
       <w:drawing>
-        <wp:inline distT="0" distB="0" distL="0" distR="0" wp14:anchorId="3610F360" wp14:editId="435574BA">
-          <wp:extent cx="2468880" cy="503555"/>
-          <wp:effectExtent l="0" t="0" r="7620" b="0"/>
-          <wp:docPr id="46" name="Рисунок 46" descr="C:\Users\a.malashenko\Downloads\Logo_01.jpg"/>
+        <wp:inline distT="0" distB="0" distL="0" distR="0" wp14:anchorId="2C1CEA65" wp14:editId="4D801B47">
+          <wp:extent cx="2728595" cy="554134"/>
+          <wp:effectExtent l="0" t="0" r="0" b="0"/>
+          <wp:docPr id="1" name="Рисунок 1"/>
           <wp:cNvGraphicFramePr>
             <a:graphicFrameLocks xmlns:a="http://schemas.openxmlformats.org/drawingml/2006/main" noChangeAspect="1"/>
           </wp:cNvGraphicFramePr>
@@ -2200,36 +2164,29 @@
             <a:graphicData uri="http://schemas.openxmlformats.org/drawingml/2006/picture">
               <pic:pic xmlns:pic="http://schemas.openxmlformats.org/drawingml/2006/picture">
                 <pic:nvPicPr>
-                  <pic:cNvPr id="46" name="Рисунок 46" descr="C:\Users\a.malashenko\Downloads\Logo_01.jpg"/>
-                  <pic:cNvPicPr>
-                    <a:picLocks noChangeAspect="1"/>
-                  </pic:cNvPicPr>
+                  <pic:cNvPr id="2" name="Рисунок 2"/>
+                  <pic:cNvPicPr/>
                 </pic:nvPicPr>
                 <pic:blipFill>
-                  <a:blip r:embed="rId1" cstate="print">
+                  <a:blip r:embed="rId1">
                     <a:extLst>
-                      <a:ext uri="{28A0092B-C50C-407E-A947-70E740481C1C}">
-                        <a14:useLocalDpi xmlns:a14="http://schemas.microsoft.com/office/drawing/2010/main" val="0"/>
+                      <a:ext uri="{96DAC541-7B7A-43D3-8B79-37D633B846F1}">
+                        <asvg:svgBlip xmlns:asvg="http://schemas.microsoft.com/office/drawing/2016/SVG/main" r:embed="rId2"/>
                       </a:ext>
                     </a:extLst>
                   </a:blip>
-                  <a:srcRect/>
                   <a:stretch>
                     <a:fillRect/>
                   </a:stretch>
                 </pic:blipFill>
-                <pic:spPr bwMode="auto">
+                <pic:spPr>
                   <a:xfrm>
                     <a:off x="0" y="0"/>
-                    <a:ext cx="2468880" cy="503555"/>
+                    <a:ext cx="3083994" cy="626310"/>
                   </a:xfrm>
                   <a:prstGeom prst="rect">
                     <a:avLst/>
                   </a:prstGeom>
-                  <a:noFill/>
-                  <a:ln>
-                    <a:noFill/>
-                  </a:ln>
                 </pic:spPr>
               </pic:pic>
             </a:graphicData>
@@ -2238,141 +2195,277 @@
       </w:drawing>
     </w:r>
   </w:p>
+  <w:p>
+    <w:pPr>
+      <w:pStyle w:val="afff4"/>
+      <w:pBdr>
+        <w:bottom w:val="single" w:sz="12" w:space="1" w:color="365F91" w:themeColor="accent1" w:themeShade="BF"/>
+      </w:pBdr>
+      <w:tabs>
+        <w:tab w:val="clear" w:pos="4677"/>
+        <w:tab w:val="clear" w:pos="9355"/>
+        <w:tab w:val="center" w:pos="1937"/>
+      </w:tabs>
+    </w:pPr>
+  </w:p>
 </w:hdr>
 </file>
 
-<file path=word/header3.xml><?xml version="1.0" encoding="utf-8"?>
+<file path=word/header4.xml><?xml version="1.0" encoding="utf-8"?>
 <w:hdr xmlns:wpc="http://schemas.microsoft.com/office/word/2010/wordprocessingCanvas" xmlns:cx="http://schemas.microsoft.com/office/drawing/2014/chartex" xmlns:cx1="http://schemas.microsoft.com/office/drawing/2015/9/8/chartex" xmlns:cx2="http://schemas.microsoft.com/office/drawing/2015/10/21/chartex" xmlns:cx3="http://schemas.microsoft.com/office/drawing/2016/5/9/chartex" xmlns:cx4="http://schemas.microsoft.com/office/drawing/2016/5/10/chartex" xmlns:cx5="http://schemas.microsoft.com/office/drawing/2016/5/11/chartex" xmlns:cx6="http://schemas.microsoft.com/office/drawing/2016/5/12/chartex" xmlns:cx7="http://schemas.microsoft.com/office/drawing/2016/5/13/chartex" xmlns:cx8="http://schemas.microsoft.com/office/drawing/2016/5/14/chartex" xmlns:mc="http://schemas.openxmlformats.org/markup-compatibility/2006" xmlns:aink="http://schemas.microsoft.com/office/drawing/2016/ink" xmlns:am3d="http://schemas.microsoft.com/office/drawing/2017/model3d" xmlns:o="urn:schemas-microsoft-com:office:office" xmlns:oel="http://schemas.microsoft.com/office/2019/extlst" xmlns:r="http://schemas.openxmlformats.org/officeDocument/2006/relationships" xmlns:m="http://schemas.openxmlformats.org/officeDocument/2006/math" xmlns:v="urn:schemas-microsoft-com:vml" xmlns:wp14="http://schemas.microsoft.com/office/word/2010/wordprocessingDrawing" xmlns:wp="http://schemas.openxmlformats.org/drawingml/2006/wordprocessingDrawing" xmlns:w10="urn:schemas-microsoft-com:office:word" xmlns:w="http://schemas.openxmlformats.org/wordprocessingml/2006/main" xmlns:w14="http://schemas.microsoft.com/office/word/2010/wordml" xmlns:w15="http://schemas.microsoft.com/office/word/2012/wordml" xmlns:w16cex="http://schemas.microsoft.com/office/word/2018/wordml/cex" xmlns:w16cid="http://schemas.microsoft.com/office/word/2016/wordml/cid" xmlns:w16="http://schemas.microsoft.com/office/word/2018/wordml" xmlns:w16sdtdh="http://schemas.microsoft.com/office/word/2020/wordml/sdtdatahash" xmlns:w16se="http://schemas.microsoft.com/office/word/2015/wordml/symex" xmlns:wpg="http://schemas.microsoft.com/office/word/2010/wordprocessingGroup" xmlns:wpi="http://schemas.microsoft.com/office/word/2010/wordprocessingInk" xmlns:wne="http://schemas.microsoft.com/office/word/2006/wordml" xmlns:wps="http://schemas.microsoft.com/office/word/2010/wordprocessingShape" mc:Ignorable="w14 w15 w16se w16cid w16 w16cex w16sdtdh wp14">
   <w:p>
     <w:pPr>
+      <w:pStyle w:val="afff4"/>
       <w:pBdr>
-        <w:bottom w:val="single" w:sz="4" w:space="1" w:color="auto"/>
+        <w:bottom w:val="single" w:sz="12" w:space="1" w:color="365F91" w:themeColor="accent1" w:themeShade="BF"/>
       </w:pBdr>
-      <w:tabs>
-        <w:tab w:val="right" w:pos="10206"/>
-      </w:tabs>
-      <w:spacing w:before="240"/>
-      <w:jc w:val="both"/>
-      <w:rPr>
-        <w:rStyle w:val="afff1"/>
-        <w:lang w:val="en-US"/>
+      <w:ind w:right="-1"/>
+      <w:jc w:val="right"/>
+      <w:rPr>
+        <w:rStyle w:val="afff2"/>
+        <w:bCs w:val="0"/>
+        <w:sz w:val="20"/>
+        <w:szCs w:val="16"/>
       </w:rPr>
     </w:pPr>
     <w:proofErr w:type="gramStart"/>
     <w:r>
       <w:rPr>
-        <w:rStyle w:val="afff1"/>
-        <w:lang w:val="en-US"/>
-      </w:rPr>
-      <w:t>{</w:t>
-    </w:r>
-    <w:r>
-      <w:rPr>
-        <w:rStyle w:val="afff1"/>
-        <w:lang w:val="en-US"/>
-      </w:rPr>
-      <w:t>{</w:t>
-    </w:r>
-    <w:r>
-      <w:rPr>
-        <w:rStyle w:val="afff1"/>
-        <w:lang w:val="en-US"/>
-      </w:rPr>
-      <w:t xml:space="preserve"> code</w:t>
-    </w:r>
-    <w:proofErr w:type="gramEnd"/>
-    <w:r>
-      <w:rPr>
-        <w:rStyle w:val="afff1"/>
-        <w:lang w:val="en-US"/>
-      </w:rPr>
-      <w:t xml:space="preserve"> </w:t>
-    </w:r>
-    <w:r>
-      <w:rPr>
-        <w:rStyle w:val="afff1"/>
-        <w:lang w:val="en-US"/>
-      </w:rPr>
-      <w:t>}}</w:t>
-    </w:r>
-    <w:r>
-      <w:rPr>
-        <w:rStyle w:val="afff1"/>
-        <w:lang w:val="en-US"/>
-      </w:rPr>
-      <w:t xml:space="preserve"> {</w:t>
-    </w:r>
-    <w:r>
-      <w:rPr>
-        <w:rStyle w:val="afff1"/>
-        <w:lang w:val="en-US"/>
-      </w:rPr>
-      <w:t xml:space="preserve">{ </w:t>
+        <w:rStyle w:val="afff2"/>
+        <w:bCs w:val="0"/>
+        <w:sz w:val="20"/>
+        <w:szCs w:val="16"/>
+      </w:rPr>
+      <w:t xml:space="preserve">{{ </w:t>
     </w:r>
     <w:proofErr w:type="spellStart"/>
     <w:r>
       <w:rPr>
-        <w:rStyle w:val="afff1"/>
-        <w:lang w:val="en-US"/>
+        <w:rStyle w:val="afff2"/>
+        <w:bCs w:val="0"/>
+        <w:sz w:val="20"/>
+        <w:szCs w:val="16"/>
+      </w:rPr>
+      <w:t>code</w:t>
+    </w:r>
+    <w:proofErr w:type="spellEnd"/>
+    <w:proofErr w:type="gramEnd"/>
+    <w:r>
+      <w:rPr>
+        <w:rStyle w:val="afff2"/>
+        <w:bCs w:val="0"/>
+        <w:sz w:val="20"/>
+        <w:szCs w:val="16"/>
+      </w:rPr>
+      <w:t xml:space="preserve"> }}</w:t>
+    </w:r>
+    <w:r>
+      <w:rPr>
+        <w:rStyle w:val="afff2"/>
+        <w:bCs w:val="0"/>
+        <w:sz w:val="20"/>
+        <w:szCs w:val="16"/>
+      </w:rPr>
+      <w:ptab w:relativeTo="margin" w:alignment="center" w:leader="none"/>
+    </w:r>
+    <w:r>
+      <w:rPr>
+        <w:rStyle w:val="afff2"/>
+        <w:bCs w:val="0"/>
+        <w:color w:val="A6A6A6" w:themeColor="background1" w:themeShade="A6"/>
+        <w:sz w:val="20"/>
+        <w:szCs w:val="16"/>
+      </w:rPr>
+      <w:t xml:space="preserve">{{ </w:t>
+    </w:r>
+    <w:proofErr w:type="spellStart"/>
+    <w:r>
+      <w:rPr>
+        <w:rStyle w:val="afff2"/>
+        <w:bCs w:val="0"/>
+        <w:color w:val="A6A6A6" w:themeColor="background1" w:themeShade="A6"/>
+        <w:sz w:val="20"/>
+        <w:szCs w:val="16"/>
       </w:rPr>
       <w:t>colontile</w:t>
     </w:r>
     <w:proofErr w:type="spellEnd"/>
     <w:r>
       <w:rPr>
-        <w:rStyle w:val="afff1"/>
-        <w:lang w:val="en-US"/>
+        <w:rStyle w:val="afff2"/>
+        <w:bCs w:val="0"/>
+        <w:color w:val="A6A6A6" w:themeColor="background1" w:themeShade="A6"/>
+        <w:sz w:val="20"/>
+        <w:szCs w:val="16"/>
       </w:rPr>
       <w:t>}}</w:t>
     </w:r>
     <w:r>
       <w:rPr>
-        <w:rStyle w:val="afff1"/>
-        <w:lang w:val="en-US"/>
-      </w:rPr>
-      <w:tab/>
+        <w:rStyle w:val="afff2"/>
+        <w:bCs w:val="0"/>
+        <w:sz w:val="20"/>
+        <w:szCs w:val="16"/>
+      </w:rPr>
+      <w:ptab w:relativeTo="margin" w:alignment="right" w:leader="none"/>
     </w:r>
     <w:r>
       <w:rPr>
-        <w:rStyle w:val="afff1"/>
-        <w:lang w:val="en-US"/>
-      </w:rPr>
-      <w:t>{</w:t>
-    </w:r>
-    <w:r>
-      <w:rPr>
-        <w:rStyle w:val="afff1"/>
-        <w:lang w:val="en-US"/>
-      </w:rPr>
-      <w:t>{</w:t>
-    </w:r>
-    <w:r>
-      <w:rPr>
-        <w:rStyle w:val="afff1"/>
-        <w:lang w:val="en-US"/>
-      </w:rPr>
-      <w:t xml:space="preserve"> </w:t>
+        <w:rStyle w:val="afff2"/>
+        <w:bCs w:val="0"/>
+        <w:sz w:val="20"/>
+        <w:szCs w:val="16"/>
+      </w:rPr>
+      <w:t xml:space="preserve">{{ </w:t>
     </w:r>
     <w:proofErr w:type="spellStart"/>
     <w:r>
       <w:rPr>
-        <w:rStyle w:val="afff1"/>
-        <w:lang w:val="en-US"/>
-      </w:rPr>
-      <w:t>device_</w:t>
-    </w:r>
-    <w:r>
-      <w:rPr>
-        <w:rStyle w:val="afff1"/>
-        <w:lang w:val="en-US"/>
-      </w:rPr>
-      <w:t>name</w:t>
+        <w:rStyle w:val="afff2"/>
+        <w:bCs w:val="0"/>
+        <w:sz w:val="20"/>
+        <w:szCs w:val="16"/>
+      </w:rPr>
+      <w:t>device_name</w:t>
     </w:r>
     <w:proofErr w:type="spellEnd"/>
     <w:r>
       <w:rPr>
-        <w:rStyle w:val="afff1"/>
-        <w:lang w:val="en-US"/>
+        <w:rStyle w:val="afff2"/>
+        <w:bCs w:val="0"/>
+        <w:sz w:val="20"/>
+        <w:szCs w:val="16"/>
+      </w:rPr>
+      <w:t xml:space="preserve"> }}</w:t>
+    </w:r>
+  </w:p>
+</w:hdr>
+</file>
+
+<file path=word/header5.xml><?xml version="1.0" encoding="utf-8"?>
+<w:hdr xmlns:wpc="http://schemas.microsoft.com/office/word/2010/wordprocessingCanvas" xmlns:cx="http://schemas.microsoft.com/office/drawing/2014/chartex" xmlns:cx1="http://schemas.microsoft.com/office/drawing/2015/9/8/chartex" xmlns:cx2="http://schemas.microsoft.com/office/drawing/2015/10/21/chartex" xmlns:cx3="http://schemas.microsoft.com/office/drawing/2016/5/9/chartex" xmlns:cx4="http://schemas.microsoft.com/office/drawing/2016/5/10/chartex" xmlns:cx5="http://schemas.microsoft.com/office/drawing/2016/5/11/chartex" xmlns:cx6="http://schemas.microsoft.com/office/drawing/2016/5/12/chartex" xmlns:cx7="http://schemas.microsoft.com/office/drawing/2016/5/13/chartex" xmlns:cx8="http://schemas.microsoft.com/office/drawing/2016/5/14/chartex" xmlns:mc="http://schemas.openxmlformats.org/markup-compatibility/2006" xmlns:aink="http://schemas.microsoft.com/office/drawing/2016/ink" xmlns:am3d="http://schemas.microsoft.com/office/drawing/2017/model3d" xmlns:o="urn:schemas-microsoft-com:office:office" xmlns:oel="http://schemas.microsoft.com/office/2019/extlst" xmlns:r="http://schemas.openxmlformats.org/officeDocument/2006/relationships" xmlns:m="http://schemas.openxmlformats.org/officeDocument/2006/math" xmlns:v="urn:schemas-microsoft-com:vml" xmlns:wp14="http://schemas.microsoft.com/office/word/2010/wordprocessingDrawing" xmlns:wp="http://schemas.openxmlformats.org/drawingml/2006/wordprocessingDrawing" xmlns:w10="urn:schemas-microsoft-com:office:word" xmlns:w="http://schemas.openxmlformats.org/wordprocessingml/2006/main" xmlns:w14="http://schemas.microsoft.com/office/word/2010/wordml" xmlns:w15="http://schemas.microsoft.com/office/word/2012/wordml" xmlns:w16cex="http://schemas.microsoft.com/office/word/2018/wordml/cex" xmlns:w16cid="http://schemas.microsoft.com/office/word/2016/wordml/cid" xmlns:w16="http://schemas.microsoft.com/office/word/2018/wordml" xmlns:w16sdtdh="http://schemas.microsoft.com/office/word/2020/wordml/sdtdatahash" xmlns:w16se="http://schemas.microsoft.com/office/word/2015/wordml/symex" xmlns:wpg="http://schemas.microsoft.com/office/word/2010/wordprocessingGroup" xmlns:wpi="http://schemas.microsoft.com/office/word/2010/wordprocessingInk" xmlns:wne="http://schemas.microsoft.com/office/word/2006/wordml" xmlns:wps="http://schemas.microsoft.com/office/word/2010/wordprocessingShape" mc:Ignorable="w14 w15 w16se w16cid w16 w16cex w16sdtdh wp14">
+  <w:p>
+    <w:pPr>
+      <w:pStyle w:val="afff4"/>
+      <w:pBdr>
+        <w:bottom w:val="single" w:sz="12" w:space="1" w:color="365F91" w:themeColor="accent1" w:themeShade="BF"/>
+      </w:pBdr>
+      <w:ind w:right="-1"/>
+      <w:jc w:val="right"/>
+      <w:rPr>
+        <w:rStyle w:val="afff2"/>
+        <w:bCs w:val="0"/>
+        <w:sz w:val="20"/>
+        <w:szCs w:val="16"/>
+      </w:rPr>
+    </w:pPr>
+    <w:proofErr w:type="gramStart"/>
+    <w:r>
+      <w:rPr>
+        <w:rStyle w:val="afff2"/>
+        <w:bCs w:val="0"/>
+        <w:sz w:val="20"/>
+        <w:szCs w:val="16"/>
+      </w:rPr>
+      <w:t xml:space="preserve">{{ </w:t>
+    </w:r>
+    <w:proofErr w:type="spellStart"/>
+    <w:r>
+      <w:rPr>
+        <w:rStyle w:val="afff2"/>
+        <w:bCs w:val="0"/>
+        <w:sz w:val="20"/>
+        <w:szCs w:val="16"/>
+      </w:rPr>
+      <w:t>code</w:t>
+    </w:r>
+    <w:proofErr w:type="spellEnd"/>
+    <w:proofErr w:type="gramEnd"/>
+    <w:r>
+      <w:rPr>
+        <w:rStyle w:val="afff2"/>
+        <w:bCs w:val="0"/>
+        <w:sz w:val="20"/>
+        <w:szCs w:val="16"/>
+      </w:rPr>
+      <w:t xml:space="preserve"> }}</w:t>
+    </w:r>
+    <w:r>
+      <w:rPr>
+        <w:rStyle w:val="afff2"/>
+        <w:bCs w:val="0"/>
+        <w:sz w:val="20"/>
+        <w:szCs w:val="16"/>
+      </w:rPr>
+      <w:ptab w:relativeTo="margin" w:alignment="center" w:leader="none"/>
+    </w:r>
+    <w:r>
+      <w:rPr>
+        <w:rStyle w:val="afff2"/>
+        <w:bCs w:val="0"/>
+        <w:color w:val="A6A6A6" w:themeColor="background1" w:themeShade="A6"/>
+        <w:sz w:val="20"/>
+        <w:szCs w:val="16"/>
+      </w:rPr>
+      <w:t xml:space="preserve">{{ </w:t>
+    </w:r>
+    <w:proofErr w:type="spellStart"/>
+    <w:r>
+      <w:rPr>
+        <w:rStyle w:val="afff2"/>
+        <w:bCs w:val="0"/>
+        <w:color w:val="A6A6A6" w:themeColor="background1" w:themeShade="A6"/>
+        <w:sz w:val="20"/>
+        <w:szCs w:val="16"/>
+      </w:rPr>
+      <w:t>colontile</w:t>
+    </w:r>
+    <w:proofErr w:type="spellEnd"/>
+    <w:r>
+      <w:rPr>
+        <w:rStyle w:val="afff2"/>
+        <w:bCs w:val="0"/>
+        <w:color w:val="A6A6A6" w:themeColor="background1" w:themeShade="A6"/>
+        <w:sz w:val="20"/>
+        <w:szCs w:val="16"/>
+      </w:rPr>
+      <w:t>}}</w:t>
+    </w:r>
+    <w:r>
+      <w:rPr>
+        <w:rStyle w:val="afff2"/>
+        <w:bCs w:val="0"/>
+        <w:sz w:val="20"/>
+        <w:szCs w:val="16"/>
+      </w:rPr>
+      <w:ptab w:relativeTo="margin" w:alignment="right" w:leader="none"/>
+    </w:r>
+    <w:r>
+      <w:rPr>
+        <w:rStyle w:val="afff2"/>
+        <w:bCs w:val="0"/>
+        <w:sz w:val="20"/>
+        <w:szCs w:val="16"/>
+      </w:rPr>
+      <w:t xml:space="preserve">{{ </w:t>
+    </w:r>
+    <w:proofErr w:type="spellStart"/>
+    <w:r>
+      <w:rPr>
+        <w:rStyle w:val="afff2"/>
+        <w:bCs w:val="0"/>
+        <w:sz w:val="20"/>
+        <w:szCs w:val="16"/>
+      </w:rPr>
+      <w:t>device_name</w:t>
+    </w:r>
+    <w:proofErr w:type="spellEnd"/>
+    <w:r>
+      <w:rPr>
+        <w:rStyle w:val="afff2"/>
+        <w:bCs w:val="0"/>
+        <w:sz w:val="20"/>
+        <w:szCs w:val="16"/>
       </w:rPr>
       <w:t xml:space="preserve"> }}</w:t>
     </w:r>
@@ -4190,7 +4283,7 @@
   <w:abstractNum w:abstractNumId="15" w15:restartNumberingAfterBreak="0">
     <w:nsid w:val="30C070CE"/>
     <w:multiLevelType w:val="multilevel"/>
-    <w:tmpl w:val="01E86774"/>
+    <w:tmpl w:val="60AE836C"/>
     <w:lvl w:ilvl="0">
       <w:start w:val="1"/>
       <w:numFmt w:val="decimal"/>
@@ -4202,7 +4295,8 @@
         <w:ind w:left="357" w:hanging="357"/>
       </w:pPr>
       <w:rPr>
-        <w:rFonts w:cs="Times New Roman"/>
+        <w:rFonts w:cs="Times New Roman" w:hint="default"/>
+        <w:b/>
         <w:i w:val="0"/>
         <w:iCs w:val="0"/>
         <w:caps w:val="0"/>
@@ -4259,7 +4353,8 @@
         <w:ind w:left="357" w:hanging="357"/>
       </w:pPr>
       <w:rPr>
-        <w:rFonts w:cs="Times New Roman"/>
+        <w:rFonts w:cs="Times New Roman" w:hint="default"/>
+        <w:b/>
         <w:i w:val="0"/>
         <w:iCs w:val="0"/>
         <w:caps w:val="0"/>
@@ -4316,8 +4411,8 @@
         <w:ind w:left="357" w:hanging="357"/>
       </w:pPr>
       <w:rPr>
-        <w:rFonts w:cs="Times New Roman"/>
-        <w:b w:val="0"/>
+        <w:rFonts w:cs="Times New Roman" w:hint="default"/>
+        <w:b/>
         <w:i w:val="0"/>
         <w:iCs w:val="0"/>
         <w:caps w:val="0"/>
@@ -4645,6 +4740,98 @@
     </w:lvl>
   </w:abstractNum>
   <w:abstractNum w:abstractNumId="18" w15:restartNumberingAfterBreak="0">
+    <w:nsid w:val="37601EE1"/>
+    <w:multiLevelType w:val="hybridMultilevel"/>
+    <w:tmpl w:val="C7D24832"/>
+    <w:lvl w:ilvl="0" w:tplc="8B943E7E">
+      <w:start w:val="1"/>
+      <w:numFmt w:val="decimal"/>
+      <w:pStyle w:val="3old"/>
+      <w:lvlText w:val="%1.1.1"/>
+      <w:lvlJc w:val="left"/>
+      <w:pPr>
+        <w:ind w:left="720" w:hanging="360"/>
+      </w:pPr>
+      <w:rPr>
+        <w:rFonts w:hint="default"/>
+        <w:b/>
+        <w:i w:val="0"/>
+      </w:rPr>
+    </w:lvl>
+    <w:lvl w:ilvl="1" w:tplc="04190019" w:tentative="1">
+      <w:start w:val="1"/>
+      <w:numFmt w:val="lowerLetter"/>
+      <w:lvlText w:val="%2."/>
+      <w:lvlJc w:val="left"/>
+      <w:pPr>
+        <w:ind w:left="1440" w:hanging="360"/>
+      </w:pPr>
+    </w:lvl>
+    <w:lvl w:ilvl="2" w:tplc="0419001B" w:tentative="1">
+      <w:start w:val="1"/>
+      <w:numFmt w:val="lowerRoman"/>
+      <w:lvlText w:val="%3."/>
+      <w:lvlJc w:val="right"/>
+      <w:pPr>
+        <w:ind w:left="2160" w:hanging="180"/>
+      </w:pPr>
+    </w:lvl>
+    <w:lvl w:ilvl="3" w:tplc="0419000F" w:tentative="1">
+      <w:start w:val="1"/>
+      <w:numFmt w:val="decimal"/>
+      <w:lvlText w:val="%4."/>
+      <w:lvlJc w:val="left"/>
+      <w:pPr>
+        <w:ind w:left="2880" w:hanging="360"/>
+      </w:pPr>
+    </w:lvl>
+    <w:lvl w:ilvl="4" w:tplc="04190019" w:tentative="1">
+      <w:start w:val="1"/>
+      <w:numFmt w:val="lowerLetter"/>
+      <w:lvlText w:val="%5."/>
+      <w:lvlJc w:val="left"/>
+      <w:pPr>
+        <w:ind w:left="3600" w:hanging="360"/>
+      </w:pPr>
+    </w:lvl>
+    <w:lvl w:ilvl="5" w:tplc="0419001B" w:tentative="1">
+      <w:start w:val="1"/>
+      <w:numFmt w:val="lowerRoman"/>
+      <w:lvlText w:val="%6."/>
+      <w:lvlJc w:val="right"/>
+      <w:pPr>
+        <w:ind w:left="4320" w:hanging="180"/>
+      </w:pPr>
+    </w:lvl>
+    <w:lvl w:ilvl="6" w:tplc="0419000F" w:tentative="1">
+      <w:start w:val="1"/>
+      <w:numFmt w:val="decimal"/>
+      <w:lvlText w:val="%7."/>
+      <w:lvlJc w:val="left"/>
+      <w:pPr>
+        <w:ind w:left="5040" w:hanging="360"/>
+      </w:pPr>
+    </w:lvl>
+    <w:lvl w:ilvl="7" w:tplc="04190019" w:tentative="1">
+      <w:start w:val="1"/>
+      <w:numFmt w:val="lowerLetter"/>
+      <w:lvlText w:val="%8."/>
+      <w:lvlJc w:val="left"/>
+      <w:pPr>
+        <w:ind w:left="5760" w:hanging="360"/>
+      </w:pPr>
+    </w:lvl>
+    <w:lvl w:ilvl="8" w:tplc="0419001B" w:tentative="1">
+      <w:start w:val="1"/>
+      <w:numFmt w:val="lowerRoman"/>
+      <w:lvlText w:val="%9."/>
+      <w:lvlJc w:val="right"/>
+      <w:pPr>
+        <w:ind w:left="6480" w:hanging="180"/>
+      </w:pPr>
+    </w:lvl>
+  </w:abstractNum>
+  <w:abstractNum w:abstractNumId="19" w15:restartNumberingAfterBreak="0">
     <w:nsid w:val="37782466"/>
     <w:multiLevelType w:val="hybridMultilevel"/>
     <w:tmpl w:val="55A8637A"/>
@@ -4734,7 +4921,7 @@
       </w:pPr>
     </w:lvl>
   </w:abstractNum>
-  <w:abstractNum w:abstractNumId="19" w15:restartNumberingAfterBreak="0">
+  <w:abstractNum w:abstractNumId="20" w15:restartNumberingAfterBreak="0">
     <w:nsid w:val="38654138"/>
     <w:multiLevelType w:val="multilevel"/>
     <w:tmpl w:val="AA96CC38"/>
@@ -4869,7 +5056,7 @@
       </w:rPr>
     </w:lvl>
   </w:abstractNum>
-  <w:abstractNum w:abstractNumId="20" w15:restartNumberingAfterBreak="0">
+  <w:abstractNum w:abstractNumId="21" w15:restartNumberingAfterBreak="0">
     <w:nsid w:val="3A806FE2"/>
     <w:multiLevelType w:val="hybridMultilevel"/>
     <w:tmpl w:val="55A8637A"/>
@@ -4959,7 +5146,7 @@
       </w:pPr>
     </w:lvl>
   </w:abstractNum>
-  <w:abstractNum w:abstractNumId="21" w15:restartNumberingAfterBreak="0">
+  <w:abstractNum w:abstractNumId="22" w15:restartNumberingAfterBreak="0">
     <w:nsid w:val="3F9B6C2E"/>
     <w:multiLevelType w:val="hybridMultilevel"/>
     <w:tmpl w:val="55A8637A"/>
@@ -5049,7 +5236,7 @@
       </w:pPr>
     </w:lvl>
   </w:abstractNum>
-  <w:abstractNum w:abstractNumId="22" w15:restartNumberingAfterBreak="0">
+  <w:abstractNum w:abstractNumId="23" w15:restartNumberingAfterBreak="0">
     <w:nsid w:val="41CF6D96"/>
     <w:multiLevelType w:val="hybridMultilevel"/>
     <w:tmpl w:val="55A8637A"/>
@@ -5139,7 +5326,7 @@
       </w:pPr>
     </w:lvl>
   </w:abstractNum>
-  <w:abstractNum w:abstractNumId="23" w15:restartNumberingAfterBreak="0">
+  <w:abstractNum w:abstractNumId="24" w15:restartNumberingAfterBreak="0">
     <w:nsid w:val="42F73AF4"/>
     <w:multiLevelType w:val="hybridMultilevel"/>
     <w:tmpl w:val="55A8637A"/>
@@ -5229,7 +5416,7 @@
       </w:pPr>
     </w:lvl>
   </w:abstractNum>
-  <w:abstractNum w:abstractNumId="24" w15:restartNumberingAfterBreak="0">
+  <w:abstractNum w:abstractNumId="25" w15:restartNumberingAfterBreak="0">
     <w:nsid w:val="459F2701"/>
     <w:multiLevelType w:val="multilevel"/>
     <w:tmpl w:val="A48036AE"/>
@@ -5372,7 +5559,7 @@
       </w:rPr>
     </w:lvl>
   </w:abstractNum>
-  <w:abstractNum w:abstractNumId="25" w15:restartNumberingAfterBreak="0">
+  <w:abstractNum w:abstractNumId="26" w15:restartNumberingAfterBreak="0">
     <w:nsid w:val="4AE45126"/>
     <w:multiLevelType w:val="multilevel"/>
     <w:tmpl w:val="7E8E8020"/>
@@ -5514,7 +5701,7 @@
       </w:rPr>
     </w:lvl>
   </w:abstractNum>
-  <w:abstractNum w:abstractNumId="26" w15:restartNumberingAfterBreak="0">
+  <w:abstractNum w:abstractNumId="27" w15:restartNumberingAfterBreak="0">
     <w:nsid w:val="4F012B3F"/>
     <w:multiLevelType w:val="hybridMultilevel"/>
     <w:tmpl w:val="55A8637A"/>
@@ -5604,7 +5791,7 @@
       </w:pPr>
     </w:lvl>
   </w:abstractNum>
-  <w:abstractNum w:abstractNumId="27" w15:restartNumberingAfterBreak="0">
+  <w:abstractNum w:abstractNumId="28" w15:restartNumberingAfterBreak="0">
     <w:nsid w:val="53BE5BDD"/>
     <w:multiLevelType w:val="multilevel"/>
     <w:tmpl w:val="763A0C4E"/>
@@ -5737,7 +5924,7 @@
       </w:rPr>
     </w:lvl>
   </w:abstractNum>
-  <w:abstractNum w:abstractNumId="28" w15:restartNumberingAfterBreak="0">
+  <w:abstractNum w:abstractNumId="29" w15:restartNumberingAfterBreak="0">
     <w:nsid w:val="543F35AD"/>
     <w:multiLevelType w:val="multilevel"/>
     <w:tmpl w:val="051ED0C4"/>
@@ -5828,7 +6015,7 @@
       </w:pPr>
     </w:lvl>
   </w:abstractNum>
-  <w:abstractNum w:abstractNumId="29" w15:restartNumberingAfterBreak="0">
+  <w:abstractNum w:abstractNumId="30" w15:restartNumberingAfterBreak="0">
     <w:nsid w:val="65D74793"/>
     <w:multiLevelType w:val="multilevel"/>
     <w:tmpl w:val="E0A0DCC2"/>
@@ -5919,7 +6106,7 @@
       </w:pPr>
     </w:lvl>
   </w:abstractNum>
-  <w:abstractNum w:abstractNumId="30" w15:restartNumberingAfterBreak="0">
+  <w:abstractNum w:abstractNumId="31" w15:restartNumberingAfterBreak="0">
     <w:nsid w:val="67631314"/>
     <w:multiLevelType w:val="hybridMultilevel"/>
     <w:tmpl w:val="55A8637A"/>
@@ -6009,7 +6196,7 @@
       </w:pPr>
     </w:lvl>
   </w:abstractNum>
-  <w:abstractNum w:abstractNumId="31" w15:restartNumberingAfterBreak="0">
+  <w:abstractNum w:abstractNumId="32" w15:restartNumberingAfterBreak="0">
     <w:nsid w:val="69DF5FAE"/>
     <w:multiLevelType w:val="hybridMultilevel"/>
     <w:tmpl w:val="55A8637A"/>
@@ -6099,7 +6286,7 @@
       </w:pPr>
     </w:lvl>
   </w:abstractNum>
-  <w:abstractNum w:abstractNumId="32" w15:restartNumberingAfterBreak="0">
+  <w:abstractNum w:abstractNumId="33" w15:restartNumberingAfterBreak="0">
     <w:nsid w:val="746926BE"/>
     <w:multiLevelType w:val="hybridMultilevel"/>
     <w:tmpl w:val="55A8637A"/>
@@ -6189,7 +6376,7 @@
       </w:pPr>
     </w:lvl>
   </w:abstractNum>
-  <w:abstractNum w:abstractNumId="33" w15:restartNumberingAfterBreak="0">
+  <w:abstractNum w:abstractNumId="34" w15:restartNumberingAfterBreak="0">
     <w:nsid w:val="796153C0"/>
     <w:multiLevelType w:val="hybridMultilevel"/>
     <w:tmpl w:val="456CB3DC"/>
@@ -6280,7 +6467,7 @@
       </w:pPr>
     </w:lvl>
   </w:abstractNum>
-  <w:abstractNum w:abstractNumId="34" w15:restartNumberingAfterBreak="0">
+  <w:abstractNum w:abstractNumId="35" w15:restartNumberingAfterBreak="0">
     <w:nsid w:val="79E2341E"/>
     <w:multiLevelType w:val="hybridMultilevel"/>
     <w:tmpl w:val="55A8637A"/>
@@ -6374,16 +6561,16 @@
     <w:abstractNumId w:val="8"/>
   </w:num>
   <w:num w:numId="2" w16cid:durableId="1770389669">
-    <w:abstractNumId w:val="19"/>
+    <w:abstractNumId w:val="20"/>
   </w:num>
   <w:num w:numId="3" w16cid:durableId="440416075">
-    <w:abstractNumId w:val="27"/>
+    <w:abstractNumId w:val="28"/>
   </w:num>
   <w:num w:numId="4" w16cid:durableId="832531979">
     <w:abstractNumId w:val="12"/>
   </w:num>
   <w:num w:numId="5" w16cid:durableId="1616206315">
-    <w:abstractNumId w:val="24"/>
+    <w:abstractNumId w:val="25"/>
   </w:num>
   <w:num w:numId="6" w16cid:durableId="241379521">
     <w:abstractNumId w:val="15"/>
@@ -6398,13 +6585,13 @@
     </w:lvlOverride>
   </w:num>
   <w:num w:numId="9" w16cid:durableId="1985620233">
-    <w:abstractNumId w:val="33"/>
+    <w:abstractNumId w:val="34"/>
   </w:num>
   <w:num w:numId="10" w16cid:durableId="1193109343">
     <w:abstractNumId w:val="9"/>
   </w:num>
   <w:num w:numId="11" w16cid:durableId="182060031">
-    <w:abstractNumId w:val="25"/>
+    <w:abstractNumId w:val="26"/>
     <w:lvlOverride w:ilvl="0">
       <w:lvl w:ilvl="0">
         <w:start w:val="1"/>
@@ -6740,16 +6927,16 @@
     <w:abstractNumId w:val="17"/>
   </w:num>
   <w:num w:numId="21" w16cid:durableId="1799834727">
-    <w:abstractNumId w:val="28"/>
+    <w:abstractNumId w:val="29"/>
   </w:num>
   <w:num w:numId="22" w16cid:durableId="613056206">
-    <w:abstractNumId w:val="29"/>
+    <w:abstractNumId w:val="30"/>
   </w:num>
   <w:num w:numId="23" w16cid:durableId="1713378219">
     <w:abstractNumId w:val="13"/>
   </w:num>
   <w:num w:numId="24" w16cid:durableId="146166759">
-    <w:abstractNumId w:val="25"/>
+    <w:abstractNumId w:val="26"/>
   </w:num>
   <w:num w:numId="25" w16cid:durableId="902376188">
     <w:abstractNumId w:val="15"/>
@@ -6812,19 +6999,19 @@
     </w:lvlOverride>
   </w:num>
   <w:num w:numId="27" w16cid:durableId="2141142806">
-    <w:abstractNumId w:val="20"/>
+    <w:abstractNumId w:val="21"/>
   </w:num>
   <w:num w:numId="28" w16cid:durableId="124858556">
     <w:abstractNumId w:val="6"/>
   </w:num>
   <w:num w:numId="29" w16cid:durableId="1223638431">
-    <w:abstractNumId w:val="23"/>
+    <w:abstractNumId w:val="24"/>
   </w:num>
   <w:num w:numId="30" w16cid:durableId="824785319">
-    <w:abstractNumId w:val="30"/>
+    <w:abstractNumId w:val="31"/>
   </w:num>
   <w:num w:numId="31" w16cid:durableId="75783541">
-    <w:abstractNumId w:val="18"/>
+    <w:abstractNumId w:val="19"/>
   </w:num>
   <w:num w:numId="32" w16cid:durableId="1494029657">
     <w:abstractNumId w:val="2"/>
@@ -6833,22 +7020,28 @@
     <w:abstractNumId w:val="7"/>
   </w:num>
   <w:num w:numId="34" w16cid:durableId="1543862904">
+    <w:abstractNumId w:val="23"/>
+  </w:num>
+  <w:num w:numId="35" w16cid:durableId="1560436928">
+    <w:abstractNumId w:val="35"/>
+  </w:num>
+  <w:num w:numId="36" w16cid:durableId="2082675221">
+    <w:abstractNumId w:val="27"/>
+  </w:num>
+  <w:num w:numId="37" w16cid:durableId="1160149076">
     <w:abstractNumId w:val="22"/>
   </w:num>
-  <w:num w:numId="35" w16cid:durableId="1560436928">
-    <w:abstractNumId w:val="34"/>
+  <w:num w:numId="38" w16cid:durableId="240452958">
+    <w:abstractNumId w:val="33"/>
   </w:num>
-  <w:num w:numId="36" w16cid:durableId="2082675221">
-    <w:abstractNumId w:val="26"/>
-  </w:num>
-  <w:num w:numId="37" w16cid:durableId="1160149076">
-    <w:abstractNumId w:val="21"/>
-  </w:num>
-  <w:num w:numId="38" w16cid:durableId="240452958">
+  <w:num w:numId="39" w16cid:durableId="689185366">
     <w:abstractNumId w:val="32"/>
   </w:num>
-  <w:num w:numId="39" w16cid:durableId="689185366">
-    <w:abstractNumId w:val="31"/>
+  <w:num w:numId="40" w16cid:durableId="319189690">
+    <w:abstractNumId w:val="1"/>
+  </w:num>
+  <w:num w:numId="41" w16cid:durableId="1968314173">
+    <w:abstractNumId w:val="18"/>
   </w:num>
   <w:numIdMacAtCleanup w:val="22"/>
 </w:numbering>
@@ -7576,7 +7769,7 @@
     <w:basedOn w:val="af"/>
     <w:link w:val="15"/>
     <w:qFormat/>
-    <w:rsid w:val="00E1162A"/>
+    <w:rsid w:val="00A92DC4"/>
     <w:pPr>
       <w:pageBreakBefore/>
       <w:numPr>
@@ -7590,7 +7783,7 @@
       <w:b/>
       <w:bCs/>
       <w:noProof/>
-      <w:color w:val="1E4973"/>
+      <w:color w:val="365F91" w:themeColor="accent1" w:themeShade="BF"/>
       <w:szCs w:val="22"/>
       <w:lang w:val="en-US"/>
     </w:rPr>
@@ -7599,13 +7792,13 @@
     <w:name w:val="ДОК Заголовок 1 Знак"/>
     <w:basedOn w:val="af0"/>
     <w:link w:val="11"/>
-    <w:rsid w:val="00E1162A"/>
+    <w:rsid w:val="00A92DC4"/>
     <w:rPr>
       <w:rFonts w:ascii="Arial Narrow" w:eastAsia="Times New Roman" w:hAnsi="Arial Narrow" w:cs="Times New Roman"/>
       <w:b/>
       <w:bCs/>
       <w:noProof/>
-      <w:color w:val="1E4973"/>
+      <w:color w:val="365F91" w:themeColor="accent1" w:themeShade="BF"/>
       <w:sz w:val="24"/>
       <w:lang w:val="en-US" w:eastAsia="ru-RU"/>
     </w:rPr>
@@ -7615,7 +7808,7 @@
     <w:basedOn w:val="af"/>
     <w:link w:val="24"/>
     <w:qFormat/>
-    <w:rsid w:val="000201F0"/>
+    <w:rsid w:val="00A92DC4"/>
     <w:pPr>
       <w:keepNext/>
       <w:numPr>
@@ -7631,7 +7824,7 @@
       <w:bCs/>
       <w:noProof/>
       <w:snapToGrid w:val="0"/>
-      <w:color w:val="1E4973"/>
+      <w:color w:val="365F91" w:themeColor="accent1" w:themeShade="BF"/>
       <w:szCs w:val="22"/>
     </w:rPr>
   </w:style>
@@ -7639,31 +7832,30 @@
     <w:name w:val="ДОК Заголовок 2 Знак"/>
     <w:basedOn w:val="af0"/>
     <w:link w:val="20"/>
-    <w:rsid w:val="000201F0"/>
+    <w:rsid w:val="00A92DC4"/>
     <w:rPr>
       <w:rFonts w:ascii="Arial Narrow" w:eastAsia="Times New Roman" w:hAnsi="Arial Narrow" w:cs="Times New Roman"/>
       <w:b/>
       <w:bCs/>
       <w:noProof/>
       <w:snapToGrid w:val="0"/>
-      <w:color w:val="1E4973"/>
+      <w:color w:val="365F91" w:themeColor="accent1" w:themeShade="BF"/>
       <w:sz w:val="24"/>
       <w:lang w:eastAsia="ru-RU"/>
     </w:rPr>
   </w:style>
-  <w:style w:type="paragraph" w:customStyle="1" w:styleId="30">
-    <w:name w:val="ДОК Заголовок 3"/>
+  <w:style w:type="paragraph" w:customStyle="1" w:styleId="3old">
+    <w:name w:val="ДОК Заголовок 3 (old)"/>
     <w:basedOn w:val="af"/>
-    <w:link w:val="33"/>
-    <w:qFormat/>
-    <w:rsid w:val="000201F0"/>
+    <w:link w:val="3old0"/>
+    <w:rsid w:val="00B469A5"/>
     <w:pPr>
       <w:keepNext/>
       <w:numPr>
-        <w:ilvl w:val="2"/>
-        <w:numId w:val="6"/>
+        <w:numId w:val="41"/>
       </w:numPr>
       <w:spacing w:before="60" w:after="60"/>
+      <w:ind w:left="357" w:hanging="357"/>
       <w:contextualSpacing/>
       <w:outlineLvl w:val="2"/>
     </w:pPr>
@@ -7671,21 +7863,21 @@
       <w:b/>
       <w:bCs/>
       <w:noProof/>
-      <w:color w:val="1E4973"/>
+      <w:color w:val="365F91" w:themeColor="accent1" w:themeShade="BF"/>
       <w:szCs w:val="22"/>
     </w:rPr>
   </w:style>
-  <w:style w:type="character" w:customStyle="1" w:styleId="33">
-    <w:name w:val="ДОК Заголовок 3 Знак"/>
+  <w:style w:type="character" w:customStyle="1" w:styleId="3old0">
+    <w:name w:val="ДОК Заголовок 3 (old) Знак"/>
     <w:basedOn w:val="af0"/>
-    <w:link w:val="30"/>
-    <w:rsid w:val="000201F0"/>
+    <w:link w:val="3old"/>
+    <w:rsid w:val="00B469A5"/>
     <w:rPr>
       <w:rFonts w:ascii="Arial Narrow" w:eastAsia="Times New Roman" w:hAnsi="Arial Narrow" w:cs="Times New Roman"/>
       <w:b/>
       <w:bCs/>
       <w:noProof/>
-      <w:color w:val="1E4973"/>
+      <w:color w:val="365F91" w:themeColor="accent1" w:themeShade="BF"/>
       <w:sz w:val="24"/>
       <w:lang w:eastAsia="ru-RU"/>
     </w:rPr>
@@ -7886,6 +8078,7 @@
   <w:style w:type="paragraph" w:customStyle="1" w:styleId="aff3">
     <w:name w:val="ДОК Титульник Объект"/>
     <w:basedOn w:val="af"/>
+    <w:link w:val="aff4"/>
     <w:qFormat/>
     <w:rsid w:val="00495A4F"/>
     <w:pPr>
@@ -7898,7 +8091,7 @@
       <w:sz w:val="40"/>
     </w:rPr>
   </w:style>
-  <w:style w:type="paragraph" w:customStyle="1" w:styleId="aff4">
+  <w:style w:type="paragraph" w:customStyle="1" w:styleId="aff5">
     <w:name w:val="ДОК Титульник Организация"/>
     <w:basedOn w:val="af"/>
     <w:next w:val="af"/>
@@ -7918,7 +8111,7 @@
       <w:lang w:val="en-US"/>
     </w:rPr>
   </w:style>
-  <w:style w:type="paragraph" w:customStyle="1" w:styleId="aff5">
+  <w:style w:type="paragraph" w:customStyle="1" w:styleId="aff6">
     <w:name w:val="ДОК Титульник Шифр"/>
     <w:basedOn w:val="af"/>
     <w:qFormat/>
@@ -7933,7 +8126,7 @@
       <w:sz w:val="28"/>
     </w:rPr>
   </w:style>
-  <w:style w:type="table" w:styleId="aff6">
+  <w:style w:type="table" w:styleId="aff7">
     <w:name w:val="Table Grid"/>
     <w:basedOn w:val="af1"/>
     <w:uiPriority w:val="59"/>
@@ -7968,10 +8161,10 @@
       <w:lang w:eastAsia="ru-RU"/>
     </w:rPr>
   </w:style>
-  <w:style w:type="paragraph" w:styleId="aff7">
+  <w:style w:type="paragraph" w:styleId="aff8">
     <w:name w:val="Balloon Text"/>
     <w:basedOn w:val="af"/>
-    <w:link w:val="aff8"/>
+    <w:link w:val="aff9"/>
     <w:uiPriority w:val="99"/>
     <w:semiHidden/>
     <w:unhideWhenUsed/>
@@ -7982,10 +8175,10 @@
       <w:szCs w:val="16"/>
     </w:rPr>
   </w:style>
-  <w:style w:type="character" w:customStyle="1" w:styleId="aff8">
+  <w:style w:type="character" w:customStyle="1" w:styleId="aff9">
     <w:name w:val="Текст выноски Знак"/>
     <w:basedOn w:val="af0"/>
-    <w:link w:val="aff7"/>
+    <w:link w:val="aff8"/>
     <w:uiPriority w:val="99"/>
     <w:semiHidden/>
     <w:rsid w:val="004C1A74"/>
@@ -8058,7 +8251,7 @@
   </w:style>
   <w:style w:type="paragraph" w:customStyle="1" w:styleId="af7">
     <w:name w:val="ДОК Базовый"/>
-    <w:link w:val="aff9"/>
+    <w:link w:val="affa"/>
     <w:qFormat/>
     <w:rsid w:val="00AE3671"/>
     <w:pPr>
@@ -8072,7 +8265,7 @@
       <w:lang w:eastAsia="ru-RU"/>
     </w:rPr>
   </w:style>
-  <w:style w:type="character" w:customStyle="1" w:styleId="aff9">
+  <w:style w:type="character" w:customStyle="1" w:styleId="affa">
     <w:name w:val="ДОК Базовый Знак"/>
     <w:basedOn w:val="af0"/>
     <w:link w:val="af7"/>
@@ -8104,10 +8297,10 @@
       <w:lang w:val="en-US"/>
     </w:rPr>
   </w:style>
-  <w:style w:type="paragraph" w:customStyle="1" w:styleId="affa">
+  <w:style w:type="paragraph" w:customStyle="1" w:styleId="affb">
     <w:name w:val="ДОК Таблица Заголовок"/>
     <w:basedOn w:val="af"/>
-    <w:link w:val="affb"/>
+    <w:link w:val="affc"/>
     <w:qFormat/>
     <w:rsid w:val="00901804"/>
     <w:pPr>
@@ -8135,38 +8328,38 @@
       <w:spacing w:after="120"/>
     </w:pPr>
   </w:style>
-  <w:style w:type="paragraph" w:customStyle="1" w:styleId="affc">
+  <w:style w:type="paragraph" w:customStyle="1" w:styleId="affd">
     <w:name w:val="ДОК Таблица Текст"/>
     <w:basedOn w:val="af7"/>
-    <w:link w:val="affd"/>
+    <w:link w:val="affe"/>
     <w:qFormat/>
     <w:rsid w:val="00901804"/>
     <w:rPr>
       <w:rFonts w:eastAsia="Arial Unicode MS"/>
     </w:rPr>
   </w:style>
-  <w:style w:type="paragraph" w:customStyle="1" w:styleId="affe">
+  <w:style w:type="paragraph" w:customStyle="1" w:styleId="afff">
     <w:name w:val="ДОК Таблица Текст Справа"/>
-    <w:basedOn w:val="affc"/>
+    <w:basedOn w:val="affd"/>
     <w:qFormat/>
     <w:rsid w:val="00901804"/>
     <w:pPr>
       <w:jc w:val="right"/>
     </w:pPr>
   </w:style>
-  <w:style w:type="paragraph" w:customStyle="1" w:styleId="afff">
+  <w:style w:type="paragraph" w:customStyle="1" w:styleId="afff0">
     <w:name w:val="ДОК Таблица Текст Центр"/>
-    <w:basedOn w:val="affc"/>
+    <w:basedOn w:val="affd"/>
     <w:qFormat/>
     <w:rsid w:val="00901804"/>
     <w:pPr>
       <w:jc w:val="center"/>
     </w:pPr>
   </w:style>
-  <w:style w:type="paragraph" w:customStyle="1" w:styleId="afff0">
+  <w:style w:type="paragraph" w:customStyle="1" w:styleId="afff1">
     <w:name w:val="ДОК Текст"/>
     <w:basedOn w:val="af7"/>
-    <w:link w:val="afff1"/>
+    <w:link w:val="afff2"/>
     <w:qFormat/>
     <w:rsid w:val="00901804"/>
     <w:pPr>
@@ -8231,9 +8424,9 @@
       <w:b w:val="0"/>
     </w:rPr>
   </w:style>
-  <w:style w:type="paragraph" w:styleId="34">
+  <w:style w:type="paragraph" w:styleId="33">
     <w:name w:val="toc 3"/>
-    <w:basedOn w:val="30"/>
+    <w:basedOn w:val="3old"/>
     <w:next w:val="af"/>
     <w:autoRedefine/>
     <w:uiPriority w:val="39"/>
@@ -8241,7 +8434,6 @@
     <w:rsid w:val="00713EFA"/>
     <w:pPr>
       <w:numPr>
-        <w:ilvl w:val="0"/>
         <w:numId w:val="0"/>
       </w:numPr>
       <w:tabs>
@@ -8257,7 +8449,7 @@
       <w:iCs/>
     </w:rPr>
   </w:style>
-  <w:style w:type="character" w:styleId="afff2">
+  <w:style w:type="character" w:styleId="afff3">
     <w:name w:val="Hyperlink"/>
     <w:basedOn w:val="af0"/>
     <w:uiPriority w:val="99"/>
@@ -8280,10 +8472,10 @@
       <w:ind w:left="600"/>
     </w:pPr>
   </w:style>
-  <w:style w:type="paragraph" w:styleId="afff3">
+  <w:style w:type="paragraph" w:styleId="afff4">
     <w:name w:val="header"/>
     <w:basedOn w:val="af"/>
-    <w:link w:val="afff4"/>
+    <w:link w:val="afff5"/>
     <w:uiPriority w:val="99"/>
     <w:unhideWhenUsed/>
     <w:rsid w:val="00495A4F"/>
@@ -8294,10 +8486,10 @@
       </w:tabs>
     </w:pPr>
   </w:style>
-  <w:style w:type="character" w:customStyle="1" w:styleId="afff4">
+  <w:style w:type="character" w:customStyle="1" w:styleId="afff5">
     <w:name w:val="Верхний колонтитул Знак"/>
     <w:basedOn w:val="af0"/>
-    <w:link w:val="afff3"/>
+    <w:link w:val="afff4"/>
     <w:uiPriority w:val="99"/>
     <w:rsid w:val="00495A4F"/>
     <w:rPr>
@@ -8307,10 +8499,10 @@
       <w:lang w:eastAsia="ru-RU"/>
     </w:rPr>
   </w:style>
-  <w:style w:type="paragraph" w:styleId="afff5">
+  <w:style w:type="paragraph" w:styleId="afff6">
     <w:name w:val="footer"/>
     <w:basedOn w:val="af"/>
-    <w:link w:val="afff6"/>
+    <w:link w:val="afff7"/>
     <w:uiPriority w:val="99"/>
     <w:unhideWhenUsed/>
     <w:rsid w:val="00495A4F"/>
@@ -8321,10 +8513,10 @@
       </w:tabs>
     </w:pPr>
   </w:style>
-  <w:style w:type="character" w:customStyle="1" w:styleId="afff6">
+  <w:style w:type="character" w:customStyle="1" w:styleId="afff7">
     <w:name w:val="Нижний колонтитул Знак"/>
     <w:basedOn w:val="af0"/>
-    <w:link w:val="afff5"/>
+    <w:link w:val="afff6"/>
     <w:uiPriority w:val="99"/>
     <w:rsid w:val="00495A4F"/>
     <w:rPr>
@@ -8334,10 +8526,10 @@
       <w:lang w:eastAsia="ru-RU"/>
     </w:rPr>
   </w:style>
-  <w:style w:type="character" w:customStyle="1" w:styleId="affd">
+  <w:style w:type="character" w:customStyle="1" w:styleId="affe">
     <w:name w:val="ДОК Таблица Текст Знак"/>
-    <w:basedOn w:val="aff9"/>
-    <w:link w:val="affc"/>
+    <w:basedOn w:val="affa"/>
+    <w:link w:val="affd"/>
     <w:rsid w:val="00697B2E"/>
     <w:rPr>
       <w:rFonts w:ascii="Arial Narrow" w:eastAsia="Arial Unicode MS" w:hAnsi="Arial Narrow" w:cs="Times New Roman"/>
@@ -8346,10 +8538,10 @@
       <w:lang w:eastAsia="ru-RU"/>
     </w:rPr>
   </w:style>
-  <w:style w:type="character" w:customStyle="1" w:styleId="afff1">
+  <w:style w:type="character" w:customStyle="1" w:styleId="afff2">
     <w:name w:val="ДОК Текст Знак"/>
-    <w:basedOn w:val="aff9"/>
-    <w:link w:val="afff0"/>
+    <w:basedOn w:val="affa"/>
+    <w:link w:val="afff1"/>
     <w:rsid w:val="00697B2E"/>
     <w:rPr>
       <w:rFonts w:ascii="Arial Narrow" w:eastAsia="Times New Roman" w:hAnsi="Arial Narrow" w:cs="Times New Roman"/>
@@ -8358,7 +8550,7 @@
       <w:lang w:eastAsia="ru-RU"/>
     </w:rPr>
   </w:style>
-  <w:style w:type="character" w:styleId="afff7">
+  <w:style w:type="character" w:styleId="afff8">
     <w:name w:val="Placeholder Text"/>
     <w:basedOn w:val="af0"/>
     <w:uiPriority w:val="99"/>
@@ -8368,7 +8560,7 @@
       <w:color w:val="808080"/>
     </w:rPr>
   </w:style>
-  <w:style w:type="paragraph" w:styleId="afff8">
+  <w:style w:type="paragraph" w:styleId="afff9">
     <w:name w:val="caption"/>
     <w:basedOn w:val="af"/>
     <w:next w:val="af"/>
@@ -8387,7 +8579,7 @@
       <w:szCs w:val="18"/>
     </w:rPr>
   </w:style>
-  <w:style w:type="paragraph" w:styleId="afff9">
+  <w:style w:type="paragraph" w:styleId="afffa">
     <w:name w:val="List Paragraph"/>
     <w:basedOn w:val="af"/>
     <w:uiPriority w:val="34"/>
@@ -8488,10 +8680,10 @@
       <w:szCs w:val="22"/>
     </w:rPr>
   </w:style>
-  <w:style w:type="paragraph" w:styleId="afffa">
+  <w:style w:type="paragraph" w:styleId="afffb">
     <w:name w:val="Body Text Indent"/>
     <w:basedOn w:val="af"/>
-    <w:link w:val="afffb"/>
+    <w:link w:val="afffc"/>
     <w:rsid w:val="00CA60A9"/>
     <w:pPr>
       <w:spacing w:line="360" w:lineRule="auto"/>
@@ -8505,10 +8697,10 @@
       <w:szCs w:val="24"/>
     </w:rPr>
   </w:style>
-  <w:style w:type="character" w:customStyle="1" w:styleId="afffb">
+  <w:style w:type="character" w:customStyle="1" w:styleId="afffc">
     <w:name w:val="Основной текст с отступом Знак"/>
     <w:basedOn w:val="af0"/>
-    <w:link w:val="afffa"/>
+    <w:link w:val="afffb"/>
     <w:rsid w:val="00CA60A9"/>
     <w:rPr>
       <w:rFonts w:ascii="Arial" w:eastAsia="Times New Roman" w:hAnsi="Arial" w:cs="Arial"/>
@@ -8519,10 +8711,10 @@
       <w:lang w:eastAsia="ru-RU"/>
     </w:rPr>
   </w:style>
-  <w:style w:type="paragraph" w:styleId="afffc">
+  <w:style w:type="paragraph" w:styleId="afffd">
     <w:name w:val="Title"/>
     <w:basedOn w:val="af"/>
-    <w:link w:val="afffd"/>
+    <w:link w:val="afffe"/>
     <w:uiPriority w:val="10"/>
     <w:qFormat/>
     <w:rsid w:val="00881B8C"/>
@@ -8542,10 +8734,10 @@
       <w:sz w:val="22"/>
     </w:rPr>
   </w:style>
-  <w:style w:type="character" w:customStyle="1" w:styleId="afffd">
+  <w:style w:type="character" w:customStyle="1" w:styleId="afffe">
     <w:name w:val="Заголовок Знак"/>
     <w:basedOn w:val="af0"/>
-    <w:link w:val="afffc"/>
+    <w:link w:val="afffd"/>
     <w:uiPriority w:val="10"/>
     <w:rsid w:val="00881B8C"/>
     <w:rPr>
@@ -8555,7 +8747,7 @@
       <w:lang w:eastAsia="ru-RU"/>
     </w:rPr>
   </w:style>
-  <w:style w:type="character" w:styleId="afffe">
+  <w:style w:type="character" w:styleId="affff">
     <w:name w:val="page number"/>
     <w:basedOn w:val="af0"/>
     <w:semiHidden/>
@@ -8651,10 +8843,10 @@
       <w:lang w:val="en-GB" w:eastAsia="en-US"/>
     </w:rPr>
   </w:style>
-  <w:style w:type="paragraph" w:styleId="affff">
+  <w:style w:type="paragraph" w:styleId="affff0">
     <w:name w:val="Document Map"/>
     <w:basedOn w:val="af"/>
-    <w:link w:val="affff0"/>
+    <w:link w:val="affff1"/>
     <w:uiPriority w:val="99"/>
     <w:semiHidden/>
     <w:unhideWhenUsed/>
@@ -8668,10 +8860,10 @@
       <w:szCs w:val="16"/>
     </w:rPr>
   </w:style>
-  <w:style w:type="character" w:customStyle="1" w:styleId="affff0">
+  <w:style w:type="character" w:customStyle="1" w:styleId="affff1">
     <w:name w:val="Схема документа Знак"/>
     <w:basedOn w:val="af0"/>
-    <w:link w:val="affff"/>
+    <w:link w:val="affff0"/>
     <w:uiPriority w:val="99"/>
     <w:semiHidden/>
     <w:rsid w:val="00667F78"/>
@@ -8682,10 +8874,10 @@
       <w:lang w:eastAsia="ru-RU"/>
     </w:rPr>
   </w:style>
-  <w:style w:type="paragraph" w:styleId="affff1">
+  <w:style w:type="paragraph" w:styleId="affff2">
     <w:name w:val="Body Text"/>
     <w:basedOn w:val="af"/>
-    <w:link w:val="affff2"/>
+    <w:link w:val="affff3"/>
     <w:uiPriority w:val="99"/>
     <w:semiHidden/>
     <w:unhideWhenUsed/>
@@ -8694,10 +8886,10 @@
       <w:spacing w:after="120"/>
     </w:pPr>
   </w:style>
-  <w:style w:type="character" w:customStyle="1" w:styleId="affff2">
+  <w:style w:type="character" w:customStyle="1" w:styleId="affff3">
     <w:name w:val="Основной текст Знак"/>
     <w:basedOn w:val="af0"/>
-    <w:link w:val="affff1"/>
+    <w:link w:val="affff2"/>
     <w:uiPriority w:val="99"/>
     <w:semiHidden/>
     <w:rsid w:val="00667F78"/>
@@ -8708,11 +8900,11 @@
       <w:lang w:eastAsia="ru-RU"/>
     </w:rPr>
   </w:style>
-  <w:style w:type="paragraph" w:styleId="affff3">
+  <w:style w:type="paragraph" w:styleId="affff4">
     <w:name w:val="Subtitle"/>
     <w:basedOn w:val="af"/>
     <w:next w:val="af"/>
-    <w:link w:val="affff4"/>
+    <w:link w:val="affff5"/>
     <w:uiPriority w:val="11"/>
     <w:qFormat/>
     <w:rsid w:val="00667F78"/>
@@ -8727,10 +8919,10 @@
       <w:lang w:val="en-US" w:eastAsia="en-US" w:bidi="en-US"/>
     </w:rPr>
   </w:style>
-  <w:style w:type="character" w:customStyle="1" w:styleId="affff4">
+  <w:style w:type="character" w:customStyle="1" w:styleId="affff5">
     <w:name w:val="Подзаголовок Знак"/>
     <w:basedOn w:val="af0"/>
-    <w:link w:val="affff3"/>
+    <w:link w:val="affff4"/>
     <w:uiPriority w:val="11"/>
     <w:rsid w:val="00667F78"/>
     <w:rPr>
@@ -8740,7 +8932,7 @@
       <w:lang w:val="en-US" w:bidi="en-US"/>
     </w:rPr>
   </w:style>
-  <w:style w:type="character" w:styleId="affff5">
+  <w:style w:type="character" w:styleId="affff6">
     <w:name w:val="Strong"/>
     <w:basedOn w:val="af0"/>
     <w:uiPriority w:val="22"/>
@@ -8751,7 +8943,7 @@
       <w:bCs/>
     </w:rPr>
   </w:style>
-  <w:style w:type="character" w:styleId="affff6">
+  <w:style w:type="character" w:styleId="affff7">
     <w:name w:val="Emphasis"/>
     <w:basedOn w:val="af0"/>
     <w:uiPriority w:val="20"/>
@@ -8764,7 +8956,7 @@
       <w:iCs/>
     </w:rPr>
   </w:style>
-  <w:style w:type="paragraph" w:styleId="affff7">
+  <w:style w:type="paragraph" w:styleId="affff8">
     <w:name w:val="No Spacing"/>
     <w:basedOn w:val="af"/>
     <w:uiPriority w:val="1"/>
@@ -8811,11 +9003,11 @@
       <w:lang w:val="en-US" w:bidi="en-US"/>
     </w:rPr>
   </w:style>
-  <w:style w:type="paragraph" w:styleId="affff8">
+  <w:style w:type="paragraph" w:styleId="affff9">
     <w:name w:val="Intense Quote"/>
     <w:basedOn w:val="af"/>
     <w:next w:val="af"/>
-    <w:link w:val="affff9"/>
+    <w:link w:val="affffa"/>
     <w:uiPriority w:val="30"/>
     <w:qFormat/>
     <w:rsid w:val="00667F78"/>
@@ -8831,10 +9023,10 @@
       <w:lang w:val="en-US" w:eastAsia="en-US" w:bidi="en-US"/>
     </w:rPr>
   </w:style>
-  <w:style w:type="character" w:customStyle="1" w:styleId="affff9">
+  <w:style w:type="character" w:customStyle="1" w:styleId="affffa">
     <w:name w:val="Выделенная цитата Знак"/>
     <w:basedOn w:val="af0"/>
-    <w:link w:val="affff8"/>
+    <w:link w:val="affff9"/>
     <w:uiPriority w:val="30"/>
     <w:rsid w:val="00667F78"/>
     <w:rPr>
@@ -8845,7 +9037,7 @@
       <w:lang w:val="en-US" w:bidi="en-US"/>
     </w:rPr>
   </w:style>
-  <w:style w:type="character" w:styleId="affffa">
+  <w:style w:type="character" w:styleId="affffb">
     <w:name w:val="Subtle Emphasis"/>
     <w:uiPriority w:val="19"/>
     <w:qFormat/>
@@ -8855,7 +9047,7 @@
       <w:color w:val="5A5A5A" w:themeColor="text1" w:themeTint="A5"/>
     </w:rPr>
   </w:style>
-  <w:style w:type="character" w:styleId="affffb">
+  <w:style w:type="character" w:styleId="affffc">
     <w:name w:val="Intense Emphasis"/>
     <w:basedOn w:val="af0"/>
     <w:uiPriority w:val="21"/>
@@ -8869,7 +9061,7 @@
       <w:u w:val="single"/>
     </w:rPr>
   </w:style>
-  <w:style w:type="character" w:styleId="affffc">
+  <w:style w:type="character" w:styleId="affffd">
     <w:name w:val="Subtle Reference"/>
     <w:basedOn w:val="af0"/>
     <w:uiPriority w:val="31"/>
@@ -8881,7 +9073,7 @@
       <w:u w:val="single"/>
     </w:rPr>
   </w:style>
-  <w:style w:type="character" w:styleId="affffd">
+  <w:style w:type="character" w:styleId="affffe">
     <w:name w:val="Intense Reference"/>
     <w:basedOn w:val="af0"/>
     <w:uiPriority w:val="32"/>
@@ -8893,7 +9085,7 @@
       <w:u w:val="single"/>
     </w:rPr>
   </w:style>
-  <w:style w:type="character" w:styleId="affffe">
+  <w:style w:type="character" w:styleId="afffff">
     <w:name w:val="Book Title"/>
     <w:basedOn w:val="af0"/>
     <w:uiPriority w:val="33"/>
@@ -8907,7 +9099,7 @@
       <w:szCs w:val="24"/>
     </w:rPr>
   </w:style>
-  <w:style w:type="paragraph" w:styleId="afffff">
+  <w:style w:type="paragraph" w:styleId="afffff0">
     <w:name w:val="TOC Heading"/>
     <w:basedOn w:val="13"/>
     <w:next w:val="af"/>
@@ -8930,7 +9122,7 @@
       <w:lang w:val="en-US" w:eastAsia="en-US" w:bidi="en-US"/>
     </w:rPr>
   </w:style>
-  <w:style w:type="paragraph" w:customStyle="1" w:styleId="afffff0">
+  <w:style w:type="paragraph" w:customStyle="1" w:styleId="afffff1">
     <w:name w:val="ÒåêñòÎáû÷íûé"/>
     <w:rsid w:val="00667F78"/>
     <w:pPr>
@@ -8950,7 +9142,7 @@
       <w:lang w:eastAsia="ru-RU"/>
     </w:rPr>
   </w:style>
-  <w:style w:type="character" w:styleId="afffff1">
+  <w:style w:type="character" w:styleId="afffff2">
     <w:name w:val="FollowedHyperlink"/>
     <w:basedOn w:val="af0"/>
     <w:uiPriority w:val="99"/>
@@ -8962,7 +9154,7 @@
       <w:u w:val="single"/>
     </w:rPr>
   </w:style>
-  <w:style w:type="character" w:styleId="afffff2">
+  <w:style w:type="character" w:styleId="afffff3">
     <w:name w:val="annotation reference"/>
     <w:basedOn w:val="af0"/>
     <w:uiPriority w:val="99"/>
@@ -8974,10 +9166,10 @@
       <w:szCs w:val="16"/>
     </w:rPr>
   </w:style>
-  <w:style w:type="paragraph" w:styleId="afffff3">
+  <w:style w:type="paragraph" w:styleId="afffff4">
     <w:name w:val="annotation text"/>
     <w:basedOn w:val="af"/>
-    <w:link w:val="afffff4"/>
+    <w:link w:val="afffff5"/>
     <w:uiPriority w:val="99"/>
     <w:semiHidden/>
     <w:unhideWhenUsed/>
@@ -8986,10 +9178,10 @@
       <w:spacing w:line="240" w:lineRule="auto"/>
     </w:pPr>
   </w:style>
-  <w:style w:type="character" w:customStyle="1" w:styleId="afffff4">
+  <w:style w:type="character" w:customStyle="1" w:styleId="afffff5">
     <w:name w:val="Текст примечания Знак"/>
     <w:basedOn w:val="af0"/>
-    <w:link w:val="afffff3"/>
+    <w:link w:val="afffff4"/>
     <w:uiPriority w:val="99"/>
     <w:semiHidden/>
     <w:rsid w:val="00A328C2"/>
@@ -9000,11 +9192,11 @@
       <w:lang w:eastAsia="ru-RU"/>
     </w:rPr>
   </w:style>
-  <w:style w:type="paragraph" w:styleId="afffff5">
+  <w:style w:type="paragraph" w:styleId="afffff6">
     <w:name w:val="annotation subject"/>
-    <w:basedOn w:val="afffff3"/>
-    <w:next w:val="afffff3"/>
-    <w:link w:val="afffff6"/>
+    <w:basedOn w:val="afffff4"/>
+    <w:next w:val="afffff4"/>
+    <w:link w:val="afffff7"/>
     <w:uiPriority w:val="99"/>
     <w:semiHidden/>
     <w:unhideWhenUsed/>
@@ -9014,10 +9206,10 @@
       <w:bCs/>
     </w:rPr>
   </w:style>
-  <w:style w:type="character" w:customStyle="1" w:styleId="afffff6">
+  <w:style w:type="character" w:customStyle="1" w:styleId="afffff7">
     <w:name w:val="Тема примечания Знак"/>
-    <w:basedOn w:val="afffff4"/>
-    <w:link w:val="afffff5"/>
+    <w:basedOn w:val="afffff5"/>
+    <w:link w:val="afffff6"/>
     <w:uiPriority w:val="99"/>
     <w:semiHidden/>
     <w:rsid w:val="00A328C2"/>
@@ -9095,20 +9287,20 @@
       <w:lang w:eastAsia="ru-RU"/>
     </w:rPr>
   </w:style>
-  <w:style w:type="paragraph" w:customStyle="1" w:styleId="35">
+  <w:style w:type="paragraph" w:customStyle="1" w:styleId="34">
     <w:name w:val="Стиль3"/>
-    <w:basedOn w:val="affa"/>
-    <w:link w:val="36"/>
+    <w:basedOn w:val="affb"/>
+    <w:link w:val="35"/>
     <w:qFormat/>
     <w:rsid w:val="00B25A59"/>
     <w:rPr>
       <w:lang w:val="ru-RU"/>
     </w:rPr>
   </w:style>
-  <w:style w:type="character" w:customStyle="1" w:styleId="affb">
+  <w:style w:type="character" w:customStyle="1" w:styleId="affc">
     <w:name w:val="ДОК Таблица Заголовок Знак"/>
     <w:basedOn w:val="af0"/>
-    <w:link w:val="affa"/>
+    <w:link w:val="affb"/>
     <w:rsid w:val="00B25A59"/>
     <w:rPr>
       <w:rFonts w:ascii="Arial Narrow" w:eastAsia="Arial Unicode MS" w:hAnsi="Arial Narrow" w:cs="Times New Roman"/>
@@ -9118,10 +9310,10 @@
       <w:lang w:val="en-US" w:eastAsia="ru-RU"/>
     </w:rPr>
   </w:style>
-  <w:style w:type="character" w:customStyle="1" w:styleId="36">
+  <w:style w:type="character" w:customStyle="1" w:styleId="35">
     <w:name w:val="Стиль3 Знак"/>
-    <w:basedOn w:val="affb"/>
-    <w:link w:val="35"/>
+    <w:basedOn w:val="affc"/>
+    <w:link w:val="34"/>
     <w:rsid w:val="00B25A59"/>
     <w:rPr>
       <w:rFonts w:ascii="Arial Narrow" w:eastAsia="Arial Unicode MS" w:hAnsi="Arial Narrow" w:cs="Times New Roman"/>
@@ -9141,7 +9333,7 @@
     </w:pPr>
     <w:tblPr/>
   </w:style>
-  <w:style w:type="character" w:styleId="afffff7">
+  <w:style w:type="character" w:styleId="afffff8">
     <w:name w:val="line number"/>
     <w:basedOn w:val="af0"/>
     <w:uiPriority w:val="99"/>
@@ -9177,7 +9369,7 @@
   <w:style w:type="table" w:customStyle="1" w:styleId="29">
     <w:name w:val="Сетка таблицы2"/>
     <w:basedOn w:val="af1"/>
-    <w:next w:val="aff6"/>
+    <w:next w:val="aff7"/>
     <w:uiPriority w:val="59"/>
     <w:rsid w:val="00D76C1B"/>
     <w:pPr>
@@ -9200,7 +9392,7 @@
       </w:tblBorders>
     </w:tblPr>
   </w:style>
-  <w:style w:type="paragraph" w:customStyle="1" w:styleId="afffff8">
+  <w:style w:type="paragraph" w:customStyle="1" w:styleId="afffff9">
     <w:name w:val="ДОК Заголовок вкл в содержание"/>
     <w:basedOn w:val="af"/>
     <w:uiPriority w:val="9"/>
@@ -9223,10 +9415,10 @@
       <w:szCs w:val="22"/>
     </w:rPr>
   </w:style>
-  <w:style w:type="paragraph" w:customStyle="1" w:styleId="afffff9">
+  <w:style w:type="paragraph" w:customStyle="1" w:styleId="afffffa">
     <w:name w:val="ДОК Заголовок не вкл в содержание"/>
     <w:basedOn w:val="af"/>
-    <w:link w:val="afffffa"/>
+    <w:link w:val="afffffb"/>
     <w:qFormat/>
     <w:rsid w:val="00D76C1B"/>
     <w:pPr>
@@ -9245,7 +9437,7 @@
       <w:szCs w:val="22"/>
     </w:rPr>
   </w:style>
-  <w:style w:type="paragraph" w:customStyle="1" w:styleId="afffffb">
+  <w:style w:type="paragraph" w:customStyle="1" w:styleId="afffffc">
     <w:name w:val="ПРИЛ Текст"/>
     <w:basedOn w:val="af7"/>
     <w:qFormat/>
@@ -9263,7 +9455,7 @@
   </w:style>
   <w:style w:type="paragraph" w:customStyle="1" w:styleId="ab">
     <w:name w:val="ПРИЛ Заголовок"/>
-    <w:basedOn w:val="afffffb"/>
+    <w:basedOn w:val="afffffc"/>
     <w:next w:val="31-"/>
     <w:qFormat/>
     <w:rsid w:val="00D76C1B"/>
@@ -9282,7 +9474,7 @@
   </w:style>
   <w:style w:type="paragraph" w:customStyle="1" w:styleId="31-">
     <w:name w:val="ПРИЛ 3уров 1-раздел"/>
-    <w:basedOn w:val="afffffb"/>
+    <w:basedOn w:val="afffffc"/>
     <w:next w:val="af"/>
     <w:qFormat/>
     <w:rsid w:val="00D76C1B"/>
@@ -9300,7 +9492,7 @@
   </w:style>
   <w:style w:type="paragraph" w:customStyle="1" w:styleId="22-">
     <w:name w:val="ПРИЛ 2уров 2-подпункт"/>
-    <w:basedOn w:val="afffffb"/>
+    <w:basedOn w:val="afffffc"/>
     <w:qFormat/>
     <w:rsid w:val="00D76C1B"/>
     <w:pPr>
@@ -9312,7 +9504,7 @@
   </w:style>
   <w:style w:type="paragraph" w:customStyle="1" w:styleId="21-">
     <w:name w:val="ПРИЛ 2уров 1-пункт"/>
-    <w:basedOn w:val="afffffb"/>
+    <w:basedOn w:val="afffffc"/>
     <w:qFormat/>
     <w:rsid w:val="00D76C1B"/>
     <w:pPr>
@@ -9327,7 +9519,7 @@
   </w:style>
   <w:style w:type="paragraph" w:customStyle="1" w:styleId="32-">
     <w:name w:val="ПРИЛ 3уров 2-пункт"/>
-    <w:basedOn w:val="afffffb"/>
+    <w:basedOn w:val="afffffc"/>
     <w:qFormat/>
     <w:rsid w:val="00D76C1B"/>
     <w:pPr>
@@ -9342,7 +9534,7 @@
   </w:style>
   <w:style w:type="paragraph" w:customStyle="1" w:styleId="33-">
     <w:name w:val="ПРИЛ 3уров 3-подпункт"/>
-    <w:basedOn w:val="afffffb"/>
+    <w:basedOn w:val="afffffc"/>
     <w:qFormat/>
     <w:rsid w:val="00D76C1B"/>
     <w:pPr>
@@ -9358,7 +9550,7 @@
   <w:style w:type="paragraph" w:customStyle="1" w:styleId="ac">
     <w:name w:val="ПРИЛ Таблица Название"/>
     <w:basedOn w:val="af7"/>
-    <w:next w:val="afffffb"/>
+    <w:next w:val="afffffc"/>
     <w:qFormat/>
     <w:rsid w:val="00D76C1B"/>
     <w:pPr>
@@ -9376,8 +9568,8 @@
   </w:style>
   <w:style w:type="paragraph" w:customStyle="1" w:styleId="ad">
     <w:name w:val="ПРИЛ Рисунок Название"/>
-    <w:basedOn w:val="afffffb"/>
-    <w:next w:val="afffffb"/>
+    <w:basedOn w:val="afffffc"/>
+    <w:next w:val="afffffc"/>
     <w:qFormat/>
     <w:rsid w:val="00D76C1B"/>
     <w:pPr>
@@ -9392,7 +9584,7 @@
       <w:lang w:val="ru-RU"/>
     </w:rPr>
   </w:style>
-  <w:style w:type="paragraph" w:customStyle="1" w:styleId="afffffc">
+  <w:style w:type="paragraph" w:customStyle="1" w:styleId="afffffd">
     <w:name w:val="ДОК Рисунок Поле"/>
     <w:basedOn w:val="af7"/>
     <w:uiPriority w:val="99"/>
@@ -9409,9 +9601,9 @@
       <w:szCs w:val="28"/>
     </w:rPr>
   </w:style>
-  <w:style w:type="paragraph" w:customStyle="1" w:styleId="afffffd">
+  <w:style w:type="paragraph" w:customStyle="1" w:styleId="afffffe">
     <w:name w:val="ДОК Таблица Текст Нумерованный"/>
-    <w:basedOn w:val="affc"/>
+    <w:basedOn w:val="affd"/>
     <w:qFormat/>
     <w:rsid w:val="00D76C1B"/>
     <w:pPr>
@@ -9427,7 +9619,7 @@
   </w:style>
   <w:style w:type="paragraph" w:customStyle="1" w:styleId="-0">
     <w:name w:val="ДОК Таблица Текст список -"/>
-    <w:basedOn w:val="affc"/>
+    <w:basedOn w:val="affd"/>
     <w:uiPriority w:val="99"/>
     <w:rsid w:val="00D76C1B"/>
     <w:pPr>
@@ -9446,7 +9638,7 @@
   </w:style>
   <w:style w:type="paragraph" w:customStyle="1" w:styleId="120">
     <w:name w:val="ДОК Текст 12"/>
-    <w:basedOn w:val="afff0"/>
+    <w:basedOn w:val="afff1"/>
     <w:uiPriority w:val="99"/>
     <w:rsid w:val="00D76C1B"/>
     <w:pPr>
@@ -9471,7 +9663,7 @@
       <w:szCs w:val="20"/>
     </w:rPr>
   </w:style>
-  <w:style w:type="paragraph" w:customStyle="1" w:styleId="afffffe">
+  <w:style w:type="paragraph" w:customStyle="1" w:styleId="affffff">
     <w:name w:val="ДОК Базовый с маленьким интервалом"/>
     <w:basedOn w:val="af7"/>
     <w:uiPriority w:val="99"/>
@@ -9486,7 +9678,7 @@
       <w:szCs w:val="28"/>
     </w:rPr>
   </w:style>
-  <w:style w:type="paragraph" w:customStyle="1" w:styleId="affffff">
+  <w:style w:type="paragraph" w:customStyle="1" w:styleId="affffff0">
     <w:name w:val="ДОК Базовый с большим интервалом"/>
     <w:basedOn w:val="af7"/>
     <w:uiPriority w:val="99"/>
@@ -9502,7 +9694,7 @@
   </w:style>
   <w:style w:type="paragraph" w:customStyle="1" w:styleId="-">
     <w:name w:val="ДОК Текст список -"/>
-    <w:basedOn w:val="afff0"/>
+    <w:basedOn w:val="afff1"/>
     <w:link w:val="-1"/>
     <w:qFormat/>
     <w:rsid w:val="00D76C1B"/>
@@ -9521,7 +9713,7 @@
   </w:style>
   <w:style w:type="paragraph" w:customStyle="1" w:styleId="ae">
     <w:name w:val="ДОК Текст список абв"/>
-    <w:basedOn w:val="afff0"/>
+    <w:basedOn w:val="afff1"/>
     <w:uiPriority w:val="99"/>
     <w:rsid w:val="00D76C1B"/>
     <w:pPr>
@@ -9539,7 +9731,7 @@
   </w:style>
   <w:style w:type="paragraph" w:customStyle="1" w:styleId="341-">
     <w:name w:val="ДОК Текст 3/4уров 1-раздел"/>
-    <w:basedOn w:val="afff0"/>
+    <w:basedOn w:val="afff1"/>
     <w:next w:val="42-"/>
     <w:qFormat/>
     <w:rsid w:val="00D76C1B"/>
@@ -9558,7 +9750,7 @@
   </w:style>
   <w:style w:type="paragraph" w:customStyle="1" w:styleId="32-0">
     <w:name w:val="ДОК Текст 3уров 2-пункт"/>
-    <w:basedOn w:val="afff0"/>
+    <w:basedOn w:val="afff1"/>
     <w:uiPriority w:val="99"/>
     <w:rsid w:val="00D76C1B"/>
     <w:pPr>
@@ -9575,7 +9767,7 @@
   </w:style>
   <w:style w:type="paragraph" w:customStyle="1" w:styleId="42-">
     <w:name w:val="ДОК Текст 4уров 2-подраздел"/>
-    <w:basedOn w:val="afff0"/>
+    <w:basedOn w:val="afff1"/>
     <w:next w:val="43-"/>
     <w:qFormat/>
     <w:rsid w:val="00D76C1B"/>
@@ -9596,7 +9788,7 @@
   </w:style>
   <w:style w:type="paragraph" w:customStyle="1" w:styleId="33-0">
     <w:name w:val="ДОК Текст 3уров 3-подпункт"/>
-    <w:basedOn w:val="afff0"/>
+    <w:basedOn w:val="afff1"/>
     <w:uiPriority w:val="99"/>
     <w:rsid w:val="00D76C1B"/>
     <w:pPr>
@@ -9611,7 +9803,7 @@
   </w:style>
   <w:style w:type="paragraph" w:customStyle="1" w:styleId="43-">
     <w:name w:val="ДОК Текст 4уров 3-пункт"/>
-    <w:basedOn w:val="afff0"/>
+    <w:basedOn w:val="afff1"/>
     <w:uiPriority w:val="99"/>
     <w:rsid w:val="00D76C1B"/>
     <w:pPr>
@@ -9627,7 +9819,7 @@
   </w:style>
   <w:style w:type="paragraph" w:customStyle="1" w:styleId="44-">
     <w:name w:val="ДОК Текст 4уров 4-подпункт"/>
-    <w:basedOn w:val="afff0"/>
+    <w:basedOn w:val="afff1"/>
     <w:qFormat/>
     <w:rsid w:val="00D76C1B"/>
     <w:pPr>
@@ -9640,10 +9832,10 @@
       <w:szCs w:val="28"/>
     </w:rPr>
   </w:style>
-  <w:style w:type="paragraph" w:customStyle="1" w:styleId="affffff0">
+  <w:style w:type="paragraph" w:customStyle="1" w:styleId="affffff1">
     <w:name w:val="ДОК титул"/>
     <w:basedOn w:val="af7"/>
-    <w:link w:val="affffff1"/>
+    <w:link w:val="affffff2"/>
     <w:qFormat/>
     <w:rsid w:val="00D76C1B"/>
     <w:pPr>
@@ -9656,10 +9848,10 @@
       <w:szCs w:val="28"/>
     </w:rPr>
   </w:style>
-  <w:style w:type="table" w:customStyle="1" w:styleId="37">
+  <w:style w:type="table" w:customStyle="1" w:styleId="36">
     <w:name w:val="Сетка таблицы3"/>
     <w:basedOn w:val="af1"/>
-    <w:next w:val="aff6"/>
+    <w:next w:val="aff7"/>
     <w:uiPriority w:val="59"/>
     <w:rsid w:val="00D76C1B"/>
     <w:pPr>
@@ -9684,7 +9876,7 @@
   <w:style w:type="table" w:customStyle="1" w:styleId="46">
     <w:name w:val="Сетка таблицы4"/>
     <w:basedOn w:val="af1"/>
-    <w:next w:val="aff6"/>
+    <w:next w:val="aff7"/>
     <w:uiPriority w:val="59"/>
     <w:rsid w:val="00D76C1B"/>
     <w:pPr>
@@ -9722,7 +9914,7 @@
   <w:style w:type="table" w:customStyle="1" w:styleId="53">
     <w:name w:val="Сетка таблицы5"/>
     <w:basedOn w:val="af1"/>
-    <w:next w:val="aff6"/>
+    <w:next w:val="aff7"/>
     <w:uiPriority w:val="59"/>
     <w:rsid w:val="00D76C1B"/>
     <w:pPr>
@@ -9764,7 +9956,7 @@
       </w:numPr>
     </w:pPr>
   </w:style>
-  <w:style w:type="numbering" w:customStyle="1" w:styleId="affffff2">
+  <w:style w:type="numbering" w:customStyle="1" w:styleId="affffff3">
     <w:name w:val="Текст документа"/>
     <w:uiPriority w:val="99"/>
     <w:rsid w:val="00D76C1B"/>
@@ -9772,7 +9964,7 @@
   <w:style w:type="table" w:customStyle="1" w:styleId="63">
     <w:name w:val="Сетка таблицы6"/>
     <w:basedOn w:val="af1"/>
-    <w:next w:val="aff6"/>
+    <w:next w:val="aff7"/>
     <w:uiPriority w:val="59"/>
     <w:rsid w:val="00D76C1B"/>
     <w:pPr>
@@ -9794,9 +9986,9 @@
       </w:tblBorders>
     </w:tblPr>
   </w:style>
-  <w:style w:type="paragraph" w:customStyle="1" w:styleId="affffff3">
+  <w:style w:type="paragraph" w:customStyle="1" w:styleId="affffff4">
     <w:name w:val="ДОК Текст Центр"/>
-    <w:basedOn w:val="afff0"/>
+    <w:basedOn w:val="afff1"/>
     <w:qFormat/>
     <w:rsid w:val="00D76C1B"/>
     <w:pPr>
@@ -9986,7 +10178,7 @@
   <w:style w:type="table" w:customStyle="1" w:styleId="72">
     <w:name w:val="Сетка таблицы7"/>
     <w:basedOn w:val="af1"/>
-    <w:next w:val="aff6"/>
+    <w:next w:val="aff7"/>
     <w:uiPriority w:val="59"/>
     <w:rsid w:val="00D76C1B"/>
     <w:pPr>
@@ -10020,7 +10212,7 @@
   <w:style w:type="table" w:customStyle="1" w:styleId="92">
     <w:name w:val="Сетка таблицы9"/>
     <w:basedOn w:val="af1"/>
-    <w:next w:val="aff6"/>
+    <w:next w:val="aff7"/>
     <w:uiPriority w:val="59"/>
     <w:rsid w:val="00D76C1B"/>
     <w:pPr>
@@ -10045,7 +10237,7 @@
   <w:style w:type="table" w:customStyle="1" w:styleId="103">
     <w:name w:val="Сетка таблицы10"/>
     <w:basedOn w:val="af1"/>
-    <w:next w:val="aff6"/>
+    <w:next w:val="aff7"/>
     <w:uiPriority w:val="59"/>
     <w:rsid w:val="00D76C1B"/>
     <w:pPr>
@@ -10206,7 +10398,7 @@
   <w:style w:type="table" w:customStyle="1" w:styleId="110">
     <w:name w:val="Сетка таблицы11"/>
     <w:basedOn w:val="af1"/>
-    <w:next w:val="aff6"/>
+    <w:next w:val="aff7"/>
     <w:uiPriority w:val="59"/>
     <w:rsid w:val="00D76C1B"/>
     <w:pPr>
@@ -10264,7 +10456,7 @@
   <w:style w:type="table" w:customStyle="1" w:styleId="130">
     <w:name w:val="Сетка таблицы13"/>
     <w:basedOn w:val="af1"/>
-    <w:next w:val="aff6"/>
+    <w:next w:val="aff7"/>
     <w:uiPriority w:val="59"/>
     <w:rsid w:val="00D76C1B"/>
     <w:pPr>
@@ -10356,7 +10548,7 @@
       <w:szCs w:val="22"/>
     </w:rPr>
   </w:style>
-  <w:style w:type="paragraph" w:customStyle="1" w:styleId="38">
+  <w:style w:type="paragraph" w:customStyle="1" w:styleId="37">
     <w:name w:val="ДОК Текст ур3 пункт"/>
     <w:basedOn w:val="af"/>
     <w:qFormat/>
@@ -10407,9 +10599,9 @@
       <w:lang w:eastAsia="ru-RU"/>
     </w:rPr>
   </w:style>
-  <w:style w:type="character" w:customStyle="1" w:styleId="affffff4">
+  <w:style w:type="character" w:customStyle="1" w:styleId="affffff5">
     <w:name w:val="ДОК Таблица Нумерация Знак"/>
-    <w:basedOn w:val="affd"/>
+    <w:basedOn w:val="affe"/>
     <w:link w:val="a0"/>
     <w:uiPriority w:val="24"/>
     <w:locked/>
@@ -10424,8 +10616,8 @@
   </w:style>
   <w:style w:type="paragraph" w:customStyle="1" w:styleId="a0">
     <w:name w:val="ДОК Таблица Нумерация"/>
-    <w:basedOn w:val="affc"/>
-    <w:link w:val="affffff4"/>
+    <w:basedOn w:val="affd"/>
+    <w:link w:val="affffff5"/>
     <w:uiPriority w:val="24"/>
     <w:qFormat/>
     <w:rsid w:val="00D76C1B"/>
@@ -10456,10 +10648,10 @@
       <w:szCs w:val="24"/>
     </w:rPr>
   </w:style>
-  <w:style w:type="paragraph" w:styleId="affffff5">
+  <w:style w:type="paragraph" w:styleId="affffff6">
     <w:name w:val="footnote text"/>
     <w:basedOn w:val="af"/>
-    <w:link w:val="affffff6"/>
+    <w:link w:val="affffff7"/>
     <w:uiPriority w:val="99"/>
     <w:semiHidden/>
     <w:unhideWhenUsed/>
@@ -10468,10 +10660,10 @@
       <w:rFonts w:ascii="Times New Roman" w:hAnsi="Times New Roman"/>
     </w:rPr>
   </w:style>
-  <w:style w:type="character" w:customStyle="1" w:styleId="affffff6">
+  <w:style w:type="character" w:customStyle="1" w:styleId="affffff7">
     <w:name w:val="Текст сноски Знак"/>
     <w:basedOn w:val="af0"/>
-    <w:link w:val="affffff5"/>
+    <w:link w:val="affffff6"/>
     <w:uiPriority w:val="99"/>
     <w:semiHidden/>
     <w:rsid w:val="00D76C1B"/>
@@ -10482,7 +10674,7 @@
       <w:lang w:eastAsia="ru-RU"/>
     </w:rPr>
   </w:style>
-  <w:style w:type="paragraph" w:styleId="affffff7">
+  <w:style w:type="paragraph" w:styleId="affffff8">
     <w:name w:val="toa heading"/>
     <w:basedOn w:val="af"/>
     <w:next w:val="af"/>
@@ -10503,10 +10695,10 @@
       <w:lang w:eastAsia="en-US"/>
     </w:rPr>
   </w:style>
-  <w:style w:type="paragraph" w:styleId="39">
+  <w:style w:type="paragraph" w:styleId="38">
     <w:name w:val="Body Text 3"/>
     <w:basedOn w:val="af"/>
-    <w:link w:val="3a"/>
+    <w:link w:val="39"/>
     <w:uiPriority w:val="99"/>
     <w:semiHidden/>
     <w:unhideWhenUsed/>
@@ -10521,10 +10713,10 @@
       <w:szCs w:val="16"/>
     </w:rPr>
   </w:style>
-  <w:style w:type="character" w:customStyle="1" w:styleId="3a">
+  <w:style w:type="character" w:customStyle="1" w:styleId="39">
     <w:name w:val="Основной текст 3 Знак"/>
     <w:basedOn w:val="af0"/>
-    <w:link w:val="39"/>
+    <w:link w:val="38"/>
     <w:uiPriority w:val="99"/>
     <w:semiHidden/>
     <w:rsid w:val="00D76C1B"/>
@@ -10535,10 +10727,10 @@
       <w:lang w:eastAsia="ru-RU"/>
     </w:rPr>
   </w:style>
-  <w:style w:type="paragraph" w:styleId="3b">
+  <w:style w:type="paragraph" w:styleId="3a">
     <w:name w:val="Body Text Indent 3"/>
     <w:basedOn w:val="af"/>
-    <w:link w:val="3c"/>
+    <w:link w:val="3b"/>
     <w:uiPriority w:val="99"/>
     <w:semiHidden/>
     <w:unhideWhenUsed/>
@@ -10554,10 +10746,10 @@
       <w:szCs w:val="16"/>
     </w:rPr>
   </w:style>
-  <w:style w:type="character" w:customStyle="1" w:styleId="3c">
+  <w:style w:type="character" w:customStyle="1" w:styleId="3b">
     <w:name w:val="Основной текст с отступом 3 Знак"/>
     <w:basedOn w:val="af0"/>
-    <w:link w:val="3b"/>
+    <w:link w:val="3a"/>
     <w:uiPriority w:val="99"/>
     <w:semiHidden/>
     <w:rsid w:val="00D76C1B"/>
@@ -10568,7 +10760,7 @@
       <w:lang w:eastAsia="ru-RU"/>
     </w:rPr>
   </w:style>
-  <w:style w:type="paragraph" w:styleId="affffff8">
+  <w:style w:type="paragraph" w:styleId="affffff9">
     <w:name w:val="Revision"/>
     <w:uiPriority w:val="99"/>
     <w:semiHidden/>
@@ -10583,10 +10775,10 @@
       <w:lang w:eastAsia="ru-RU"/>
     </w:rPr>
   </w:style>
-  <w:style w:type="character" w:customStyle="1" w:styleId="afffffa">
+  <w:style w:type="character" w:customStyle="1" w:styleId="afffffb">
     <w:name w:val="ДОК Заголовок не вкл в содержание Знак"/>
     <w:basedOn w:val="af0"/>
-    <w:link w:val="afffff9"/>
+    <w:link w:val="afffffa"/>
     <w:locked/>
     <w:rsid w:val="00D76C1B"/>
     <w:rPr>
@@ -10614,7 +10806,7 @@
   </w:style>
   <w:style w:type="paragraph" w:customStyle="1" w:styleId="10">
     <w:name w:val="ДОК ПРИЛ ур1 Заголовок"/>
-    <w:basedOn w:val="afff0"/>
+    <w:basedOn w:val="afff1"/>
     <w:next w:val="af"/>
     <w:qFormat/>
     <w:rsid w:val="00D76C1B"/>
@@ -10652,9 +10844,9 @@
       <w:sz w:val="22"/>
     </w:rPr>
   </w:style>
-  <w:style w:type="character" w:customStyle="1" w:styleId="3d">
+  <w:style w:type="character" w:customStyle="1" w:styleId="3c">
     <w:name w:val="ДОК ПРИЛ ур3 подраздел Знак"/>
-    <w:basedOn w:val="afff1"/>
+    <w:basedOn w:val="afff2"/>
     <w:link w:val="3"/>
     <w:locked/>
     <w:rsid w:val="00D76C1B"/>
@@ -10668,8 +10860,8 @@
   </w:style>
   <w:style w:type="paragraph" w:customStyle="1" w:styleId="3">
     <w:name w:val="ДОК ПРИЛ ур3 подраздел"/>
-    <w:basedOn w:val="afff0"/>
-    <w:link w:val="3d"/>
+    <w:basedOn w:val="afff1"/>
+    <w:link w:val="3c"/>
     <w:qFormat/>
     <w:rsid w:val="00D76C1B"/>
     <w:pPr>
@@ -10689,7 +10881,7 @@
   <w:style w:type="paragraph" w:customStyle="1" w:styleId="a5">
     <w:name w:val="ДОК ПРИЛ Таблица Название"/>
     <w:basedOn w:val="a7"/>
-    <w:next w:val="afff0"/>
+    <w:next w:val="afff1"/>
     <w:qFormat/>
     <w:rsid w:val="00D76C1B"/>
     <w:pPr>
@@ -10711,7 +10903,7 @@
   <w:style w:type="paragraph" w:customStyle="1" w:styleId="a6">
     <w:name w:val="ДОК ПРИЛ Рисунок Название"/>
     <w:basedOn w:val="a8"/>
-    <w:next w:val="afff0"/>
+    <w:next w:val="afff1"/>
     <w:qFormat/>
     <w:rsid w:val="00D76C1B"/>
     <w:pPr>
@@ -10789,7 +10981,7 @@
       <w:lang w:eastAsia="en-US"/>
     </w:rPr>
   </w:style>
-  <w:style w:type="paragraph" w:customStyle="1" w:styleId="affffff9">
+  <w:style w:type="paragraph" w:customStyle="1" w:styleId="affffffa">
     <w:name w:val="СО"/>
     <w:basedOn w:val="af"/>
     <w:semiHidden/>
@@ -10807,7 +10999,7 @@
       <w:szCs w:val="24"/>
     </w:rPr>
   </w:style>
-  <w:style w:type="paragraph" w:customStyle="1" w:styleId="affffffa">
+  <w:style w:type="paragraph" w:customStyle="1" w:styleId="affffffb">
     <w:name w:val="ВИД ДОКУМЕНТА"/>
     <w:basedOn w:val="af"/>
     <w:semiHidden/>
@@ -10824,10 +11016,10 @@
       <w:sz w:val="36"/>
     </w:rPr>
   </w:style>
-  <w:style w:type="character" w:customStyle="1" w:styleId="affffff1">
+  <w:style w:type="character" w:customStyle="1" w:styleId="affffff2">
     <w:name w:val="ДОК титул Знак"/>
-    <w:basedOn w:val="afff1"/>
-    <w:link w:val="affffff0"/>
+    <w:basedOn w:val="afff2"/>
+    <w:link w:val="affffff1"/>
     <w:locked/>
     <w:rsid w:val="00D76C1B"/>
     <w:rPr>
@@ -10840,7 +11032,7 @@
   </w:style>
   <w:style w:type="character" w:customStyle="1" w:styleId="-1">
     <w:name w:val="ДОК Текст список - Знак"/>
-    <w:basedOn w:val="afff1"/>
+    <w:basedOn w:val="afff2"/>
     <w:link w:val="-"/>
     <w:locked/>
     <w:rsid w:val="00D76C1B"/>
@@ -10852,10 +11044,10 @@
       <w:lang w:eastAsia="ru-RU"/>
     </w:rPr>
   </w:style>
-  <w:style w:type="character" w:customStyle="1" w:styleId="affffffb">
+  <w:style w:type="character" w:customStyle="1" w:styleId="affffffc">
     <w:name w:val="ДОК Заголовок не вкл в содержание по центру Знак"/>
-    <w:basedOn w:val="afffffa"/>
-    <w:link w:val="affffffc"/>
+    <w:basedOn w:val="afffffb"/>
+    <w:link w:val="affffffd"/>
     <w:locked/>
     <w:rsid w:val="00D76C1B"/>
     <w:rPr>
@@ -10866,10 +11058,10 @@
       <w:lang w:eastAsia="ru-RU"/>
     </w:rPr>
   </w:style>
-  <w:style w:type="paragraph" w:customStyle="1" w:styleId="affffffc">
+  <w:style w:type="paragraph" w:customStyle="1" w:styleId="affffffd">
     <w:name w:val="ДОК Заголовок не вкл в содержание по центру"/>
-    <w:basedOn w:val="afffff9"/>
-    <w:link w:val="affffffb"/>
+    <w:basedOn w:val="afffffa"/>
+    <w:link w:val="affffffc"/>
     <w:qFormat/>
     <w:rsid w:val="00D76C1B"/>
     <w:pPr>
@@ -10879,7 +11071,7 @@
   </w:style>
   <w:style w:type="character" w:customStyle="1" w:styleId="2c">
     <w:name w:val="ДОК ПРИЛ ур2 раздел Знак"/>
-    <w:basedOn w:val="3d"/>
+    <w:basedOn w:val="3c"/>
     <w:link w:val="2"/>
     <w:locked/>
     <w:rsid w:val="00D76C1B"/>
@@ -10893,7 +11085,7 @@
   </w:style>
   <w:style w:type="paragraph" w:customStyle="1" w:styleId="2">
     <w:name w:val="ДОК ПРИЛ ур2 раздел"/>
-    <w:basedOn w:val="afff0"/>
+    <w:basedOn w:val="afff1"/>
     <w:link w:val="2c"/>
     <w:qFormat/>
     <w:rsid w:val="00D76C1B"/>
@@ -10913,7 +11105,7 @@
   </w:style>
   <w:style w:type="paragraph" w:customStyle="1" w:styleId="a3">
     <w:name w:val="ДОК Текст термины"/>
-    <w:basedOn w:val="afff0"/>
+    <w:basedOn w:val="afff1"/>
     <w:uiPriority w:val="99"/>
     <w:rsid w:val="00D76C1B"/>
     <w:pPr>
@@ -10943,9 +11135,9 @@
       <w:outlineLvl w:val="9"/>
     </w:pPr>
   </w:style>
-  <w:style w:type="paragraph" w:customStyle="1" w:styleId="affffffd">
+  <w:style w:type="paragraph" w:customStyle="1" w:styleId="affffffe">
     <w:name w:val="ДОК Текст приложение"/>
-    <w:basedOn w:val="afff0"/>
+    <w:basedOn w:val="afff1"/>
     <w:uiPriority w:val="99"/>
     <w:qFormat/>
     <w:rsid w:val="00D76C1B"/>
@@ -10959,10 +11151,10 @@
       <w:szCs w:val="28"/>
     </w:rPr>
   </w:style>
-  <w:style w:type="paragraph" w:customStyle="1" w:styleId="affffffe">
+  <w:style w:type="paragraph" w:customStyle="1" w:styleId="afffffff">
     <w:name w:val="ДОК Текст нумерованный"/>
     <w:basedOn w:val="af"/>
-    <w:next w:val="afff0"/>
+    <w:next w:val="afff1"/>
     <w:semiHidden/>
     <w:locked/>
     <w:rsid w:val="00D76C1B"/>
@@ -10983,12 +11175,12 @@
   </w:style>
   <w:style w:type="paragraph" w:customStyle="1" w:styleId="2e">
     <w:name w:val="ДОК Текст нумерованный 2"/>
-    <w:basedOn w:val="affffffe"/>
+    <w:basedOn w:val="afffffff"/>
     <w:semiHidden/>
     <w:locked/>
     <w:rsid w:val="00D76C1B"/>
   </w:style>
-  <w:style w:type="paragraph" w:customStyle="1" w:styleId="afffffff">
+  <w:style w:type="paragraph" w:customStyle="1" w:styleId="afffffff0">
     <w:name w:val="РИСУНОК"/>
     <w:basedOn w:val="af7"/>
     <w:next w:val="af7"/>
@@ -11006,8 +11198,8 @@
   </w:style>
   <w:style w:type="paragraph" w:customStyle="1" w:styleId="104">
     <w:name w:val="ДОК Текст 10"/>
-    <w:basedOn w:val="afff0"/>
-    <w:next w:val="afff0"/>
+    <w:basedOn w:val="afff1"/>
+    <w:next w:val="afff1"/>
     <w:uiPriority w:val="99"/>
     <w:rsid w:val="00D76C1B"/>
     <w:pPr>
@@ -11023,7 +11215,7 @@
   </w:style>
   <w:style w:type="paragraph" w:customStyle="1" w:styleId="141">
     <w:name w:val="Стиль ДОК Таблица Текст + 14 пт"/>
-    <w:basedOn w:val="affc"/>
+    <w:basedOn w:val="affd"/>
     <w:rsid w:val="00D76C1B"/>
     <w:pPr>
       <w:keepLines/>
@@ -11052,7 +11244,7 @@
   </w:style>
   <w:style w:type="character" w:customStyle="1" w:styleId="123">
     <w:name w:val="ДОК Таблица Текст 12 Знак"/>
-    <w:basedOn w:val="aff9"/>
+    <w:basedOn w:val="affa"/>
     <w:link w:val="124"/>
     <w:locked/>
     <w:rsid w:val="00D76C1B"/>
@@ -11103,7 +11295,7 @@
       <w:noProof/>
     </w:rPr>
   </w:style>
-  <w:style w:type="character" w:styleId="afffffff0">
+  <w:style w:type="character" w:styleId="afffffff1">
     <w:name w:val="footnote reference"/>
     <w:basedOn w:val="af0"/>
     <w:uiPriority w:val="99"/>
@@ -11549,14 +11741,14 @@
       </w:numPr>
     </w:pPr>
   </w:style>
-  <w:style w:type="numbering" w:customStyle="1" w:styleId="afffffff1">
+  <w:style w:type="numbering" w:customStyle="1" w:styleId="afffffff2">
     <w:name w:val="Приложенине"/>
     <w:uiPriority w:val="99"/>
     <w:rsid w:val="00D76C1B"/>
   </w:style>
   <w:style w:type="numbering" w:customStyle="1" w:styleId="1d">
     <w:name w:val="Приложенине1"/>
-    <w:next w:val="afffffff1"/>
+    <w:next w:val="afffffff2"/>
     <w:uiPriority w:val="99"/>
     <w:rsid w:val="00D76C1B"/>
   </w:style>
@@ -11580,7 +11772,7 @@
     <w:uiPriority w:val="99"/>
     <w:rsid w:val="00D76C1B"/>
   </w:style>
-  <w:style w:type="numbering" w:customStyle="1" w:styleId="3e">
+  <w:style w:type="numbering" w:customStyle="1" w:styleId="3d">
     <w:name w:val="ДОК Список Заголовков3"/>
     <w:uiPriority w:val="99"/>
     <w:rsid w:val="00D76C1B"/>
@@ -11643,7 +11835,7 @@
   </w:style>
   <w:style w:type="numbering" w:customStyle="1" w:styleId="112">
     <w:name w:val="Приложенине11"/>
-    <w:next w:val="afffffff1"/>
+    <w:next w:val="afffffff2"/>
     <w:uiPriority w:val="99"/>
     <w:rsid w:val="00D76C1B"/>
   </w:style>
@@ -11663,13 +11855,13 @@
     <w:uiPriority w:val="99"/>
     <w:rsid w:val="00D76C1B"/>
   </w:style>
-  <w:style w:type="numbering" w:customStyle="1" w:styleId="3f">
+  <w:style w:type="numbering" w:customStyle="1" w:styleId="3e">
     <w:name w:val="ДОК Список Текст Нумерованный3"/>
     <w:basedOn w:val="af2"/>
     <w:uiPriority w:val="99"/>
     <w:rsid w:val="00D76C1B"/>
   </w:style>
-  <w:style w:type="numbering" w:customStyle="1" w:styleId="3f0">
+  <w:style w:type="numbering" w:customStyle="1" w:styleId="3f">
     <w:name w:val="ДОК Список Текст Маркированный3"/>
     <w:basedOn w:val="afd"/>
     <w:uiPriority w:val="99"/>
@@ -11702,7 +11894,7 @@
     <w:uiPriority w:val="99"/>
     <w:rsid w:val="00D76C1B"/>
   </w:style>
-  <w:style w:type="numbering" w:customStyle="1" w:styleId="3f1">
+  <w:style w:type="numbering" w:customStyle="1" w:styleId="3f0">
     <w:name w:val="ДОК Список Нумерованный3"/>
     <w:basedOn w:val="af2"/>
     <w:uiPriority w:val="99"/>
@@ -11734,14 +11926,14 @@
     <w:uiPriority w:val="99"/>
     <w:rsid w:val="00D76C1B"/>
   </w:style>
-  <w:style w:type="numbering" w:customStyle="1" w:styleId="3f2">
+  <w:style w:type="numbering" w:customStyle="1" w:styleId="3f1">
     <w:name w:val="Приложенине3"/>
     <w:uiPriority w:val="99"/>
     <w:rsid w:val="00D76C1B"/>
   </w:style>
   <w:style w:type="numbering" w:customStyle="1" w:styleId="128">
     <w:name w:val="Приложенине12"/>
-    <w:next w:val="afffffff1"/>
+    <w:next w:val="afffffff2"/>
     <w:uiPriority w:val="99"/>
     <w:rsid w:val="00D76C1B"/>
   </w:style>
@@ -11755,7 +11947,7 @@
     <w:basedOn w:val="af2"/>
     <w:rsid w:val="00D76C1B"/>
   </w:style>
-  <w:style w:type="numbering" w:customStyle="1" w:styleId="3f3">
+  <w:style w:type="numbering" w:customStyle="1" w:styleId="3f2">
     <w:name w:val="Нет списка3"/>
     <w:next w:val="af2"/>
     <w:uiPriority w:val="99"/>
@@ -11796,7 +11988,7 @@
   </w:style>
   <w:style w:type="numbering" w:customStyle="1" w:styleId="132">
     <w:name w:val="Приложенине13"/>
-    <w:next w:val="afffffff1"/>
+    <w:next w:val="afffffff2"/>
     <w:uiPriority w:val="99"/>
     <w:rsid w:val="00D76C1B"/>
   </w:style>
@@ -11910,7 +12102,7 @@
   <w:style w:type="table" w:customStyle="1" w:styleId="82">
     <w:name w:val="Сетка таблицы8"/>
     <w:basedOn w:val="af1"/>
-    <w:next w:val="aff6"/>
+    <w:next w:val="aff7"/>
     <w:uiPriority w:val="59"/>
     <w:rsid w:val="00D76C1B"/>
     <w:pPr>
@@ -11932,7 +12124,7 @@
       </w:tblBorders>
     </w:tblPr>
   </w:style>
-  <w:style w:type="table" w:customStyle="1" w:styleId="afffffff2">
+  <w:style w:type="table" w:customStyle="1" w:styleId="afffffff3">
     <w:name w:val="Таблица_ГОСТ"/>
     <w:basedOn w:val="103"/>
     <w:uiPriority w:val="99"/>
@@ -11999,11 +12191,11 @@
       </w:tcPr>
     </w:tblStylePr>
   </w:style>
-  <w:style w:type="paragraph" w:customStyle="1" w:styleId="afffffff3">
+  <w:style w:type="paragraph" w:customStyle="1" w:styleId="afffffff4">
     <w:name w:val="ДОК Таблица Текст Строгий"/>
-    <w:basedOn w:val="affc"/>
-    <w:next w:val="affc"/>
-    <w:link w:val="afffffff4"/>
+    <w:basedOn w:val="affd"/>
+    <w:next w:val="affd"/>
+    <w:link w:val="afffffff5"/>
     <w:qFormat/>
     <w:rsid w:val="00D76C1B"/>
     <w:pPr>
@@ -12017,10 +12209,10 @@
       <w:szCs w:val="20"/>
     </w:rPr>
   </w:style>
-  <w:style w:type="character" w:customStyle="1" w:styleId="afffffff4">
+  <w:style w:type="character" w:customStyle="1" w:styleId="afffffff5">
     <w:name w:val="ДОК Таблица Текст Строгий Знак"/>
-    <w:basedOn w:val="affd"/>
-    <w:link w:val="afffffff3"/>
+    <w:basedOn w:val="affe"/>
+    <w:link w:val="afffffff4"/>
     <w:rsid w:val="00D76C1B"/>
     <w:rPr>
       <w:rFonts w:ascii="Times New Roman" w:eastAsia="Arial Unicode MS" w:hAnsi="Times New Roman" w:cs="Times New Roman"/>
@@ -12066,7 +12258,7 @@
   <w:style w:type="table" w:customStyle="1" w:styleId="150">
     <w:name w:val="Сетка таблицы15"/>
     <w:basedOn w:val="af1"/>
-    <w:next w:val="aff6"/>
+    <w:next w:val="aff7"/>
     <w:uiPriority w:val="59"/>
     <w:rsid w:val="00D76C1B"/>
     <w:pPr>
@@ -12310,6 +12502,60 @@
     <w:rPr>
       <w:rFonts w:ascii="Arial Narrow" w:eastAsia="Times New Roman" w:hAnsi="Arial Narrow" w:cs="Times New Roman"/>
       <w:snapToGrid w:val="0"/>
+      <w:sz w:val="24"/>
+      <w:szCs w:val="20"/>
+      <w:lang w:eastAsia="ru-RU"/>
+    </w:rPr>
+  </w:style>
+  <w:style w:type="character" w:styleId="afffffff6">
+    <w:name w:val="Unresolved Mention"/>
+    <w:basedOn w:val="af0"/>
+    <w:uiPriority w:val="99"/>
+    <w:semiHidden/>
+    <w:unhideWhenUsed/>
+    <w:rsid w:val="00A3549C"/>
+    <w:rPr>
+      <w:color w:val="605E5C"/>
+      <w:shd w:val="clear" w:color="auto" w:fill="E1DFDD"/>
+    </w:rPr>
+  </w:style>
+  <w:style w:type="paragraph" w:customStyle="1" w:styleId="30">
+    <w:name w:val="ДОК Заголовок 3"/>
+    <w:basedOn w:val="20"/>
+    <w:link w:val="3f3"/>
+    <w:qFormat/>
+    <w:rsid w:val="009A18C0"/>
+    <w:pPr>
+      <w:numPr>
+        <w:ilvl w:val="2"/>
+      </w:numPr>
+    </w:pPr>
+  </w:style>
+  <w:style w:type="character" w:customStyle="1" w:styleId="aff4">
+    <w:name w:val="ДОК Титульник Объект Знак"/>
+    <w:basedOn w:val="af0"/>
+    <w:link w:val="aff3"/>
+    <w:rsid w:val="009A18C0"/>
+    <w:rPr>
+      <w:rFonts w:ascii="Arial Narrow" w:eastAsia="Times New Roman" w:hAnsi="Arial Narrow" w:cs="Times New Roman"/>
+      <w:bCs/>
+      <w:sz w:val="40"/>
+      <w:szCs w:val="20"/>
+      <w:lang w:eastAsia="ru-RU"/>
+    </w:rPr>
+  </w:style>
+  <w:style w:type="character" w:customStyle="1" w:styleId="3f3">
+    <w:name w:val="ДОК Заголовок 3 Знак"/>
+    <w:basedOn w:val="aff4"/>
+    <w:link w:val="30"/>
+    <w:rsid w:val="009A18C0"/>
+    <w:rPr>
+      <w:rFonts w:ascii="Arial Narrow" w:eastAsia="Times New Roman" w:hAnsi="Arial Narrow" w:cs="Times New Roman"/>
+      <w:b/>
+      <w:bCs/>
+      <w:noProof/>
+      <w:snapToGrid w:val="0"/>
+      <w:color w:val="365F91" w:themeColor="accent1" w:themeShade="BF"/>
       <w:sz w:val="24"/>
       <w:szCs w:val="20"/>
       <w:lang w:eastAsia="ru-RU"/>

</xml_diff>

<commit_message>
Adding devices.ini + title changes
</commit_message>
<xml_diff>
--- a/origin.docx
+++ b/origin.docx
@@ -55,36 +55,19 @@
     <w:p>
       <w:pPr>
         <w:pStyle w:val="aff"/>
-        <w:rPr>
-          <w:color w:val="auto"/>
-        </w:rPr>
       </w:pPr>
       <w:proofErr w:type="gramStart"/>
       <w:r>
-        <w:rPr>
-          <w:color w:val="auto"/>
-        </w:rPr>
         <w:t xml:space="preserve">{{ </w:t>
       </w:r>
+      <w:proofErr w:type="spellStart"/>
       <w:r>
-        <w:rPr>
-          <w:color w:val="auto"/>
-          <w:lang w:val="en-US"/>
-        </w:rPr>
         <w:t>title</w:t>
       </w:r>
+      <w:proofErr w:type="spellEnd"/>
       <w:proofErr w:type="gramEnd"/>
       <w:r>
-        <w:rPr>
-          <w:color w:val="auto"/>
-        </w:rPr>
         <w:t xml:space="preserve"> }}</w:t>
-      </w:r>
-      <w:r>
-        <w:rPr>
-          <w:color w:val="auto"/>
-        </w:rPr>
-        <w:t xml:space="preserve"> </w:t>
       </w:r>
     </w:p>
     <w:p>
@@ -94,6 +77,9 @@
           <w:color w:val="365F91" w:themeColor="accent1" w:themeShade="BF"/>
         </w:rPr>
       </w:pPr>
+      <w:r>
+        <w:t xml:space="preserve">Устройство типа </w:t>
+      </w:r>
       <w:proofErr w:type="gramStart"/>
       <w:r>
         <w:rPr>
@@ -133,14 +119,8 @@
     <w:p>
       <w:pPr>
         <w:pStyle w:val="aff"/>
-        <w:rPr>
-          <w:color w:val="auto"/>
-        </w:rPr>
       </w:pPr>
       <w:r>
-        <w:rPr>
-          <w:color w:val="auto"/>
-        </w:rPr>
         <w:t>Бланк уставок</w:t>
       </w:r>
     </w:p>
@@ -1227,68 +1207,7 @@
     <w:p>
       <w:pPr>
         <w:pStyle w:val="afff1"/>
-        <w:ind w:right="282"/>
-      </w:pPr>
-    </w:p>
-    <w:p>
-      <w:pPr>
-        <w:pStyle w:val="afff1"/>
-        <w:ind w:right="282"/>
-        <w:rPr>
-          <w:i/>
-          <w:iCs/>
-          <w:color w:val="BFBFBF" w:themeColor="background1" w:themeShade="BF"/>
-          <w:sz w:val="20"/>
-          <w:szCs w:val="20"/>
-        </w:rPr>
-      </w:pPr>
-      <w:r>
-        <w:rPr>
-          <w:i/>
-          <w:iCs/>
-          <w:color w:val="BFBFBF" w:themeColor="background1" w:themeShade="BF"/>
-          <w:sz w:val="20"/>
-          <w:szCs w:val="20"/>
-        </w:rPr>
-        <w:t xml:space="preserve">Версия пакета поддержки: </w:t>
-      </w:r>
-      <w:proofErr w:type="gramStart"/>
-      <w:r>
-        <w:rPr>
-          <w:i/>
-          <w:iCs/>
-          <w:color w:val="BFBFBF" w:themeColor="background1" w:themeShade="BF"/>
-          <w:sz w:val="20"/>
-          <w:szCs w:val="20"/>
-        </w:rPr>
-        <w:t xml:space="preserve">{{ </w:t>
-      </w:r>
-      <w:r>
-        <w:rPr>
-          <w:i/>
-          <w:iCs/>
-          <w:color w:val="BFBFBF" w:themeColor="background1" w:themeShade="BF"/>
-          <w:sz w:val="20"/>
-          <w:szCs w:val="20"/>
-          <w:lang w:val="en-US"/>
-        </w:rPr>
-        <w:t>packet</w:t>
-      </w:r>
-      <w:proofErr w:type="gramEnd"/>
-      <w:r>
-        <w:rPr>
-          <w:i/>
-          <w:iCs/>
-          <w:color w:val="BFBFBF" w:themeColor="background1" w:themeShade="BF"/>
-          <w:sz w:val="20"/>
-          <w:szCs w:val="20"/>
-        </w:rPr>
-        <w:t xml:space="preserve"> }}</w:t>
-      </w:r>
-    </w:p>
-    <w:p>
-      <w:pPr>
-        <w:pStyle w:val="afff1"/>
+        <w:ind w:firstLine="0"/>
         <w:rPr>
           <w:i/>
           <w:iCs/>
@@ -8019,11 +7938,10 @@
     <w:name w:val="ДОК Титульник Вид Документации"/>
     <w:basedOn w:val="af"/>
     <w:qFormat/>
-    <w:rsid w:val="00E1162A"/>
+    <w:rsid w:val="00087531"/>
     <w:rPr>
       <w:b/>
       <w:bCs/>
-      <w:color w:val="1E4973"/>
       <w:sz w:val="36"/>
       <w:szCs w:val="36"/>
     </w:rPr>

</xml_diff>

<commit_message>
Name for save updating
</commit_message>
<xml_diff>
--- a/origin.docx
+++ b/origin.docx
@@ -56,18 +56,8 @@
       <w:pPr>
         <w:pStyle w:val="aff"/>
       </w:pPr>
-      <w:proofErr w:type="gramStart"/>
       <w:r>
-        <w:t xml:space="preserve">{{ </w:t>
-      </w:r>
-      <w:proofErr w:type="spellStart"/>
-      <w:r>
-        <w:t>title</w:t>
-      </w:r>
-      <w:proofErr w:type="spellEnd"/>
-      <w:proofErr w:type="gramEnd"/>
-      <w:r>
-        <w:t xml:space="preserve"> }}</w:t>
+        <w:t>{{ title }}</w:t>
       </w:r>
     </w:p>
     <w:p>
@@ -80,30 +70,19 @@
       <w:r>
         <w:t xml:space="preserve">Устройство типа </w:t>
       </w:r>
-      <w:proofErr w:type="gramStart"/>
       <w:r>
         <w:rPr>
           <w:color w:val="365F91" w:themeColor="accent1" w:themeShade="BF"/>
         </w:rPr>
         <w:t xml:space="preserve">{{ </w:t>
       </w:r>
-      <w:proofErr w:type="spellStart"/>
       <w:r>
         <w:rPr>
           <w:bCs w:val="0"/>
           <w:color w:val="365F91" w:themeColor="accent1" w:themeShade="BF"/>
         </w:rPr>
-        <w:t>device</w:t>
+        <w:t>device_name</w:t>
       </w:r>
-      <w:proofErr w:type="gramEnd"/>
-      <w:r>
-        <w:rPr>
-          <w:bCs w:val="0"/>
-          <w:color w:val="365F91" w:themeColor="accent1" w:themeShade="BF"/>
-        </w:rPr>
-        <w:t>_name</w:t>
-      </w:r>
-      <w:proofErr w:type="spellEnd"/>
       <w:r>
         <w:rPr>
           <w:color w:val="365F91" w:themeColor="accent1" w:themeShade="BF"/>
@@ -175,7 +154,6 @@
                 <w:lang w:val="en-US"/>
               </w:rPr>
             </w:pPr>
-            <w:proofErr w:type="gramStart"/>
             <w:r>
               <w:rPr>
                 <w:rFonts w:cs="Arial"/>
@@ -203,7 +181,6 @@
               </w:rPr>
               <w:t xml:space="preserve"> </w:t>
             </w:r>
-            <w:proofErr w:type="spellStart"/>
             <w:r>
               <w:rPr>
                 <w:rFonts w:cs="Arial"/>
@@ -211,27 +188,7 @@
                 <w:szCs w:val="22"/>
                 <w:lang w:val="en-US"/>
               </w:rPr>
-              <w:t>device</w:t>
-            </w:r>
-            <w:proofErr w:type="gramEnd"/>
-            <w:r>
-              <w:rPr>
-                <w:rFonts w:cs="Arial"/>
-                <w:sz w:val="22"/>
-                <w:szCs w:val="22"/>
-                <w:lang w:val="en-US"/>
-              </w:rPr>
-              <w:t>_order_code</w:t>
-            </w:r>
-            <w:proofErr w:type="spellEnd"/>
-            <w:r>
-              <w:rPr>
-                <w:rFonts w:cs="Arial"/>
-                <w:sz w:val="22"/>
-                <w:szCs w:val="22"/>
-                <w:lang w:val="en-US"/>
-              </w:rPr>
-              <w:t xml:space="preserve"> }}</w:t>
+              <w:t>device_order_code }}</w:t>
             </w:r>
           </w:p>
         </w:tc>
@@ -286,7 +243,6 @@
                 <w:lang w:val="en-US"/>
               </w:rPr>
             </w:pPr>
-            <w:proofErr w:type="gramStart"/>
             <w:r>
               <w:rPr>
                 <w:rFonts w:cs="Arial"/>
@@ -303,37 +259,7 @@
                 <w:szCs w:val="22"/>
                 <w:lang w:val="en-US"/>
               </w:rPr>
-              <w:t xml:space="preserve">{ </w:t>
-            </w:r>
-            <w:proofErr w:type="spellStart"/>
-            <w:r>
-              <w:rPr>
-                <w:rFonts w:cs="Arial"/>
-                <w:sz w:val="22"/>
-                <w:szCs w:val="22"/>
-                <w:lang w:val="en-US"/>
-              </w:rPr>
-              <w:t>hmi</w:t>
-            </w:r>
-            <w:proofErr w:type="gramEnd"/>
-            <w:r>
-              <w:rPr>
-                <w:rFonts w:cs="Arial"/>
-                <w:sz w:val="22"/>
-                <w:szCs w:val="22"/>
-                <w:lang w:val="en-US"/>
-              </w:rPr>
-              <w:t>_order_code</w:t>
-            </w:r>
-            <w:proofErr w:type="spellEnd"/>
-            <w:r>
-              <w:rPr>
-                <w:rFonts w:cs="Arial"/>
-                <w:sz w:val="22"/>
-                <w:szCs w:val="22"/>
-                <w:lang w:val="en-US"/>
-              </w:rPr>
-              <w:t xml:space="preserve"> }}</w:t>
+              <w:t>{ hmi_order_code }}</w:t>
             </w:r>
           </w:p>
         </w:tc>
@@ -346,7 +272,6 @@
           <w:color w:val="365F91" w:themeColor="accent1" w:themeShade="BF"/>
         </w:rPr>
       </w:pPr>
-      <w:proofErr w:type="gramStart"/>
       <w:r>
         <w:rPr>
           <w:color w:val="365F91" w:themeColor="accent1" w:themeShade="BF"/>
@@ -375,7 +300,6 @@
         </w:rPr>
         <w:t>code</w:t>
       </w:r>
-      <w:proofErr w:type="gramEnd"/>
       <w:r>
         <w:rPr>
           <w:color w:val="365F91" w:themeColor="accent1" w:themeShade="BF"/>
@@ -770,21 +694,12 @@
               <w:ind w:right="282" w:firstLine="0"/>
               <w:jc w:val="left"/>
             </w:pPr>
-            <w:proofErr w:type="gramStart"/>
             <w:r>
               <w:rPr>
                 <w:color w:val="A6A6A6" w:themeColor="background1" w:themeShade="A6"/>
                 <w:lang w:val="en-US"/>
               </w:rPr>
-              <w:t>{{ version</w:t>
-            </w:r>
-            <w:proofErr w:type="gramEnd"/>
-            <w:r>
-              <w:rPr>
-                <w:color w:val="A6A6A6" w:themeColor="background1" w:themeShade="A6"/>
-                <w:lang w:val="en-US"/>
-              </w:rPr>
-              <w:t xml:space="preserve"> }}</w:t>
+              <w:t>{{ version }}</w:t>
             </w:r>
           </w:p>
         </w:tc>
@@ -829,21 +744,12 @@
                 <w:lang w:val="en-US"/>
               </w:rPr>
             </w:pPr>
-            <w:proofErr w:type="gramStart"/>
             <w:r>
               <w:rPr>
                 <w:color w:val="A6A6A6" w:themeColor="background1" w:themeShade="A6"/>
                 <w:lang w:val="en-US"/>
               </w:rPr>
-              <w:t>{{ date</w:t>
-            </w:r>
-            <w:proofErr w:type="gramEnd"/>
-            <w:r>
-              <w:rPr>
-                <w:color w:val="A6A6A6" w:themeColor="background1" w:themeShade="A6"/>
-                <w:lang w:val="en-US"/>
-              </w:rPr>
-              <w:t xml:space="preserve"> }}</w:t>
+              <w:t>{{ date }}</w:t>
             </w:r>
           </w:p>
         </w:tc>
@@ -852,6 +758,7 @@
     <w:p>
       <w:pPr>
         <w:pStyle w:val="afff1"/>
+        <w:ind w:firstLine="0"/>
       </w:pPr>
       <w:r>
         <w:t xml:space="preserve">© </w:t>
@@ -886,23 +793,20 @@
         </w:rPr>
         <w:t xml:space="preserve"> </w:t>
       </w:r>
-      <w:proofErr w:type="spellStart"/>
       <w:r>
-        <w:t>Юнител</w:t>
-      </w:r>
-      <w:proofErr w:type="spellEnd"/>
-      <w:r>
-        <w:t xml:space="preserve"> Инжиниринг</w:t>
+        <w:t>Юнител Инжиниринг</w:t>
       </w:r>
     </w:p>
     <w:p>
       <w:pPr>
         <w:pStyle w:val="afff1"/>
+        <w:ind w:firstLine="0"/>
       </w:pPr>
     </w:p>
     <w:p>
       <w:pPr>
         <w:pStyle w:val="afff1"/>
+        <w:ind w:firstLine="0"/>
       </w:pPr>
       <w:r>
         <w:t>Москва</w:t>
@@ -911,17 +815,19 @@
     <w:p>
       <w:pPr>
         <w:pStyle w:val="afff1"/>
+        <w:ind w:firstLine="0"/>
       </w:pPr>
     </w:p>
     <w:p>
       <w:pPr>
         <w:pStyle w:val="afff1"/>
+        <w:ind w:firstLine="0"/>
       </w:pPr>
     </w:p>
     <w:p>
       <w:pPr>
         <w:pStyle w:val="afff1"/>
-        <w:ind w:right="282"/>
+        <w:ind w:right="282" w:firstLine="0"/>
         <w:rPr>
           <w:lang w:val="en-US"/>
         </w:rPr>
@@ -930,7 +836,7 @@
     <w:p>
       <w:pPr>
         <w:pStyle w:val="afff1"/>
-        <w:ind w:right="282"/>
+        <w:ind w:right="282" w:firstLine="0"/>
         <w:rPr>
           <w:lang w:val="en-US"/>
         </w:rPr>
@@ -939,7 +845,7 @@
     <w:p>
       <w:pPr>
         <w:pStyle w:val="afff1"/>
-        <w:ind w:right="282"/>
+        <w:ind w:right="282" w:firstLine="0"/>
         <w:rPr>
           <w:lang w:val="en-US"/>
         </w:rPr>
@@ -948,7 +854,7 @@
     <w:p>
       <w:pPr>
         <w:pStyle w:val="afff1"/>
-        <w:ind w:right="282"/>
+        <w:ind w:right="282" w:firstLine="0"/>
         <w:rPr>
           <w:lang w:val="en-US"/>
         </w:rPr>
@@ -957,7 +863,7 @@
     <w:p>
       <w:pPr>
         <w:pStyle w:val="afff1"/>
-        <w:ind w:right="282"/>
+        <w:ind w:right="282" w:firstLine="0"/>
         <w:rPr>
           <w:lang w:val="en-US"/>
         </w:rPr>
@@ -966,19 +872,19 @@
     <w:p>
       <w:pPr>
         <w:pStyle w:val="afff1"/>
-        <w:ind w:right="282"/>
+        <w:ind w:right="282" w:firstLine="0"/>
       </w:pPr>
     </w:p>
     <w:p>
       <w:pPr>
         <w:pStyle w:val="afff1"/>
-        <w:ind w:right="282"/>
+        <w:ind w:right="282" w:firstLine="0"/>
       </w:pPr>
     </w:p>
     <w:p>
       <w:pPr>
         <w:pStyle w:val="afff1"/>
-        <w:ind w:left="567" w:right="282" w:firstLine="0"/>
+        <w:ind w:right="282" w:firstLine="0"/>
       </w:pPr>
       <w:r>
         <w:t xml:space="preserve">Настоящий бланк уставок </w:t>
@@ -992,7 +898,6 @@
       <w:r>
         <w:t xml:space="preserve"> </w:t>
       </w:r>
-      <w:proofErr w:type="gramStart"/>
       <w:r>
         <w:t>{</w:t>
       </w:r>
@@ -1008,7 +913,6 @@
         </w:rPr>
         <w:t>device</w:t>
       </w:r>
-      <w:proofErr w:type="gramEnd"/>
       <w:r>
         <w:t>_</w:t>
       </w:r>
@@ -1028,36 +932,28 @@
     <w:p>
       <w:pPr>
         <w:pStyle w:val="afff1"/>
-        <w:ind w:right="282"/>
+        <w:ind w:right="282" w:firstLine="0"/>
       </w:pPr>
     </w:p>
     <w:p>
       <w:pPr>
         <w:pStyle w:val="afff1"/>
-        <w:ind w:left="567" w:right="282" w:firstLine="0"/>
+        <w:ind w:right="282" w:firstLine="0"/>
       </w:pPr>
       <w:r>
-        <w:t xml:space="preserve">Компания </w:t>
-      </w:r>
-      <w:proofErr w:type="spellStart"/>
-      <w:r>
-        <w:t>Юнител</w:t>
-      </w:r>
-      <w:proofErr w:type="spellEnd"/>
-      <w:r>
-        <w:t xml:space="preserve"> Инжиниринг оставляет за собой авторские права на данный документ и на информацию, содержащуюся в нем, включая права на использование патентов. Копирование, использование и передача информации третьим лицам без письменного разрешения компании категорически запрещены.</w:t>
+        <w:t>Компания Юнител Инжиниринг оставляет за собой авторские права на данный документ и на информацию, содержащуюся в нем, включая права на использование патентов. Копирование, использование и передача информации третьим лицам без письменного разрешения компании категорически запрещены.</w:t>
       </w:r>
     </w:p>
     <w:p>
       <w:pPr>
         <w:pStyle w:val="afff1"/>
-        <w:ind w:right="282"/>
+        <w:ind w:right="282" w:firstLine="0"/>
       </w:pPr>
     </w:p>
     <w:p>
       <w:pPr>
         <w:pStyle w:val="afff1"/>
-        <w:ind w:left="567" w:right="282" w:firstLine="0"/>
+        <w:ind w:right="282" w:firstLine="0"/>
       </w:pPr>
       <w:r>
         <w:t>Данный документ тщательно подготовлен и проверен. Если, несмотря на это читатель найдет какие-либо ошибки, просьба информировать нас.</w:t>
@@ -1066,13 +962,13 @@
     <w:p>
       <w:pPr>
         <w:pStyle w:val="afff1"/>
-        <w:ind w:right="282"/>
+        <w:ind w:right="282" w:firstLine="0"/>
       </w:pPr>
     </w:p>
     <w:p>
       <w:pPr>
         <w:pStyle w:val="afff1"/>
-        <w:ind w:left="567" w:right="282" w:firstLine="0"/>
+        <w:ind w:right="282" w:firstLine="0"/>
       </w:pPr>
       <w:r>
         <w:t>Содержащаяся здесь информация относится только к текущей версии аппаратуры. Исходя из интересов наших пользователей, мы стараемся улучшать нашу аппаратуру и идти в ногу с новейшими технологиями. Это может привести к различию между аппаратурой и ее техническим описанием или инструкциями по эксплуатации.</w:t>
@@ -1657,7 +1553,6 @@
       </w:rPr>
       <w:t>://</w:t>
     </w:r>
-    <w:proofErr w:type="spellStart"/>
     <w:r>
       <w:rPr>
         <w:rStyle w:val="afff2"/>
@@ -1667,7 +1562,6 @@
       </w:rPr>
       <w:t>uni</w:t>
     </w:r>
-    <w:proofErr w:type="spellEnd"/>
     <w:r>
       <w:rPr>
         <w:rStyle w:val="afff2"/>
@@ -1676,7 +1570,6 @@
       </w:rPr>
       <w:t>-</w:t>
     </w:r>
-    <w:proofErr w:type="spellStart"/>
     <w:r>
       <w:rPr>
         <w:rStyle w:val="afff2"/>
@@ -1686,7 +1579,6 @@
       </w:rPr>
       <w:t>eng</w:t>
     </w:r>
-    <w:proofErr w:type="spellEnd"/>
     <w:r>
       <w:rPr>
         <w:rStyle w:val="afff2"/>
@@ -1695,7 +1587,6 @@
       </w:rPr>
       <w:t>.</w:t>
     </w:r>
-    <w:proofErr w:type="spellStart"/>
     <w:r>
       <w:rPr>
         <w:rStyle w:val="afff2"/>
@@ -1705,7 +1596,6 @@
       </w:rPr>
       <w:t>ru</w:t>
     </w:r>
-    <w:proofErr w:type="spellEnd"/>
     <w:r>
       <w:rPr>
         <w:b/>
@@ -1722,21 +1612,7 @@
       <w:rPr>
         <w:sz w:val="20"/>
       </w:rPr>
-      <w:t>ООО «</w:t>
-    </w:r>
-    <w:proofErr w:type="spellStart"/>
-    <w:r>
-      <w:rPr>
-        <w:sz w:val="20"/>
-      </w:rPr>
-      <w:t>Юнител</w:t>
-    </w:r>
-    <w:proofErr w:type="spellEnd"/>
-    <w:r>
-      <w:rPr>
-        <w:sz w:val="20"/>
-      </w:rPr>
-      <w:t xml:space="preserve"> Инжиниринг»</w:t>
+      <w:t>ООО «Юнител Инжиниринг»</w:t>
     </w:r>
   </w:p>
 </w:ftr>
@@ -1930,7 +1806,6 @@
         <w:szCs w:val="16"/>
       </w:rPr>
     </w:pPr>
-    <w:proofErr w:type="gramStart"/>
     <w:r>
       <w:rPr>
         <w:rStyle w:val="afff2"/>
@@ -1938,28 +1813,7 @@
         <w:sz w:val="20"/>
         <w:szCs w:val="16"/>
       </w:rPr>
-      <w:t xml:space="preserve">{{ </w:t>
-    </w:r>
-    <w:proofErr w:type="spellStart"/>
-    <w:r>
-      <w:rPr>
-        <w:rStyle w:val="afff2"/>
-        <w:bCs w:val="0"/>
-        <w:sz w:val="20"/>
-        <w:szCs w:val="16"/>
-      </w:rPr>
-      <w:t>code</w:t>
-    </w:r>
-    <w:proofErr w:type="spellEnd"/>
-    <w:proofErr w:type="gramEnd"/>
-    <w:r>
-      <w:rPr>
-        <w:rStyle w:val="afff2"/>
-        <w:bCs w:val="0"/>
-        <w:sz w:val="20"/>
-        <w:szCs w:val="16"/>
-      </w:rPr>
-      <w:t xml:space="preserve"> }}</w:t>
+      <w:t>{{ code }}</w:t>
     </w:r>
     <w:r>
       <w:rPr>
@@ -1978,29 +1832,7 @@
         <w:sz w:val="20"/>
         <w:szCs w:val="16"/>
       </w:rPr>
-      <w:t xml:space="preserve">{{ </w:t>
-    </w:r>
-    <w:proofErr w:type="spellStart"/>
-    <w:r>
-      <w:rPr>
-        <w:rStyle w:val="afff2"/>
-        <w:bCs w:val="0"/>
-        <w:color w:val="A6A6A6" w:themeColor="background1" w:themeShade="A6"/>
-        <w:sz w:val="20"/>
-        <w:szCs w:val="16"/>
-      </w:rPr>
-      <w:t>colontile</w:t>
-    </w:r>
-    <w:proofErr w:type="spellEnd"/>
-    <w:r>
-      <w:rPr>
-        <w:rStyle w:val="afff2"/>
-        <w:bCs w:val="0"/>
-        <w:color w:val="A6A6A6" w:themeColor="background1" w:themeShade="A6"/>
-        <w:sz w:val="20"/>
-        <w:szCs w:val="16"/>
-      </w:rPr>
-      <w:t>}}</w:t>
+      <w:t>{{ colontile}}</w:t>
     </w:r>
     <w:r>
       <w:rPr>
@@ -2018,27 +1850,7 @@
         <w:sz w:val="20"/>
         <w:szCs w:val="16"/>
       </w:rPr>
-      <w:t xml:space="preserve">{{ </w:t>
-    </w:r>
-    <w:proofErr w:type="spellStart"/>
-    <w:r>
-      <w:rPr>
-        <w:rStyle w:val="afff2"/>
-        <w:bCs w:val="0"/>
-        <w:sz w:val="20"/>
-        <w:szCs w:val="16"/>
-      </w:rPr>
-      <w:t>device_name</w:t>
-    </w:r>
-    <w:proofErr w:type="spellEnd"/>
-    <w:r>
-      <w:rPr>
-        <w:rStyle w:val="afff2"/>
-        <w:bCs w:val="0"/>
-        <w:sz w:val="20"/>
-        <w:szCs w:val="16"/>
-      </w:rPr>
-      <w:t xml:space="preserve"> }}</w:t>
+      <w:t>{{ device_name }}</w:t>
     </w:r>
   </w:p>
 </w:hdr>
@@ -2147,7 +1959,6 @@
         <w:szCs w:val="16"/>
       </w:rPr>
     </w:pPr>
-    <w:proofErr w:type="gramStart"/>
     <w:r>
       <w:rPr>
         <w:rStyle w:val="afff2"/>
@@ -2155,28 +1966,7 @@
         <w:sz w:val="20"/>
         <w:szCs w:val="16"/>
       </w:rPr>
-      <w:t xml:space="preserve">{{ </w:t>
-    </w:r>
-    <w:proofErr w:type="spellStart"/>
-    <w:r>
-      <w:rPr>
-        <w:rStyle w:val="afff2"/>
-        <w:bCs w:val="0"/>
-        <w:sz w:val="20"/>
-        <w:szCs w:val="16"/>
-      </w:rPr>
-      <w:t>code</w:t>
-    </w:r>
-    <w:proofErr w:type="spellEnd"/>
-    <w:proofErr w:type="gramEnd"/>
-    <w:r>
-      <w:rPr>
-        <w:rStyle w:val="afff2"/>
-        <w:bCs w:val="0"/>
-        <w:sz w:val="20"/>
-        <w:szCs w:val="16"/>
-      </w:rPr>
-      <w:t xml:space="preserve"> }}</w:t>
+      <w:t>{{ code }}</w:t>
     </w:r>
     <w:r>
       <w:rPr>
@@ -2195,29 +1985,7 @@
         <w:sz w:val="20"/>
         <w:szCs w:val="16"/>
       </w:rPr>
-      <w:t xml:space="preserve">{{ </w:t>
-    </w:r>
-    <w:proofErr w:type="spellStart"/>
-    <w:r>
-      <w:rPr>
-        <w:rStyle w:val="afff2"/>
-        <w:bCs w:val="0"/>
-        <w:color w:val="A6A6A6" w:themeColor="background1" w:themeShade="A6"/>
-        <w:sz w:val="20"/>
-        <w:szCs w:val="16"/>
-      </w:rPr>
-      <w:t>colontile</w:t>
-    </w:r>
-    <w:proofErr w:type="spellEnd"/>
-    <w:r>
-      <w:rPr>
-        <w:rStyle w:val="afff2"/>
-        <w:bCs w:val="0"/>
-        <w:color w:val="A6A6A6" w:themeColor="background1" w:themeShade="A6"/>
-        <w:sz w:val="20"/>
-        <w:szCs w:val="16"/>
-      </w:rPr>
-      <w:t>}}</w:t>
+      <w:t>{{ colontile}}</w:t>
     </w:r>
     <w:r>
       <w:rPr>
@@ -2235,27 +2003,7 @@
         <w:sz w:val="20"/>
         <w:szCs w:val="16"/>
       </w:rPr>
-      <w:t xml:space="preserve">{{ </w:t>
-    </w:r>
-    <w:proofErr w:type="spellStart"/>
-    <w:r>
-      <w:rPr>
-        <w:rStyle w:val="afff2"/>
-        <w:bCs w:val="0"/>
-        <w:sz w:val="20"/>
-        <w:szCs w:val="16"/>
-      </w:rPr>
-      <w:t>device_name</w:t>
-    </w:r>
-    <w:proofErr w:type="spellEnd"/>
-    <w:r>
-      <w:rPr>
-        <w:rStyle w:val="afff2"/>
-        <w:bCs w:val="0"/>
-        <w:sz w:val="20"/>
-        <w:szCs w:val="16"/>
-      </w:rPr>
-      <w:t xml:space="preserve"> }}</w:t>
+      <w:t>{{ device_name }}</w:t>
     </w:r>
   </w:p>
 </w:hdr>
@@ -2278,7 +2026,6 @@
         <w:szCs w:val="16"/>
       </w:rPr>
     </w:pPr>
-    <w:proofErr w:type="gramStart"/>
     <w:r>
       <w:rPr>
         <w:rStyle w:val="afff2"/>
@@ -2286,28 +2033,7 @@
         <w:sz w:val="20"/>
         <w:szCs w:val="16"/>
       </w:rPr>
-      <w:t xml:space="preserve">{{ </w:t>
-    </w:r>
-    <w:proofErr w:type="spellStart"/>
-    <w:r>
-      <w:rPr>
-        <w:rStyle w:val="afff2"/>
-        <w:bCs w:val="0"/>
-        <w:sz w:val="20"/>
-        <w:szCs w:val="16"/>
-      </w:rPr>
-      <w:t>code</w:t>
-    </w:r>
-    <w:proofErr w:type="spellEnd"/>
-    <w:proofErr w:type="gramEnd"/>
-    <w:r>
-      <w:rPr>
-        <w:rStyle w:val="afff2"/>
-        <w:bCs w:val="0"/>
-        <w:sz w:val="20"/>
-        <w:szCs w:val="16"/>
-      </w:rPr>
-      <w:t xml:space="preserve"> }}</w:t>
+      <w:t>{{ code }}</w:t>
     </w:r>
     <w:r>
       <w:rPr>
@@ -2326,29 +2052,7 @@
         <w:sz w:val="20"/>
         <w:szCs w:val="16"/>
       </w:rPr>
-      <w:t xml:space="preserve">{{ </w:t>
-    </w:r>
-    <w:proofErr w:type="spellStart"/>
-    <w:r>
-      <w:rPr>
-        <w:rStyle w:val="afff2"/>
-        <w:bCs w:val="0"/>
-        <w:color w:val="A6A6A6" w:themeColor="background1" w:themeShade="A6"/>
-        <w:sz w:val="20"/>
-        <w:szCs w:val="16"/>
-      </w:rPr>
-      <w:t>colontile</w:t>
-    </w:r>
-    <w:proofErr w:type="spellEnd"/>
-    <w:r>
-      <w:rPr>
-        <w:rStyle w:val="afff2"/>
-        <w:bCs w:val="0"/>
-        <w:color w:val="A6A6A6" w:themeColor="background1" w:themeShade="A6"/>
-        <w:sz w:val="20"/>
-        <w:szCs w:val="16"/>
-      </w:rPr>
-      <w:t>}}</w:t>
+      <w:t>{{ colontile}}</w:t>
     </w:r>
     <w:r>
       <w:rPr>
@@ -2366,27 +2070,7 @@
         <w:sz w:val="20"/>
         <w:szCs w:val="16"/>
       </w:rPr>
-      <w:t xml:space="preserve">{{ </w:t>
-    </w:r>
-    <w:proofErr w:type="spellStart"/>
-    <w:r>
-      <w:rPr>
-        <w:rStyle w:val="afff2"/>
-        <w:bCs w:val="0"/>
-        <w:sz w:val="20"/>
-        <w:szCs w:val="16"/>
-      </w:rPr>
-      <w:t>device_name</w:t>
-    </w:r>
-    <w:proofErr w:type="spellEnd"/>
-    <w:r>
-      <w:rPr>
-        <w:rStyle w:val="afff2"/>
-        <w:bCs w:val="0"/>
-        <w:sz w:val="20"/>
-        <w:szCs w:val="16"/>
-      </w:rPr>
-      <w:t xml:space="preserve"> }}</w:t>
+      <w:t>{{ device_name }}</w:t>
     </w:r>
   </w:p>
 </w:hdr>

</xml_diff>